<commit_message>
updated unit 2 notes
</commit_message>
<xml_diff>
--- a/sem_5/lectures/unit_1/unit 1 notes.docx
+++ b/sem_5/lectures/unit_1/unit 1 notes.docx
@@ -11766,6 +11766,10 @@
     <w:p/>
     <w:p>
       <w:r>
+        <w:rPr>
+          <w:noProof/>
+          <w:lang w:eastAsia="en-IN"/>
+        </w:rPr>
         <w:drawing>
           <wp:inline distT="0" distB="0" distL="0" distR="0" wp14:anchorId="51A457CF" wp14:editId="6B3B7A04">
             <wp:extent cx="5731510" cy="539750"/>
@@ -12657,6 +12661,10 @@
     <w:p/>
     <w:p>
       <w:r>
+        <w:rPr>
+          <w:noProof/>
+          <w:lang w:eastAsia="en-IN"/>
+        </w:rPr>
         <w:drawing>
           <wp:inline distT="0" distB="0" distL="0" distR="0" wp14:anchorId="5439A2C3" wp14:editId="4FB0A011">
             <wp:extent cx="5731510" cy="498475"/>
@@ -13529,6 +13537,10 @@
     <w:p/>
     <w:p>
       <w:r>
+        <w:rPr>
+          <w:noProof/>
+          <w:lang w:eastAsia="en-IN"/>
+        </w:rPr>
         <w:drawing>
           <wp:inline distT="0" distB="0" distL="0" distR="0" wp14:anchorId="068E3859" wp14:editId="5CA9A0BC">
             <wp:extent cx="5731510" cy="450215"/>
@@ -17599,12 +17611,6 @@
         <w:gridCol w:w="1861"/>
       </w:tblGrid>
       <w:tr>
-        <w:tblPrEx>
-          <w:tblCellMar>
-            <w:top w:w="0" w:type="dxa"/>
-            <w:bottom w:w="0" w:type="dxa"/>
-          </w:tblCellMar>
-        </w:tblPrEx>
         <w:trPr>
           <w:trHeight w:val="1094"/>
         </w:trPr>
@@ -17884,10 +17890,4257 @@
       </w:pPr>
     </w:p>
     <w:p/>
+    <w:p>
+      <w:pPr>
+        <w:spacing w:before="100" w:beforeAutospacing="1" w:after="100" w:afterAutospacing="1" w:line="240" w:lineRule="auto"/>
+        <w:outlineLvl w:val="0"/>
+        <w:rPr>
+          <w:rFonts w:ascii="Times New Roman" w:eastAsia="Times New Roman" w:hAnsi="Times New Roman" w:cs="Times New Roman"/>
+          <w:b/>
+          <w:bCs/>
+          <w:kern w:val="36"/>
+          <w:sz w:val="48"/>
+          <w:szCs w:val="48"/>
+          <w:lang w:eastAsia="en-IN"/>
+        </w:rPr>
+      </w:pPr>
+      <w:r>
+        <w:rPr>
+          <w:rFonts w:ascii="Times New Roman" w:eastAsia="Times New Roman" w:hAnsi="Times New Roman" w:cs="Times New Roman"/>
+          <w:b/>
+          <w:bCs/>
+          <w:kern w:val="36"/>
+          <w:sz w:val="48"/>
+          <w:szCs w:val="48"/>
+          <w:lang w:eastAsia="en-IN"/>
+        </w:rPr>
+        <w:t>Now suppose</w:t>
+      </w:r>
+    </w:p>
+    <w:p>
+      <w:pPr>
+        <w:spacing w:before="100" w:beforeAutospacing="1" w:after="100" w:afterAutospacing="1" w:line="240" w:lineRule="auto"/>
+        <w:rPr>
+          <w:rFonts w:ascii="Times New Roman" w:eastAsia="Times New Roman" w:hAnsi="Times New Roman" w:cs="Times New Roman"/>
+          <w:sz w:val="24"/>
+          <w:szCs w:val="24"/>
+          <w:lang w:eastAsia="en-IN"/>
+        </w:rPr>
+      </w:pPr>
+      <w:r>
+        <w:rPr>
+          <w:rFonts w:ascii="Times New Roman" w:eastAsia="Times New Roman" w:hAnsi="Times New Roman" w:cs="Times New Roman"/>
+          <w:sz w:val="24"/>
+          <w:szCs w:val="24"/>
+          <w:lang w:eastAsia="en-IN"/>
+        </w:rPr>
+        <w:t xml:space="preserve">You have </w:t>
+      </w:r>
+      <w:r>
+        <w:rPr>
+          <w:rFonts w:ascii="Times New Roman" w:eastAsia="Times New Roman" w:hAnsi="Times New Roman" w:cs="Times New Roman"/>
+          <w:b/>
+          <w:bCs/>
+          <w:sz w:val="24"/>
+          <w:szCs w:val="24"/>
+          <w:lang w:eastAsia="en-IN"/>
+        </w:rPr>
+        <w:t>three boxes</w:t>
+      </w:r>
+      <w:r>
+        <w:rPr>
+          <w:rFonts w:ascii="Times New Roman" w:eastAsia="Times New Roman" w:hAnsi="Times New Roman" w:cs="Times New Roman"/>
+          <w:sz w:val="24"/>
+          <w:szCs w:val="24"/>
+          <w:lang w:eastAsia="en-IN"/>
+        </w:rPr>
+        <w:t>.</w:t>
+      </w:r>
+    </w:p>
+    <w:p>
+      <w:pPr>
+        <w:spacing w:before="100" w:beforeAutospacing="1" w:after="100" w:afterAutospacing="1" w:line="240" w:lineRule="auto"/>
+        <w:rPr>
+          <w:rFonts w:ascii="Times New Roman" w:eastAsia="Times New Roman" w:hAnsi="Times New Roman" w:cs="Times New Roman"/>
+          <w:sz w:val="24"/>
+          <w:szCs w:val="24"/>
+          <w:lang w:eastAsia="en-IN"/>
+        </w:rPr>
+      </w:pPr>
+      <w:r>
+        <w:rPr>
+          <w:rFonts w:ascii="Times New Roman" w:eastAsia="Times New Roman" w:hAnsi="Times New Roman" w:cs="Times New Roman"/>
+          <w:sz w:val="24"/>
+          <w:szCs w:val="24"/>
+          <w:lang w:eastAsia="en-IN"/>
+        </w:rPr>
+        <w:t>All three have</w:t>
+      </w:r>
+    </w:p>
+    <w:p>
+      <w:pPr>
+        <w:numPr>
+          <w:ilvl w:val="0"/>
+          <w:numId w:val="15"/>
+        </w:numPr>
+        <w:spacing w:before="100" w:beforeAutospacing="1" w:after="100" w:afterAutospacing="1" w:line="240" w:lineRule="auto"/>
+        <w:rPr>
+          <w:rFonts w:ascii="Times New Roman" w:eastAsia="Times New Roman" w:hAnsi="Times New Roman" w:cs="Times New Roman"/>
+          <w:sz w:val="24"/>
+          <w:szCs w:val="24"/>
+          <w:lang w:eastAsia="en-IN"/>
+        </w:rPr>
+      </w:pPr>
+      <w:r>
+        <w:rPr>
+          <w:rFonts w:ascii="Times New Roman" w:eastAsia="Times New Roman" w:hAnsi="Times New Roman" w:cs="Times New Roman"/>
+          <w:sz w:val="24"/>
+          <w:szCs w:val="24"/>
+          <w:lang w:eastAsia="en-IN"/>
+        </w:rPr>
+        <w:t xml:space="preserve">width = 50px </w:t>
+      </w:r>
+    </w:p>
+    <w:p>
+      <w:pPr>
+        <w:numPr>
+          <w:ilvl w:val="0"/>
+          <w:numId w:val="15"/>
+        </w:numPr>
+        <w:spacing w:before="100" w:beforeAutospacing="1" w:after="100" w:afterAutospacing="1" w:line="240" w:lineRule="auto"/>
+        <w:rPr>
+          <w:rFonts w:ascii="Times New Roman" w:eastAsia="Times New Roman" w:hAnsi="Times New Roman" w:cs="Times New Roman"/>
+          <w:sz w:val="24"/>
+          <w:szCs w:val="24"/>
+          <w:lang w:eastAsia="en-IN"/>
+        </w:rPr>
+      </w:pPr>
+      <w:r>
+        <w:rPr>
+          <w:rFonts w:ascii="Times New Roman" w:eastAsia="Times New Roman" w:hAnsi="Times New Roman" w:cs="Times New Roman"/>
+          <w:sz w:val="24"/>
+          <w:szCs w:val="24"/>
+          <w:lang w:eastAsia="en-IN"/>
+        </w:rPr>
+        <w:t xml:space="preserve">padding = 6px 7px </w:t>
+      </w:r>
+    </w:p>
+    <w:p>
+      <w:pPr>
+        <w:numPr>
+          <w:ilvl w:val="0"/>
+          <w:numId w:val="15"/>
+        </w:numPr>
+        <w:spacing w:before="100" w:beforeAutospacing="1" w:after="100" w:afterAutospacing="1" w:line="240" w:lineRule="auto"/>
+        <w:rPr>
+          <w:rFonts w:ascii="Times New Roman" w:eastAsia="Times New Roman" w:hAnsi="Times New Roman" w:cs="Times New Roman"/>
+          <w:sz w:val="24"/>
+          <w:szCs w:val="24"/>
+          <w:lang w:eastAsia="en-IN"/>
+        </w:rPr>
+      </w:pPr>
+      <w:r>
+        <w:rPr>
+          <w:rFonts w:ascii="Times New Roman" w:eastAsia="Times New Roman" w:hAnsi="Times New Roman" w:cs="Times New Roman"/>
+          <w:sz w:val="24"/>
+          <w:szCs w:val="24"/>
+          <w:lang w:eastAsia="en-IN"/>
+        </w:rPr>
+        <w:t xml:space="preserve">margin = 16px 15px 17px </w:t>
+      </w:r>
+    </w:p>
+    <w:p>
+      <w:pPr>
+        <w:numPr>
+          <w:ilvl w:val="0"/>
+          <w:numId w:val="15"/>
+        </w:numPr>
+        <w:spacing w:before="100" w:beforeAutospacing="1" w:after="100" w:afterAutospacing="1" w:line="240" w:lineRule="auto"/>
+        <w:rPr>
+          <w:rFonts w:ascii="Times New Roman" w:eastAsia="Times New Roman" w:hAnsi="Times New Roman" w:cs="Times New Roman"/>
+          <w:sz w:val="24"/>
+          <w:szCs w:val="24"/>
+          <w:lang w:eastAsia="en-IN"/>
+        </w:rPr>
+      </w:pPr>
+      <w:r>
+        <w:rPr>
+          <w:rFonts w:ascii="Times New Roman" w:eastAsia="Times New Roman" w:hAnsi="Times New Roman" w:cs="Times New Roman"/>
+          <w:sz w:val="24"/>
+          <w:szCs w:val="24"/>
+          <w:lang w:eastAsia="en-IN"/>
+        </w:rPr>
+        <w:t xml:space="preserve">box-sizing = content-box </w:t>
+      </w:r>
+    </w:p>
+    <w:p>
+      <w:pPr>
+        <w:spacing w:before="100" w:beforeAutospacing="1" w:after="100" w:afterAutospacing="1" w:line="240" w:lineRule="auto"/>
+        <w:rPr>
+          <w:rFonts w:ascii="Times New Roman" w:eastAsia="Times New Roman" w:hAnsi="Times New Roman" w:cs="Times New Roman"/>
+          <w:sz w:val="24"/>
+          <w:szCs w:val="24"/>
+          <w:lang w:eastAsia="en-IN"/>
+        </w:rPr>
+      </w:pPr>
+      <w:r>
+        <w:rPr>
+          <w:rFonts w:ascii="Times New Roman" w:eastAsia="Times New Roman" w:hAnsi="Times New Roman" w:cs="Times New Roman"/>
+          <w:sz w:val="24"/>
+          <w:szCs w:val="24"/>
+          <w:lang w:eastAsia="en-IN"/>
+        </w:rPr>
+        <w:t xml:space="preserve">Only the border </w:t>
+      </w:r>
+      <w:proofErr w:type="spellStart"/>
+      <w:r>
+        <w:rPr>
+          <w:rFonts w:ascii="Times New Roman" w:eastAsia="Times New Roman" w:hAnsi="Times New Roman" w:cs="Times New Roman"/>
+          <w:sz w:val="24"/>
+          <w:szCs w:val="24"/>
+          <w:lang w:eastAsia="en-IN"/>
+        </w:rPr>
+        <w:t>color</w:t>
+      </w:r>
+      <w:proofErr w:type="spellEnd"/>
+      <w:r>
+        <w:rPr>
+          <w:rFonts w:ascii="Times New Roman" w:eastAsia="Times New Roman" w:hAnsi="Times New Roman" w:cs="Times New Roman"/>
+          <w:sz w:val="24"/>
+          <w:szCs w:val="24"/>
+          <w:lang w:eastAsia="en-IN"/>
+        </w:rPr>
+        <w:t xml:space="preserve"> changes.</w:t>
+      </w:r>
+    </w:p>
+    <w:p>
+      <w:pPr>
+        <w:spacing w:after="0" w:line="240" w:lineRule="auto"/>
+        <w:rPr>
+          <w:rFonts w:ascii="Times New Roman" w:eastAsia="Times New Roman" w:hAnsi="Times New Roman" w:cs="Times New Roman"/>
+          <w:sz w:val="24"/>
+          <w:szCs w:val="24"/>
+          <w:lang w:eastAsia="en-IN"/>
+        </w:rPr>
+      </w:pPr>
+      <w:r>
+        <w:rPr>
+          <w:rFonts w:ascii="Times New Roman" w:eastAsia="Times New Roman" w:hAnsi="Times New Roman" w:cs="Times New Roman"/>
+          <w:sz w:val="24"/>
+          <w:szCs w:val="24"/>
+          <w:lang w:eastAsia="en-IN"/>
+        </w:rPr>
+        <w:pict>
+          <v:rect id="_x0000_i1044" style="width:0;height:1.5pt" o:hralign="center" o:hrstd="t" o:hr="t" fillcolor="#a0a0a0" stroked="f"/>
+        </w:pict>
+      </w:r>
+    </w:p>
+    <w:p>
+      <w:pPr>
+        <w:spacing w:before="100" w:beforeAutospacing="1" w:after="100" w:afterAutospacing="1" w:line="240" w:lineRule="auto"/>
+        <w:rPr>
+          <w:rFonts w:ascii="Times New Roman" w:eastAsia="Times New Roman" w:hAnsi="Times New Roman" w:cs="Times New Roman"/>
+          <w:sz w:val="24"/>
+          <w:szCs w:val="24"/>
+          <w:lang w:eastAsia="en-IN"/>
+        </w:rPr>
+      </w:pPr>
+      <w:r>
+        <w:rPr>
+          <w:rFonts w:ascii="Times New Roman" w:eastAsia="Times New Roman" w:hAnsi="Times New Roman" w:cs="Times New Roman"/>
+          <w:sz w:val="24"/>
+          <w:szCs w:val="24"/>
+          <w:lang w:eastAsia="en-IN"/>
+        </w:rPr>
+        <w:lastRenderedPageBreak/>
+        <w:t>Instead of writing</w:t>
+      </w:r>
+    </w:p>
+    <w:p>
+      <w:pPr>
+        <w:tabs>
+          <w:tab w:val="left" w:pos="916"/>
+          <w:tab w:val="left" w:pos="1832"/>
+          <w:tab w:val="left" w:pos="2748"/>
+          <w:tab w:val="left" w:pos="3664"/>
+          <w:tab w:val="left" w:pos="4580"/>
+          <w:tab w:val="left" w:pos="5496"/>
+          <w:tab w:val="left" w:pos="6412"/>
+          <w:tab w:val="left" w:pos="7328"/>
+          <w:tab w:val="left" w:pos="8244"/>
+          <w:tab w:val="left" w:pos="9160"/>
+          <w:tab w:val="left" w:pos="10076"/>
+          <w:tab w:val="left" w:pos="10992"/>
+          <w:tab w:val="left" w:pos="11908"/>
+          <w:tab w:val="left" w:pos="12824"/>
+          <w:tab w:val="left" w:pos="13740"/>
+          <w:tab w:val="left" w:pos="14656"/>
+        </w:tabs>
+        <w:spacing w:after="0" w:line="240" w:lineRule="auto"/>
+        <w:rPr>
+          <w:rFonts w:ascii="Courier New" w:eastAsia="Times New Roman" w:hAnsi="Courier New" w:cs="Courier New"/>
+          <w:sz w:val="20"/>
+          <w:szCs w:val="20"/>
+          <w:lang w:eastAsia="en-IN"/>
+        </w:rPr>
+      </w:pPr>
+      <w:r>
+        <w:rPr>
+          <w:rFonts w:ascii="Courier New" w:eastAsia="Times New Roman" w:hAnsi="Courier New" w:cs="Courier New"/>
+          <w:sz w:val="20"/>
+          <w:szCs w:val="20"/>
+          <w:lang w:eastAsia="en-IN"/>
+        </w:rPr>
+        <w:t>.</w:t>
+      </w:r>
+      <w:proofErr w:type="gramStart"/>
+      <w:r>
+        <w:rPr>
+          <w:rFonts w:ascii="Courier New" w:eastAsia="Times New Roman" w:hAnsi="Courier New" w:cs="Courier New"/>
+          <w:sz w:val="20"/>
+          <w:szCs w:val="20"/>
+          <w:lang w:eastAsia="en-IN"/>
+        </w:rPr>
+        <w:t>box1{</w:t>
+      </w:r>
+      <w:proofErr w:type="gramEnd"/>
+    </w:p>
+    <w:p>
+      <w:pPr>
+        <w:tabs>
+          <w:tab w:val="left" w:pos="916"/>
+          <w:tab w:val="left" w:pos="1832"/>
+          <w:tab w:val="left" w:pos="2748"/>
+          <w:tab w:val="left" w:pos="3664"/>
+          <w:tab w:val="left" w:pos="4580"/>
+          <w:tab w:val="left" w:pos="5496"/>
+          <w:tab w:val="left" w:pos="6412"/>
+          <w:tab w:val="left" w:pos="7328"/>
+          <w:tab w:val="left" w:pos="8244"/>
+          <w:tab w:val="left" w:pos="9160"/>
+          <w:tab w:val="left" w:pos="10076"/>
+          <w:tab w:val="left" w:pos="10992"/>
+          <w:tab w:val="left" w:pos="11908"/>
+          <w:tab w:val="left" w:pos="12824"/>
+          <w:tab w:val="left" w:pos="13740"/>
+          <w:tab w:val="left" w:pos="14656"/>
+        </w:tabs>
+        <w:spacing w:after="0" w:line="240" w:lineRule="auto"/>
+        <w:rPr>
+          <w:rFonts w:ascii="Courier New" w:eastAsia="Times New Roman" w:hAnsi="Courier New" w:cs="Courier New"/>
+          <w:sz w:val="20"/>
+          <w:szCs w:val="20"/>
+          <w:lang w:eastAsia="en-IN"/>
+        </w:rPr>
+      </w:pPr>
+      <w:r>
+        <w:rPr>
+          <w:rFonts w:ascii="Courier New" w:eastAsia="Times New Roman" w:hAnsi="Courier New" w:cs="Courier New"/>
+          <w:sz w:val="20"/>
+          <w:szCs w:val="20"/>
+          <w:lang w:eastAsia="en-IN"/>
+        </w:rPr>
+        <w:t xml:space="preserve">    </w:t>
+      </w:r>
+      <w:proofErr w:type="gramStart"/>
+      <w:r>
+        <w:rPr>
+          <w:rFonts w:ascii="Courier New" w:eastAsia="Times New Roman" w:hAnsi="Courier New" w:cs="Courier New"/>
+          <w:sz w:val="20"/>
+          <w:szCs w:val="20"/>
+          <w:lang w:eastAsia="en-IN"/>
+        </w:rPr>
+        <w:t>width:</w:t>
+      </w:r>
+      <w:proofErr w:type="gramEnd"/>
+      <w:r>
+        <w:rPr>
+          <w:rFonts w:ascii="Courier New" w:eastAsia="Times New Roman" w:hAnsi="Courier New" w:cs="Courier New"/>
+          <w:sz w:val="20"/>
+          <w:szCs w:val="20"/>
+          <w:lang w:eastAsia="en-IN"/>
+        </w:rPr>
+        <w:t>50px;</w:t>
+      </w:r>
+    </w:p>
+    <w:p>
+      <w:pPr>
+        <w:tabs>
+          <w:tab w:val="left" w:pos="916"/>
+          <w:tab w:val="left" w:pos="1832"/>
+          <w:tab w:val="left" w:pos="2748"/>
+          <w:tab w:val="left" w:pos="3664"/>
+          <w:tab w:val="left" w:pos="4580"/>
+          <w:tab w:val="left" w:pos="5496"/>
+          <w:tab w:val="left" w:pos="6412"/>
+          <w:tab w:val="left" w:pos="7328"/>
+          <w:tab w:val="left" w:pos="8244"/>
+          <w:tab w:val="left" w:pos="9160"/>
+          <w:tab w:val="left" w:pos="10076"/>
+          <w:tab w:val="left" w:pos="10992"/>
+          <w:tab w:val="left" w:pos="11908"/>
+          <w:tab w:val="left" w:pos="12824"/>
+          <w:tab w:val="left" w:pos="13740"/>
+          <w:tab w:val="left" w:pos="14656"/>
+        </w:tabs>
+        <w:spacing w:after="0" w:line="240" w:lineRule="auto"/>
+        <w:rPr>
+          <w:rFonts w:ascii="Courier New" w:eastAsia="Times New Roman" w:hAnsi="Courier New" w:cs="Courier New"/>
+          <w:sz w:val="20"/>
+          <w:szCs w:val="20"/>
+          <w:lang w:eastAsia="en-IN"/>
+        </w:rPr>
+      </w:pPr>
+      <w:r>
+        <w:rPr>
+          <w:rFonts w:ascii="Courier New" w:eastAsia="Times New Roman" w:hAnsi="Courier New" w:cs="Courier New"/>
+          <w:sz w:val="20"/>
+          <w:szCs w:val="20"/>
+          <w:lang w:eastAsia="en-IN"/>
+        </w:rPr>
+        <w:t xml:space="preserve">    </w:t>
+      </w:r>
+      <w:proofErr w:type="gramStart"/>
+      <w:r>
+        <w:rPr>
+          <w:rFonts w:ascii="Courier New" w:eastAsia="Times New Roman" w:hAnsi="Courier New" w:cs="Courier New"/>
+          <w:sz w:val="20"/>
+          <w:szCs w:val="20"/>
+          <w:lang w:eastAsia="en-IN"/>
+        </w:rPr>
+        <w:t>padding:</w:t>
+      </w:r>
+      <w:proofErr w:type="gramEnd"/>
+      <w:r>
+        <w:rPr>
+          <w:rFonts w:ascii="Courier New" w:eastAsia="Times New Roman" w:hAnsi="Courier New" w:cs="Courier New"/>
+          <w:sz w:val="20"/>
+          <w:szCs w:val="20"/>
+          <w:lang w:eastAsia="en-IN"/>
+        </w:rPr>
+        <w:t>6px 7px;</w:t>
+      </w:r>
+    </w:p>
+    <w:p>
+      <w:pPr>
+        <w:tabs>
+          <w:tab w:val="left" w:pos="916"/>
+          <w:tab w:val="left" w:pos="1832"/>
+          <w:tab w:val="left" w:pos="2748"/>
+          <w:tab w:val="left" w:pos="3664"/>
+          <w:tab w:val="left" w:pos="4580"/>
+          <w:tab w:val="left" w:pos="5496"/>
+          <w:tab w:val="left" w:pos="6412"/>
+          <w:tab w:val="left" w:pos="7328"/>
+          <w:tab w:val="left" w:pos="8244"/>
+          <w:tab w:val="left" w:pos="9160"/>
+          <w:tab w:val="left" w:pos="10076"/>
+          <w:tab w:val="left" w:pos="10992"/>
+          <w:tab w:val="left" w:pos="11908"/>
+          <w:tab w:val="left" w:pos="12824"/>
+          <w:tab w:val="left" w:pos="13740"/>
+          <w:tab w:val="left" w:pos="14656"/>
+        </w:tabs>
+        <w:spacing w:after="0" w:line="240" w:lineRule="auto"/>
+        <w:rPr>
+          <w:rFonts w:ascii="Courier New" w:eastAsia="Times New Roman" w:hAnsi="Courier New" w:cs="Courier New"/>
+          <w:sz w:val="20"/>
+          <w:szCs w:val="20"/>
+          <w:lang w:eastAsia="en-IN"/>
+        </w:rPr>
+      </w:pPr>
+      <w:r>
+        <w:rPr>
+          <w:rFonts w:ascii="Courier New" w:eastAsia="Times New Roman" w:hAnsi="Courier New" w:cs="Courier New"/>
+          <w:sz w:val="20"/>
+          <w:szCs w:val="20"/>
+          <w:lang w:eastAsia="en-IN"/>
+        </w:rPr>
+        <w:t xml:space="preserve">    </w:t>
+      </w:r>
+      <w:proofErr w:type="gramStart"/>
+      <w:r>
+        <w:rPr>
+          <w:rFonts w:ascii="Courier New" w:eastAsia="Times New Roman" w:hAnsi="Courier New" w:cs="Courier New"/>
+          <w:sz w:val="20"/>
+          <w:szCs w:val="20"/>
+          <w:lang w:eastAsia="en-IN"/>
+        </w:rPr>
+        <w:t>margin:</w:t>
+      </w:r>
+      <w:proofErr w:type="gramEnd"/>
+      <w:r>
+        <w:rPr>
+          <w:rFonts w:ascii="Courier New" w:eastAsia="Times New Roman" w:hAnsi="Courier New" w:cs="Courier New"/>
+          <w:sz w:val="20"/>
+          <w:szCs w:val="20"/>
+          <w:lang w:eastAsia="en-IN"/>
+        </w:rPr>
+        <w:t>16px 15px 17px;</w:t>
+      </w:r>
+    </w:p>
+    <w:p>
+      <w:pPr>
+        <w:tabs>
+          <w:tab w:val="left" w:pos="916"/>
+          <w:tab w:val="left" w:pos="1832"/>
+          <w:tab w:val="left" w:pos="2748"/>
+          <w:tab w:val="left" w:pos="3664"/>
+          <w:tab w:val="left" w:pos="4580"/>
+          <w:tab w:val="left" w:pos="5496"/>
+          <w:tab w:val="left" w:pos="6412"/>
+          <w:tab w:val="left" w:pos="7328"/>
+          <w:tab w:val="left" w:pos="8244"/>
+          <w:tab w:val="left" w:pos="9160"/>
+          <w:tab w:val="left" w:pos="10076"/>
+          <w:tab w:val="left" w:pos="10992"/>
+          <w:tab w:val="left" w:pos="11908"/>
+          <w:tab w:val="left" w:pos="12824"/>
+          <w:tab w:val="left" w:pos="13740"/>
+          <w:tab w:val="left" w:pos="14656"/>
+        </w:tabs>
+        <w:spacing w:after="0" w:line="240" w:lineRule="auto"/>
+        <w:rPr>
+          <w:rFonts w:ascii="Courier New" w:eastAsia="Times New Roman" w:hAnsi="Courier New" w:cs="Courier New"/>
+          <w:sz w:val="20"/>
+          <w:szCs w:val="20"/>
+          <w:lang w:eastAsia="en-IN"/>
+        </w:rPr>
+      </w:pPr>
+      <w:r>
+        <w:rPr>
+          <w:rFonts w:ascii="Courier New" w:eastAsia="Times New Roman" w:hAnsi="Courier New" w:cs="Courier New"/>
+          <w:sz w:val="20"/>
+          <w:szCs w:val="20"/>
+          <w:lang w:eastAsia="en-IN"/>
+        </w:rPr>
+        <w:t xml:space="preserve">    </w:t>
+      </w:r>
+      <w:proofErr w:type="spellStart"/>
+      <w:proofErr w:type="gramStart"/>
+      <w:r>
+        <w:rPr>
+          <w:rFonts w:ascii="Courier New" w:eastAsia="Times New Roman" w:hAnsi="Courier New" w:cs="Courier New"/>
+          <w:sz w:val="20"/>
+          <w:szCs w:val="20"/>
+          <w:lang w:eastAsia="en-IN"/>
+        </w:rPr>
+        <w:t>box-sizing:</w:t>
+      </w:r>
+      <w:proofErr w:type="gramEnd"/>
+      <w:r>
+        <w:rPr>
+          <w:rFonts w:ascii="Courier New" w:eastAsia="Times New Roman" w:hAnsi="Courier New" w:cs="Courier New"/>
+          <w:sz w:val="20"/>
+          <w:szCs w:val="20"/>
+          <w:lang w:eastAsia="en-IN"/>
+        </w:rPr>
+        <w:t>content-box</w:t>
+      </w:r>
+      <w:proofErr w:type="spellEnd"/>
+      <w:r>
+        <w:rPr>
+          <w:rFonts w:ascii="Courier New" w:eastAsia="Times New Roman" w:hAnsi="Courier New" w:cs="Courier New"/>
+          <w:sz w:val="20"/>
+          <w:szCs w:val="20"/>
+          <w:lang w:eastAsia="en-IN"/>
+        </w:rPr>
+        <w:t>;</w:t>
+      </w:r>
+    </w:p>
+    <w:p>
+      <w:pPr>
+        <w:tabs>
+          <w:tab w:val="left" w:pos="916"/>
+          <w:tab w:val="left" w:pos="1832"/>
+          <w:tab w:val="left" w:pos="2748"/>
+          <w:tab w:val="left" w:pos="3664"/>
+          <w:tab w:val="left" w:pos="4580"/>
+          <w:tab w:val="left" w:pos="5496"/>
+          <w:tab w:val="left" w:pos="6412"/>
+          <w:tab w:val="left" w:pos="7328"/>
+          <w:tab w:val="left" w:pos="8244"/>
+          <w:tab w:val="left" w:pos="9160"/>
+          <w:tab w:val="left" w:pos="10076"/>
+          <w:tab w:val="left" w:pos="10992"/>
+          <w:tab w:val="left" w:pos="11908"/>
+          <w:tab w:val="left" w:pos="12824"/>
+          <w:tab w:val="left" w:pos="13740"/>
+          <w:tab w:val="left" w:pos="14656"/>
+        </w:tabs>
+        <w:spacing w:after="0" w:line="240" w:lineRule="auto"/>
+        <w:rPr>
+          <w:rFonts w:ascii="Courier New" w:eastAsia="Times New Roman" w:hAnsi="Courier New" w:cs="Courier New"/>
+          <w:sz w:val="20"/>
+          <w:szCs w:val="20"/>
+          <w:lang w:eastAsia="en-IN"/>
+        </w:rPr>
+      </w:pPr>
+      <w:r>
+        <w:rPr>
+          <w:rFonts w:ascii="Courier New" w:eastAsia="Times New Roman" w:hAnsi="Courier New" w:cs="Courier New"/>
+          <w:sz w:val="20"/>
+          <w:szCs w:val="20"/>
+          <w:lang w:eastAsia="en-IN"/>
+        </w:rPr>
+        <w:t xml:space="preserve">    </w:t>
+      </w:r>
+      <w:proofErr w:type="gramStart"/>
+      <w:r>
+        <w:rPr>
+          <w:rFonts w:ascii="Courier New" w:eastAsia="Times New Roman" w:hAnsi="Courier New" w:cs="Courier New"/>
+          <w:sz w:val="20"/>
+          <w:szCs w:val="20"/>
+          <w:lang w:eastAsia="en-IN"/>
+        </w:rPr>
+        <w:t>border:</w:t>
+      </w:r>
+      <w:proofErr w:type="gramEnd"/>
+      <w:r>
+        <w:rPr>
+          <w:rFonts w:ascii="Courier New" w:eastAsia="Times New Roman" w:hAnsi="Courier New" w:cs="Courier New"/>
+          <w:sz w:val="20"/>
+          <w:szCs w:val="20"/>
+          <w:lang w:eastAsia="en-IN"/>
+        </w:rPr>
+        <w:t>5px solid red;</w:t>
+      </w:r>
+    </w:p>
+    <w:p>
+      <w:pPr>
+        <w:tabs>
+          <w:tab w:val="left" w:pos="916"/>
+          <w:tab w:val="left" w:pos="1832"/>
+          <w:tab w:val="left" w:pos="2748"/>
+          <w:tab w:val="left" w:pos="3664"/>
+          <w:tab w:val="left" w:pos="4580"/>
+          <w:tab w:val="left" w:pos="5496"/>
+          <w:tab w:val="left" w:pos="6412"/>
+          <w:tab w:val="left" w:pos="7328"/>
+          <w:tab w:val="left" w:pos="8244"/>
+          <w:tab w:val="left" w:pos="9160"/>
+          <w:tab w:val="left" w:pos="10076"/>
+          <w:tab w:val="left" w:pos="10992"/>
+          <w:tab w:val="left" w:pos="11908"/>
+          <w:tab w:val="left" w:pos="12824"/>
+          <w:tab w:val="left" w:pos="13740"/>
+          <w:tab w:val="left" w:pos="14656"/>
+        </w:tabs>
+        <w:spacing w:after="0" w:line="240" w:lineRule="auto"/>
+        <w:rPr>
+          <w:rFonts w:ascii="Courier New" w:eastAsia="Times New Roman" w:hAnsi="Courier New" w:cs="Courier New"/>
+          <w:sz w:val="20"/>
+          <w:szCs w:val="20"/>
+          <w:lang w:eastAsia="en-IN"/>
+        </w:rPr>
+      </w:pPr>
+      <w:r>
+        <w:rPr>
+          <w:rFonts w:ascii="Courier New" w:eastAsia="Times New Roman" w:hAnsi="Courier New" w:cs="Courier New"/>
+          <w:sz w:val="20"/>
+          <w:szCs w:val="20"/>
+          <w:lang w:eastAsia="en-IN"/>
+        </w:rPr>
+        <w:t>}</w:t>
+      </w:r>
+    </w:p>
+    <w:p>
+      <w:pPr>
+        <w:tabs>
+          <w:tab w:val="left" w:pos="916"/>
+          <w:tab w:val="left" w:pos="1832"/>
+          <w:tab w:val="left" w:pos="2748"/>
+          <w:tab w:val="left" w:pos="3664"/>
+          <w:tab w:val="left" w:pos="4580"/>
+          <w:tab w:val="left" w:pos="5496"/>
+          <w:tab w:val="left" w:pos="6412"/>
+          <w:tab w:val="left" w:pos="7328"/>
+          <w:tab w:val="left" w:pos="8244"/>
+          <w:tab w:val="left" w:pos="9160"/>
+          <w:tab w:val="left" w:pos="10076"/>
+          <w:tab w:val="left" w:pos="10992"/>
+          <w:tab w:val="left" w:pos="11908"/>
+          <w:tab w:val="left" w:pos="12824"/>
+          <w:tab w:val="left" w:pos="13740"/>
+          <w:tab w:val="left" w:pos="14656"/>
+        </w:tabs>
+        <w:spacing w:after="0" w:line="240" w:lineRule="auto"/>
+        <w:rPr>
+          <w:rFonts w:ascii="Courier New" w:eastAsia="Times New Roman" w:hAnsi="Courier New" w:cs="Courier New"/>
+          <w:sz w:val="20"/>
+          <w:szCs w:val="20"/>
+          <w:lang w:eastAsia="en-IN"/>
+        </w:rPr>
+      </w:pPr>
+      <w:r>
+        <w:rPr>
+          <w:rFonts w:ascii="Courier New" w:eastAsia="Times New Roman" w:hAnsi="Courier New" w:cs="Courier New"/>
+          <w:sz w:val="20"/>
+          <w:szCs w:val="20"/>
+          <w:lang w:eastAsia="en-IN"/>
+        </w:rPr>
+        <w:t>.</w:t>
+      </w:r>
+      <w:proofErr w:type="gramStart"/>
+      <w:r>
+        <w:rPr>
+          <w:rFonts w:ascii="Courier New" w:eastAsia="Times New Roman" w:hAnsi="Courier New" w:cs="Courier New"/>
+          <w:sz w:val="20"/>
+          <w:szCs w:val="20"/>
+          <w:lang w:eastAsia="en-IN"/>
+        </w:rPr>
+        <w:t>box2{</w:t>
+      </w:r>
+      <w:proofErr w:type="gramEnd"/>
+    </w:p>
+    <w:p>
+      <w:pPr>
+        <w:tabs>
+          <w:tab w:val="left" w:pos="916"/>
+          <w:tab w:val="left" w:pos="1832"/>
+          <w:tab w:val="left" w:pos="2748"/>
+          <w:tab w:val="left" w:pos="3664"/>
+          <w:tab w:val="left" w:pos="4580"/>
+          <w:tab w:val="left" w:pos="5496"/>
+          <w:tab w:val="left" w:pos="6412"/>
+          <w:tab w:val="left" w:pos="7328"/>
+          <w:tab w:val="left" w:pos="8244"/>
+          <w:tab w:val="left" w:pos="9160"/>
+          <w:tab w:val="left" w:pos="10076"/>
+          <w:tab w:val="left" w:pos="10992"/>
+          <w:tab w:val="left" w:pos="11908"/>
+          <w:tab w:val="left" w:pos="12824"/>
+          <w:tab w:val="left" w:pos="13740"/>
+          <w:tab w:val="left" w:pos="14656"/>
+        </w:tabs>
+        <w:spacing w:after="0" w:line="240" w:lineRule="auto"/>
+        <w:rPr>
+          <w:rFonts w:ascii="Courier New" w:eastAsia="Times New Roman" w:hAnsi="Courier New" w:cs="Courier New"/>
+          <w:sz w:val="20"/>
+          <w:szCs w:val="20"/>
+          <w:lang w:eastAsia="en-IN"/>
+        </w:rPr>
+      </w:pPr>
+      <w:r>
+        <w:rPr>
+          <w:rFonts w:ascii="Courier New" w:eastAsia="Times New Roman" w:hAnsi="Courier New" w:cs="Courier New"/>
+          <w:sz w:val="20"/>
+          <w:szCs w:val="20"/>
+          <w:lang w:eastAsia="en-IN"/>
+        </w:rPr>
+        <w:t xml:space="preserve">    </w:t>
+      </w:r>
+      <w:proofErr w:type="gramStart"/>
+      <w:r>
+        <w:rPr>
+          <w:rFonts w:ascii="Courier New" w:eastAsia="Times New Roman" w:hAnsi="Courier New" w:cs="Courier New"/>
+          <w:sz w:val="20"/>
+          <w:szCs w:val="20"/>
+          <w:lang w:eastAsia="en-IN"/>
+        </w:rPr>
+        <w:t>width:</w:t>
+      </w:r>
+      <w:proofErr w:type="gramEnd"/>
+      <w:r>
+        <w:rPr>
+          <w:rFonts w:ascii="Courier New" w:eastAsia="Times New Roman" w:hAnsi="Courier New" w:cs="Courier New"/>
+          <w:sz w:val="20"/>
+          <w:szCs w:val="20"/>
+          <w:lang w:eastAsia="en-IN"/>
+        </w:rPr>
+        <w:t>50px;</w:t>
+      </w:r>
+    </w:p>
+    <w:p>
+      <w:pPr>
+        <w:tabs>
+          <w:tab w:val="left" w:pos="916"/>
+          <w:tab w:val="left" w:pos="1832"/>
+          <w:tab w:val="left" w:pos="2748"/>
+          <w:tab w:val="left" w:pos="3664"/>
+          <w:tab w:val="left" w:pos="4580"/>
+          <w:tab w:val="left" w:pos="5496"/>
+          <w:tab w:val="left" w:pos="6412"/>
+          <w:tab w:val="left" w:pos="7328"/>
+          <w:tab w:val="left" w:pos="8244"/>
+          <w:tab w:val="left" w:pos="9160"/>
+          <w:tab w:val="left" w:pos="10076"/>
+          <w:tab w:val="left" w:pos="10992"/>
+          <w:tab w:val="left" w:pos="11908"/>
+          <w:tab w:val="left" w:pos="12824"/>
+          <w:tab w:val="left" w:pos="13740"/>
+          <w:tab w:val="left" w:pos="14656"/>
+        </w:tabs>
+        <w:spacing w:after="0" w:line="240" w:lineRule="auto"/>
+        <w:rPr>
+          <w:rFonts w:ascii="Courier New" w:eastAsia="Times New Roman" w:hAnsi="Courier New" w:cs="Courier New"/>
+          <w:sz w:val="20"/>
+          <w:szCs w:val="20"/>
+          <w:lang w:eastAsia="en-IN"/>
+        </w:rPr>
+      </w:pPr>
+      <w:r>
+        <w:rPr>
+          <w:rFonts w:ascii="Courier New" w:eastAsia="Times New Roman" w:hAnsi="Courier New" w:cs="Courier New"/>
+          <w:sz w:val="20"/>
+          <w:szCs w:val="20"/>
+          <w:lang w:eastAsia="en-IN"/>
+        </w:rPr>
+        <w:t xml:space="preserve">    </w:t>
+      </w:r>
+      <w:proofErr w:type="gramStart"/>
+      <w:r>
+        <w:rPr>
+          <w:rFonts w:ascii="Courier New" w:eastAsia="Times New Roman" w:hAnsi="Courier New" w:cs="Courier New"/>
+          <w:sz w:val="20"/>
+          <w:szCs w:val="20"/>
+          <w:lang w:eastAsia="en-IN"/>
+        </w:rPr>
+        <w:t>padding:</w:t>
+      </w:r>
+      <w:proofErr w:type="gramEnd"/>
+      <w:r>
+        <w:rPr>
+          <w:rFonts w:ascii="Courier New" w:eastAsia="Times New Roman" w:hAnsi="Courier New" w:cs="Courier New"/>
+          <w:sz w:val="20"/>
+          <w:szCs w:val="20"/>
+          <w:lang w:eastAsia="en-IN"/>
+        </w:rPr>
+        <w:t>6px 7px;</w:t>
+      </w:r>
+    </w:p>
+    <w:p>
+      <w:pPr>
+        <w:tabs>
+          <w:tab w:val="left" w:pos="916"/>
+          <w:tab w:val="left" w:pos="1832"/>
+          <w:tab w:val="left" w:pos="2748"/>
+          <w:tab w:val="left" w:pos="3664"/>
+          <w:tab w:val="left" w:pos="4580"/>
+          <w:tab w:val="left" w:pos="5496"/>
+          <w:tab w:val="left" w:pos="6412"/>
+          <w:tab w:val="left" w:pos="7328"/>
+          <w:tab w:val="left" w:pos="8244"/>
+          <w:tab w:val="left" w:pos="9160"/>
+          <w:tab w:val="left" w:pos="10076"/>
+          <w:tab w:val="left" w:pos="10992"/>
+          <w:tab w:val="left" w:pos="11908"/>
+          <w:tab w:val="left" w:pos="12824"/>
+          <w:tab w:val="left" w:pos="13740"/>
+          <w:tab w:val="left" w:pos="14656"/>
+        </w:tabs>
+        <w:spacing w:after="0" w:line="240" w:lineRule="auto"/>
+        <w:rPr>
+          <w:rFonts w:ascii="Courier New" w:eastAsia="Times New Roman" w:hAnsi="Courier New" w:cs="Courier New"/>
+          <w:sz w:val="20"/>
+          <w:szCs w:val="20"/>
+          <w:lang w:eastAsia="en-IN"/>
+        </w:rPr>
+      </w:pPr>
+      <w:r>
+        <w:rPr>
+          <w:rFonts w:ascii="Courier New" w:eastAsia="Times New Roman" w:hAnsi="Courier New" w:cs="Courier New"/>
+          <w:sz w:val="20"/>
+          <w:szCs w:val="20"/>
+          <w:lang w:eastAsia="en-IN"/>
+        </w:rPr>
+        <w:t xml:space="preserve">    </w:t>
+      </w:r>
+      <w:proofErr w:type="gramStart"/>
+      <w:r>
+        <w:rPr>
+          <w:rFonts w:ascii="Courier New" w:eastAsia="Times New Roman" w:hAnsi="Courier New" w:cs="Courier New"/>
+          <w:sz w:val="20"/>
+          <w:szCs w:val="20"/>
+          <w:lang w:eastAsia="en-IN"/>
+        </w:rPr>
+        <w:t>margin:</w:t>
+      </w:r>
+      <w:proofErr w:type="gramEnd"/>
+      <w:r>
+        <w:rPr>
+          <w:rFonts w:ascii="Courier New" w:eastAsia="Times New Roman" w:hAnsi="Courier New" w:cs="Courier New"/>
+          <w:sz w:val="20"/>
+          <w:szCs w:val="20"/>
+          <w:lang w:eastAsia="en-IN"/>
+        </w:rPr>
+        <w:t>16px 15px 17px;</w:t>
+      </w:r>
+    </w:p>
+    <w:p>
+      <w:pPr>
+        <w:tabs>
+          <w:tab w:val="left" w:pos="916"/>
+          <w:tab w:val="left" w:pos="1832"/>
+          <w:tab w:val="left" w:pos="2748"/>
+          <w:tab w:val="left" w:pos="3664"/>
+          <w:tab w:val="left" w:pos="4580"/>
+          <w:tab w:val="left" w:pos="5496"/>
+          <w:tab w:val="left" w:pos="6412"/>
+          <w:tab w:val="left" w:pos="7328"/>
+          <w:tab w:val="left" w:pos="8244"/>
+          <w:tab w:val="left" w:pos="9160"/>
+          <w:tab w:val="left" w:pos="10076"/>
+          <w:tab w:val="left" w:pos="10992"/>
+          <w:tab w:val="left" w:pos="11908"/>
+          <w:tab w:val="left" w:pos="12824"/>
+          <w:tab w:val="left" w:pos="13740"/>
+          <w:tab w:val="left" w:pos="14656"/>
+        </w:tabs>
+        <w:spacing w:after="0" w:line="240" w:lineRule="auto"/>
+        <w:rPr>
+          <w:rFonts w:ascii="Courier New" w:eastAsia="Times New Roman" w:hAnsi="Courier New" w:cs="Courier New"/>
+          <w:sz w:val="20"/>
+          <w:szCs w:val="20"/>
+          <w:lang w:eastAsia="en-IN"/>
+        </w:rPr>
+      </w:pPr>
+      <w:r>
+        <w:rPr>
+          <w:rFonts w:ascii="Courier New" w:eastAsia="Times New Roman" w:hAnsi="Courier New" w:cs="Courier New"/>
+          <w:sz w:val="20"/>
+          <w:szCs w:val="20"/>
+          <w:lang w:eastAsia="en-IN"/>
+        </w:rPr>
+        <w:t xml:space="preserve">    </w:t>
+      </w:r>
+      <w:proofErr w:type="spellStart"/>
+      <w:proofErr w:type="gramStart"/>
+      <w:r>
+        <w:rPr>
+          <w:rFonts w:ascii="Courier New" w:eastAsia="Times New Roman" w:hAnsi="Courier New" w:cs="Courier New"/>
+          <w:sz w:val="20"/>
+          <w:szCs w:val="20"/>
+          <w:lang w:eastAsia="en-IN"/>
+        </w:rPr>
+        <w:t>box-sizing:</w:t>
+      </w:r>
+      <w:proofErr w:type="gramEnd"/>
+      <w:r>
+        <w:rPr>
+          <w:rFonts w:ascii="Courier New" w:eastAsia="Times New Roman" w:hAnsi="Courier New" w:cs="Courier New"/>
+          <w:sz w:val="20"/>
+          <w:szCs w:val="20"/>
+          <w:lang w:eastAsia="en-IN"/>
+        </w:rPr>
+        <w:t>content-box</w:t>
+      </w:r>
+      <w:proofErr w:type="spellEnd"/>
+      <w:r>
+        <w:rPr>
+          <w:rFonts w:ascii="Courier New" w:eastAsia="Times New Roman" w:hAnsi="Courier New" w:cs="Courier New"/>
+          <w:sz w:val="20"/>
+          <w:szCs w:val="20"/>
+          <w:lang w:eastAsia="en-IN"/>
+        </w:rPr>
+        <w:t>;</w:t>
+      </w:r>
+    </w:p>
+    <w:p>
+      <w:pPr>
+        <w:tabs>
+          <w:tab w:val="left" w:pos="916"/>
+          <w:tab w:val="left" w:pos="1832"/>
+          <w:tab w:val="left" w:pos="2748"/>
+          <w:tab w:val="left" w:pos="3664"/>
+          <w:tab w:val="left" w:pos="4580"/>
+          <w:tab w:val="left" w:pos="5496"/>
+          <w:tab w:val="left" w:pos="6412"/>
+          <w:tab w:val="left" w:pos="7328"/>
+          <w:tab w:val="left" w:pos="8244"/>
+          <w:tab w:val="left" w:pos="9160"/>
+          <w:tab w:val="left" w:pos="10076"/>
+          <w:tab w:val="left" w:pos="10992"/>
+          <w:tab w:val="left" w:pos="11908"/>
+          <w:tab w:val="left" w:pos="12824"/>
+          <w:tab w:val="left" w:pos="13740"/>
+          <w:tab w:val="left" w:pos="14656"/>
+        </w:tabs>
+        <w:spacing w:after="0" w:line="240" w:lineRule="auto"/>
+        <w:rPr>
+          <w:rFonts w:ascii="Courier New" w:eastAsia="Times New Roman" w:hAnsi="Courier New" w:cs="Courier New"/>
+          <w:sz w:val="20"/>
+          <w:szCs w:val="20"/>
+          <w:lang w:eastAsia="en-IN"/>
+        </w:rPr>
+      </w:pPr>
+      <w:r>
+        <w:rPr>
+          <w:rFonts w:ascii="Courier New" w:eastAsia="Times New Roman" w:hAnsi="Courier New" w:cs="Courier New"/>
+          <w:sz w:val="20"/>
+          <w:szCs w:val="20"/>
+          <w:lang w:eastAsia="en-IN"/>
+        </w:rPr>
+        <w:t xml:space="preserve">    </w:t>
+      </w:r>
+      <w:proofErr w:type="gramStart"/>
+      <w:r>
+        <w:rPr>
+          <w:rFonts w:ascii="Courier New" w:eastAsia="Times New Roman" w:hAnsi="Courier New" w:cs="Courier New"/>
+          <w:sz w:val="20"/>
+          <w:szCs w:val="20"/>
+          <w:lang w:eastAsia="en-IN"/>
+        </w:rPr>
+        <w:t>border:</w:t>
+      </w:r>
+      <w:proofErr w:type="gramEnd"/>
+      <w:r>
+        <w:rPr>
+          <w:rFonts w:ascii="Courier New" w:eastAsia="Times New Roman" w:hAnsi="Courier New" w:cs="Courier New"/>
+          <w:sz w:val="20"/>
+          <w:szCs w:val="20"/>
+          <w:lang w:eastAsia="en-IN"/>
+        </w:rPr>
+        <w:t>5px solid green;</w:t>
+      </w:r>
+    </w:p>
+    <w:p>
+      <w:pPr>
+        <w:tabs>
+          <w:tab w:val="left" w:pos="916"/>
+          <w:tab w:val="left" w:pos="1832"/>
+          <w:tab w:val="left" w:pos="2748"/>
+          <w:tab w:val="left" w:pos="3664"/>
+          <w:tab w:val="left" w:pos="4580"/>
+          <w:tab w:val="left" w:pos="5496"/>
+          <w:tab w:val="left" w:pos="6412"/>
+          <w:tab w:val="left" w:pos="7328"/>
+          <w:tab w:val="left" w:pos="8244"/>
+          <w:tab w:val="left" w:pos="9160"/>
+          <w:tab w:val="left" w:pos="10076"/>
+          <w:tab w:val="left" w:pos="10992"/>
+          <w:tab w:val="left" w:pos="11908"/>
+          <w:tab w:val="left" w:pos="12824"/>
+          <w:tab w:val="left" w:pos="13740"/>
+          <w:tab w:val="left" w:pos="14656"/>
+        </w:tabs>
+        <w:spacing w:after="0" w:line="240" w:lineRule="auto"/>
+        <w:rPr>
+          <w:rFonts w:ascii="Courier New" w:eastAsia="Times New Roman" w:hAnsi="Courier New" w:cs="Courier New"/>
+          <w:sz w:val="20"/>
+          <w:szCs w:val="20"/>
+          <w:lang w:eastAsia="en-IN"/>
+        </w:rPr>
+      </w:pPr>
+      <w:r>
+        <w:rPr>
+          <w:rFonts w:ascii="Courier New" w:eastAsia="Times New Roman" w:hAnsi="Courier New" w:cs="Courier New"/>
+          <w:sz w:val="20"/>
+          <w:szCs w:val="20"/>
+          <w:lang w:eastAsia="en-IN"/>
+        </w:rPr>
+        <w:t>}</w:t>
+      </w:r>
+    </w:p>
+    <w:p>
+      <w:pPr>
+        <w:tabs>
+          <w:tab w:val="left" w:pos="916"/>
+          <w:tab w:val="left" w:pos="1832"/>
+          <w:tab w:val="left" w:pos="2748"/>
+          <w:tab w:val="left" w:pos="3664"/>
+          <w:tab w:val="left" w:pos="4580"/>
+          <w:tab w:val="left" w:pos="5496"/>
+          <w:tab w:val="left" w:pos="6412"/>
+          <w:tab w:val="left" w:pos="7328"/>
+          <w:tab w:val="left" w:pos="8244"/>
+          <w:tab w:val="left" w:pos="9160"/>
+          <w:tab w:val="left" w:pos="10076"/>
+          <w:tab w:val="left" w:pos="10992"/>
+          <w:tab w:val="left" w:pos="11908"/>
+          <w:tab w:val="left" w:pos="12824"/>
+          <w:tab w:val="left" w:pos="13740"/>
+          <w:tab w:val="left" w:pos="14656"/>
+        </w:tabs>
+        <w:spacing w:after="0" w:line="240" w:lineRule="auto"/>
+        <w:rPr>
+          <w:rFonts w:ascii="Courier New" w:eastAsia="Times New Roman" w:hAnsi="Courier New" w:cs="Courier New"/>
+          <w:sz w:val="20"/>
+          <w:szCs w:val="20"/>
+          <w:lang w:eastAsia="en-IN"/>
+        </w:rPr>
+      </w:pPr>
+      <w:r>
+        <w:rPr>
+          <w:rFonts w:ascii="Courier New" w:eastAsia="Times New Roman" w:hAnsi="Courier New" w:cs="Courier New"/>
+          <w:sz w:val="20"/>
+          <w:szCs w:val="20"/>
+          <w:lang w:eastAsia="en-IN"/>
+        </w:rPr>
+        <w:t>.</w:t>
+      </w:r>
+      <w:proofErr w:type="gramStart"/>
+      <w:r>
+        <w:rPr>
+          <w:rFonts w:ascii="Courier New" w:eastAsia="Times New Roman" w:hAnsi="Courier New" w:cs="Courier New"/>
+          <w:sz w:val="20"/>
+          <w:szCs w:val="20"/>
+          <w:lang w:eastAsia="en-IN"/>
+        </w:rPr>
+        <w:t>box3{</w:t>
+      </w:r>
+      <w:proofErr w:type="gramEnd"/>
+    </w:p>
+    <w:p>
+      <w:pPr>
+        <w:tabs>
+          <w:tab w:val="left" w:pos="916"/>
+          <w:tab w:val="left" w:pos="1832"/>
+          <w:tab w:val="left" w:pos="2748"/>
+          <w:tab w:val="left" w:pos="3664"/>
+          <w:tab w:val="left" w:pos="4580"/>
+          <w:tab w:val="left" w:pos="5496"/>
+          <w:tab w:val="left" w:pos="6412"/>
+          <w:tab w:val="left" w:pos="7328"/>
+          <w:tab w:val="left" w:pos="8244"/>
+          <w:tab w:val="left" w:pos="9160"/>
+          <w:tab w:val="left" w:pos="10076"/>
+          <w:tab w:val="left" w:pos="10992"/>
+          <w:tab w:val="left" w:pos="11908"/>
+          <w:tab w:val="left" w:pos="12824"/>
+          <w:tab w:val="left" w:pos="13740"/>
+          <w:tab w:val="left" w:pos="14656"/>
+        </w:tabs>
+        <w:spacing w:after="0" w:line="240" w:lineRule="auto"/>
+        <w:rPr>
+          <w:rFonts w:ascii="Courier New" w:eastAsia="Times New Roman" w:hAnsi="Courier New" w:cs="Courier New"/>
+          <w:sz w:val="20"/>
+          <w:szCs w:val="20"/>
+          <w:lang w:eastAsia="en-IN"/>
+        </w:rPr>
+      </w:pPr>
+      <w:r>
+        <w:rPr>
+          <w:rFonts w:ascii="Courier New" w:eastAsia="Times New Roman" w:hAnsi="Courier New" w:cs="Courier New"/>
+          <w:sz w:val="20"/>
+          <w:szCs w:val="20"/>
+          <w:lang w:eastAsia="en-IN"/>
+        </w:rPr>
+        <w:t xml:space="preserve">    </w:t>
+      </w:r>
+      <w:proofErr w:type="gramStart"/>
+      <w:r>
+        <w:rPr>
+          <w:rFonts w:ascii="Courier New" w:eastAsia="Times New Roman" w:hAnsi="Courier New" w:cs="Courier New"/>
+          <w:sz w:val="20"/>
+          <w:szCs w:val="20"/>
+          <w:lang w:eastAsia="en-IN"/>
+        </w:rPr>
+        <w:t>width:</w:t>
+      </w:r>
+      <w:proofErr w:type="gramEnd"/>
+      <w:r>
+        <w:rPr>
+          <w:rFonts w:ascii="Courier New" w:eastAsia="Times New Roman" w:hAnsi="Courier New" w:cs="Courier New"/>
+          <w:sz w:val="20"/>
+          <w:szCs w:val="20"/>
+          <w:lang w:eastAsia="en-IN"/>
+        </w:rPr>
+        <w:t>50px;</w:t>
+      </w:r>
+    </w:p>
+    <w:p>
+      <w:pPr>
+        <w:tabs>
+          <w:tab w:val="left" w:pos="916"/>
+          <w:tab w:val="left" w:pos="1832"/>
+          <w:tab w:val="left" w:pos="2748"/>
+          <w:tab w:val="left" w:pos="3664"/>
+          <w:tab w:val="left" w:pos="4580"/>
+          <w:tab w:val="left" w:pos="5496"/>
+          <w:tab w:val="left" w:pos="6412"/>
+          <w:tab w:val="left" w:pos="7328"/>
+          <w:tab w:val="left" w:pos="8244"/>
+          <w:tab w:val="left" w:pos="9160"/>
+          <w:tab w:val="left" w:pos="10076"/>
+          <w:tab w:val="left" w:pos="10992"/>
+          <w:tab w:val="left" w:pos="11908"/>
+          <w:tab w:val="left" w:pos="12824"/>
+          <w:tab w:val="left" w:pos="13740"/>
+          <w:tab w:val="left" w:pos="14656"/>
+        </w:tabs>
+        <w:spacing w:after="0" w:line="240" w:lineRule="auto"/>
+        <w:rPr>
+          <w:rFonts w:ascii="Courier New" w:eastAsia="Times New Roman" w:hAnsi="Courier New" w:cs="Courier New"/>
+          <w:sz w:val="20"/>
+          <w:szCs w:val="20"/>
+          <w:lang w:eastAsia="en-IN"/>
+        </w:rPr>
+      </w:pPr>
+      <w:r>
+        <w:rPr>
+          <w:rFonts w:ascii="Courier New" w:eastAsia="Times New Roman" w:hAnsi="Courier New" w:cs="Courier New"/>
+          <w:sz w:val="20"/>
+          <w:szCs w:val="20"/>
+          <w:lang w:eastAsia="en-IN"/>
+        </w:rPr>
+        <w:t xml:space="preserve">    </w:t>
+      </w:r>
+      <w:proofErr w:type="gramStart"/>
+      <w:r>
+        <w:rPr>
+          <w:rFonts w:ascii="Courier New" w:eastAsia="Times New Roman" w:hAnsi="Courier New" w:cs="Courier New"/>
+          <w:sz w:val="20"/>
+          <w:szCs w:val="20"/>
+          <w:lang w:eastAsia="en-IN"/>
+        </w:rPr>
+        <w:t>padding:</w:t>
+      </w:r>
+      <w:proofErr w:type="gramEnd"/>
+      <w:r>
+        <w:rPr>
+          <w:rFonts w:ascii="Courier New" w:eastAsia="Times New Roman" w:hAnsi="Courier New" w:cs="Courier New"/>
+          <w:sz w:val="20"/>
+          <w:szCs w:val="20"/>
+          <w:lang w:eastAsia="en-IN"/>
+        </w:rPr>
+        <w:t>6px 7px;</w:t>
+      </w:r>
+    </w:p>
+    <w:p>
+      <w:pPr>
+        <w:tabs>
+          <w:tab w:val="left" w:pos="916"/>
+          <w:tab w:val="left" w:pos="1832"/>
+          <w:tab w:val="left" w:pos="2748"/>
+          <w:tab w:val="left" w:pos="3664"/>
+          <w:tab w:val="left" w:pos="4580"/>
+          <w:tab w:val="left" w:pos="5496"/>
+          <w:tab w:val="left" w:pos="6412"/>
+          <w:tab w:val="left" w:pos="7328"/>
+          <w:tab w:val="left" w:pos="8244"/>
+          <w:tab w:val="left" w:pos="9160"/>
+          <w:tab w:val="left" w:pos="10076"/>
+          <w:tab w:val="left" w:pos="10992"/>
+          <w:tab w:val="left" w:pos="11908"/>
+          <w:tab w:val="left" w:pos="12824"/>
+          <w:tab w:val="left" w:pos="13740"/>
+          <w:tab w:val="left" w:pos="14656"/>
+        </w:tabs>
+        <w:spacing w:after="0" w:line="240" w:lineRule="auto"/>
+        <w:rPr>
+          <w:rFonts w:ascii="Courier New" w:eastAsia="Times New Roman" w:hAnsi="Courier New" w:cs="Courier New"/>
+          <w:sz w:val="20"/>
+          <w:szCs w:val="20"/>
+          <w:lang w:eastAsia="en-IN"/>
+        </w:rPr>
+      </w:pPr>
+      <w:r>
+        <w:rPr>
+          <w:rFonts w:ascii="Courier New" w:eastAsia="Times New Roman" w:hAnsi="Courier New" w:cs="Courier New"/>
+          <w:sz w:val="20"/>
+          <w:szCs w:val="20"/>
+          <w:lang w:eastAsia="en-IN"/>
+        </w:rPr>
+        <w:t xml:space="preserve">    </w:t>
+      </w:r>
+      <w:proofErr w:type="gramStart"/>
+      <w:r>
+        <w:rPr>
+          <w:rFonts w:ascii="Courier New" w:eastAsia="Times New Roman" w:hAnsi="Courier New" w:cs="Courier New"/>
+          <w:sz w:val="20"/>
+          <w:szCs w:val="20"/>
+          <w:lang w:eastAsia="en-IN"/>
+        </w:rPr>
+        <w:t>margin:</w:t>
+      </w:r>
+      <w:proofErr w:type="gramEnd"/>
+      <w:r>
+        <w:rPr>
+          <w:rFonts w:ascii="Courier New" w:eastAsia="Times New Roman" w:hAnsi="Courier New" w:cs="Courier New"/>
+          <w:sz w:val="20"/>
+          <w:szCs w:val="20"/>
+          <w:lang w:eastAsia="en-IN"/>
+        </w:rPr>
+        <w:t>16px 15px 17px;</w:t>
+      </w:r>
+    </w:p>
+    <w:p>
+      <w:pPr>
+        <w:tabs>
+          <w:tab w:val="left" w:pos="916"/>
+          <w:tab w:val="left" w:pos="1832"/>
+          <w:tab w:val="left" w:pos="2748"/>
+          <w:tab w:val="left" w:pos="3664"/>
+          <w:tab w:val="left" w:pos="4580"/>
+          <w:tab w:val="left" w:pos="5496"/>
+          <w:tab w:val="left" w:pos="6412"/>
+          <w:tab w:val="left" w:pos="7328"/>
+          <w:tab w:val="left" w:pos="8244"/>
+          <w:tab w:val="left" w:pos="9160"/>
+          <w:tab w:val="left" w:pos="10076"/>
+          <w:tab w:val="left" w:pos="10992"/>
+          <w:tab w:val="left" w:pos="11908"/>
+          <w:tab w:val="left" w:pos="12824"/>
+          <w:tab w:val="left" w:pos="13740"/>
+          <w:tab w:val="left" w:pos="14656"/>
+        </w:tabs>
+        <w:spacing w:after="0" w:line="240" w:lineRule="auto"/>
+        <w:rPr>
+          <w:rFonts w:ascii="Courier New" w:eastAsia="Times New Roman" w:hAnsi="Courier New" w:cs="Courier New"/>
+          <w:sz w:val="20"/>
+          <w:szCs w:val="20"/>
+          <w:lang w:eastAsia="en-IN"/>
+        </w:rPr>
+      </w:pPr>
+      <w:r>
+        <w:rPr>
+          <w:rFonts w:ascii="Courier New" w:eastAsia="Times New Roman" w:hAnsi="Courier New" w:cs="Courier New"/>
+          <w:sz w:val="20"/>
+          <w:szCs w:val="20"/>
+          <w:lang w:eastAsia="en-IN"/>
+        </w:rPr>
+        <w:t xml:space="preserve">    </w:t>
+      </w:r>
+      <w:proofErr w:type="spellStart"/>
+      <w:proofErr w:type="gramStart"/>
+      <w:r>
+        <w:rPr>
+          <w:rFonts w:ascii="Courier New" w:eastAsia="Times New Roman" w:hAnsi="Courier New" w:cs="Courier New"/>
+          <w:sz w:val="20"/>
+          <w:szCs w:val="20"/>
+          <w:lang w:eastAsia="en-IN"/>
+        </w:rPr>
+        <w:t>box-sizing:</w:t>
+      </w:r>
+      <w:proofErr w:type="gramEnd"/>
+      <w:r>
+        <w:rPr>
+          <w:rFonts w:ascii="Courier New" w:eastAsia="Times New Roman" w:hAnsi="Courier New" w:cs="Courier New"/>
+          <w:sz w:val="20"/>
+          <w:szCs w:val="20"/>
+          <w:lang w:eastAsia="en-IN"/>
+        </w:rPr>
+        <w:t>content-box</w:t>
+      </w:r>
+      <w:proofErr w:type="spellEnd"/>
+      <w:r>
+        <w:rPr>
+          <w:rFonts w:ascii="Courier New" w:eastAsia="Times New Roman" w:hAnsi="Courier New" w:cs="Courier New"/>
+          <w:sz w:val="20"/>
+          <w:szCs w:val="20"/>
+          <w:lang w:eastAsia="en-IN"/>
+        </w:rPr>
+        <w:t>;</w:t>
+      </w:r>
+    </w:p>
+    <w:p>
+      <w:pPr>
+        <w:tabs>
+          <w:tab w:val="left" w:pos="916"/>
+          <w:tab w:val="left" w:pos="1832"/>
+          <w:tab w:val="left" w:pos="2748"/>
+          <w:tab w:val="left" w:pos="3664"/>
+          <w:tab w:val="left" w:pos="4580"/>
+          <w:tab w:val="left" w:pos="5496"/>
+          <w:tab w:val="left" w:pos="6412"/>
+          <w:tab w:val="left" w:pos="7328"/>
+          <w:tab w:val="left" w:pos="8244"/>
+          <w:tab w:val="left" w:pos="9160"/>
+          <w:tab w:val="left" w:pos="10076"/>
+          <w:tab w:val="left" w:pos="10992"/>
+          <w:tab w:val="left" w:pos="11908"/>
+          <w:tab w:val="left" w:pos="12824"/>
+          <w:tab w:val="left" w:pos="13740"/>
+          <w:tab w:val="left" w:pos="14656"/>
+        </w:tabs>
+        <w:spacing w:after="0" w:line="240" w:lineRule="auto"/>
+        <w:rPr>
+          <w:rFonts w:ascii="Courier New" w:eastAsia="Times New Roman" w:hAnsi="Courier New" w:cs="Courier New"/>
+          <w:sz w:val="20"/>
+          <w:szCs w:val="20"/>
+          <w:lang w:eastAsia="en-IN"/>
+        </w:rPr>
+      </w:pPr>
+      <w:r>
+        <w:rPr>
+          <w:rFonts w:ascii="Courier New" w:eastAsia="Times New Roman" w:hAnsi="Courier New" w:cs="Courier New"/>
+          <w:sz w:val="20"/>
+          <w:szCs w:val="20"/>
+          <w:lang w:eastAsia="en-IN"/>
+        </w:rPr>
+        <w:t xml:space="preserve">    </w:t>
+      </w:r>
+      <w:proofErr w:type="gramStart"/>
+      <w:r>
+        <w:rPr>
+          <w:rFonts w:ascii="Courier New" w:eastAsia="Times New Roman" w:hAnsi="Courier New" w:cs="Courier New"/>
+          <w:sz w:val="20"/>
+          <w:szCs w:val="20"/>
+          <w:lang w:eastAsia="en-IN"/>
+        </w:rPr>
+        <w:t>border:</w:t>
+      </w:r>
+      <w:proofErr w:type="gramEnd"/>
+      <w:r>
+        <w:rPr>
+          <w:rFonts w:ascii="Courier New" w:eastAsia="Times New Roman" w:hAnsi="Courier New" w:cs="Courier New"/>
+          <w:sz w:val="20"/>
+          <w:szCs w:val="20"/>
+          <w:lang w:eastAsia="en-IN"/>
+        </w:rPr>
+        <w:t>5px solid blue;</w:t>
+      </w:r>
+    </w:p>
+    <w:p>
+      <w:pPr>
+        <w:tabs>
+          <w:tab w:val="left" w:pos="916"/>
+          <w:tab w:val="left" w:pos="1832"/>
+          <w:tab w:val="left" w:pos="2748"/>
+          <w:tab w:val="left" w:pos="3664"/>
+          <w:tab w:val="left" w:pos="4580"/>
+          <w:tab w:val="left" w:pos="5496"/>
+          <w:tab w:val="left" w:pos="6412"/>
+          <w:tab w:val="left" w:pos="7328"/>
+          <w:tab w:val="left" w:pos="8244"/>
+          <w:tab w:val="left" w:pos="9160"/>
+          <w:tab w:val="left" w:pos="10076"/>
+          <w:tab w:val="left" w:pos="10992"/>
+          <w:tab w:val="left" w:pos="11908"/>
+          <w:tab w:val="left" w:pos="12824"/>
+          <w:tab w:val="left" w:pos="13740"/>
+          <w:tab w:val="left" w:pos="14656"/>
+        </w:tabs>
+        <w:spacing w:after="0" w:line="240" w:lineRule="auto"/>
+        <w:rPr>
+          <w:rFonts w:ascii="Courier New" w:eastAsia="Times New Roman" w:hAnsi="Courier New" w:cs="Courier New"/>
+          <w:sz w:val="20"/>
+          <w:szCs w:val="20"/>
+          <w:lang w:eastAsia="en-IN"/>
+        </w:rPr>
+      </w:pPr>
+      <w:r>
+        <w:rPr>
+          <w:rFonts w:ascii="Courier New" w:eastAsia="Times New Roman" w:hAnsi="Courier New" w:cs="Courier New"/>
+          <w:sz w:val="20"/>
+          <w:szCs w:val="20"/>
+          <w:lang w:eastAsia="en-IN"/>
+        </w:rPr>
+        <w:t>}</w:t>
+      </w:r>
+    </w:p>
+    <w:p>
+      <w:pPr>
+        <w:spacing w:before="100" w:beforeAutospacing="1" w:after="100" w:afterAutospacing="1" w:line="240" w:lineRule="auto"/>
+        <w:rPr>
+          <w:rFonts w:ascii="Times New Roman" w:eastAsia="Times New Roman" w:hAnsi="Times New Roman" w:cs="Times New Roman"/>
+          <w:sz w:val="24"/>
+          <w:szCs w:val="24"/>
+          <w:lang w:eastAsia="en-IN"/>
+        </w:rPr>
+      </w:pPr>
+      <w:r>
+        <w:rPr>
+          <w:rFonts w:ascii="Times New Roman" w:eastAsia="Times New Roman" w:hAnsi="Times New Roman" w:cs="Times New Roman"/>
+          <w:sz w:val="24"/>
+          <w:szCs w:val="24"/>
+          <w:lang w:eastAsia="en-IN"/>
+        </w:rPr>
+        <w:t>Notice</w:t>
+      </w:r>
+    </w:p>
+    <w:p>
+      <w:pPr>
+        <w:tabs>
+          <w:tab w:val="left" w:pos="916"/>
+          <w:tab w:val="left" w:pos="1832"/>
+          <w:tab w:val="left" w:pos="2748"/>
+          <w:tab w:val="left" w:pos="3664"/>
+          <w:tab w:val="left" w:pos="4580"/>
+          <w:tab w:val="left" w:pos="5496"/>
+          <w:tab w:val="left" w:pos="6412"/>
+          <w:tab w:val="left" w:pos="7328"/>
+          <w:tab w:val="left" w:pos="8244"/>
+          <w:tab w:val="left" w:pos="9160"/>
+          <w:tab w:val="left" w:pos="10076"/>
+          <w:tab w:val="left" w:pos="10992"/>
+          <w:tab w:val="left" w:pos="11908"/>
+          <w:tab w:val="left" w:pos="12824"/>
+          <w:tab w:val="left" w:pos="13740"/>
+          <w:tab w:val="left" w:pos="14656"/>
+        </w:tabs>
+        <w:spacing w:after="0" w:line="240" w:lineRule="auto"/>
+        <w:rPr>
+          <w:rFonts w:ascii="Courier New" w:eastAsia="Times New Roman" w:hAnsi="Courier New" w:cs="Courier New"/>
+          <w:sz w:val="20"/>
+          <w:szCs w:val="20"/>
+          <w:lang w:eastAsia="en-IN"/>
+        </w:rPr>
+      </w:pPr>
+      <w:proofErr w:type="gramStart"/>
+      <w:r>
+        <w:rPr>
+          <w:rFonts w:ascii="Courier New" w:eastAsia="Times New Roman" w:hAnsi="Courier New" w:cs="Courier New"/>
+          <w:sz w:val="20"/>
+          <w:szCs w:val="20"/>
+          <w:lang w:eastAsia="en-IN"/>
+        </w:rPr>
+        <w:t>width</w:t>
+      </w:r>
+      <w:proofErr w:type="gramEnd"/>
+    </w:p>
+    <w:p>
+      <w:pPr>
+        <w:tabs>
+          <w:tab w:val="left" w:pos="916"/>
+          <w:tab w:val="left" w:pos="1832"/>
+          <w:tab w:val="left" w:pos="2748"/>
+          <w:tab w:val="left" w:pos="3664"/>
+          <w:tab w:val="left" w:pos="4580"/>
+          <w:tab w:val="left" w:pos="5496"/>
+          <w:tab w:val="left" w:pos="6412"/>
+          <w:tab w:val="left" w:pos="7328"/>
+          <w:tab w:val="left" w:pos="8244"/>
+          <w:tab w:val="left" w:pos="9160"/>
+          <w:tab w:val="left" w:pos="10076"/>
+          <w:tab w:val="left" w:pos="10992"/>
+          <w:tab w:val="left" w:pos="11908"/>
+          <w:tab w:val="left" w:pos="12824"/>
+          <w:tab w:val="left" w:pos="13740"/>
+          <w:tab w:val="left" w:pos="14656"/>
+        </w:tabs>
+        <w:spacing w:after="0" w:line="240" w:lineRule="auto"/>
+        <w:rPr>
+          <w:rFonts w:ascii="Courier New" w:eastAsia="Times New Roman" w:hAnsi="Courier New" w:cs="Courier New"/>
+          <w:sz w:val="20"/>
+          <w:szCs w:val="20"/>
+          <w:lang w:eastAsia="en-IN"/>
+        </w:rPr>
+      </w:pPr>
+    </w:p>
+    <w:p>
+      <w:pPr>
+        <w:tabs>
+          <w:tab w:val="left" w:pos="916"/>
+          <w:tab w:val="left" w:pos="1832"/>
+          <w:tab w:val="left" w:pos="2748"/>
+          <w:tab w:val="left" w:pos="3664"/>
+          <w:tab w:val="left" w:pos="4580"/>
+          <w:tab w:val="left" w:pos="5496"/>
+          <w:tab w:val="left" w:pos="6412"/>
+          <w:tab w:val="left" w:pos="7328"/>
+          <w:tab w:val="left" w:pos="8244"/>
+          <w:tab w:val="left" w:pos="9160"/>
+          <w:tab w:val="left" w:pos="10076"/>
+          <w:tab w:val="left" w:pos="10992"/>
+          <w:tab w:val="left" w:pos="11908"/>
+          <w:tab w:val="left" w:pos="12824"/>
+          <w:tab w:val="left" w:pos="13740"/>
+          <w:tab w:val="left" w:pos="14656"/>
+        </w:tabs>
+        <w:spacing w:after="0" w:line="240" w:lineRule="auto"/>
+        <w:rPr>
+          <w:rFonts w:ascii="Courier New" w:eastAsia="Times New Roman" w:hAnsi="Courier New" w:cs="Courier New"/>
+          <w:sz w:val="20"/>
+          <w:szCs w:val="20"/>
+          <w:lang w:eastAsia="en-IN"/>
+        </w:rPr>
+      </w:pPr>
+      <w:proofErr w:type="gramStart"/>
+      <w:r>
+        <w:rPr>
+          <w:rFonts w:ascii="Courier New" w:eastAsia="Times New Roman" w:hAnsi="Courier New" w:cs="Courier New"/>
+          <w:sz w:val="20"/>
+          <w:szCs w:val="20"/>
+          <w:lang w:eastAsia="en-IN"/>
+        </w:rPr>
+        <w:t>padding</w:t>
+      </w:r>
+      <w:proofErr w:type="gramEnd"/>
+    </w:p>
+    <w:p>
+      <w:pPr>
+        <w:tabs>
+          <w:tab w:val="left" w:pos="916"/>
+          <w:tab w:val="left" w:pos="1832"/>
+          <w:tab w:val="left" w:pos="2748"/>
+          <w:tab w:val="left" w:pos="3664"/>
+          <w:tab w:val="left" w:pos="4580"/>
+          <w:tab w:val="left" w:pos="5496"/>
+          <w:tab w:val="left" w:pos="6412"/>
+          <w:tab w:val="left" w:pos="7328"/>
+          <w:tab w:val="left" w:pos="8244"/>
+          <w:tab w:val="left" w:pos="9160"/>
+          <w:tab w:val="left" w:pos="10076"/>
+          <w:tab w:val="left" w:pos="10992"/>
+          <w:tab w:val="left" w:pos="11908"/>
+          <w:tab w:val="left" w:pos="12824"/>
+          <w:tab w:val="left" w:pos="13740"/>
+          <w:tab w:val="left" w:pos="14656"/>
+        </w:tabs>
+        <w:spacing w:after="0" w:line="240" w:lineRule="auto"/>
+        <w:rPr>
+          <w:rFonts w:ascii="Courier New" w:eastAsia="Times New Roman" w:hAnsi="Courier New" w:cs="Courier New"/>
+          <w:sz w:val="20"/>
+          <w:szCs w:val="20"/>
+          <w:lang w:eastAsia="en-IN"/>
+        </w:rPr>
+      </w:pPr>
+    </w:p>
+    <w:p>
+      <w:pPr>
+        <w:tabs>
+          <w:tab w:val="left" w:pos="916"/>
+          <w:tab w:val="left" w:pos="1832"/>
+          <w:tab w:val="left" w:pos="2748"/>
+          <w:tab w:val="left" w:pos="3664"/>
+          <w:tab w:val="left" w:pos="4580"/>
+          <w:tab w:val="left" w:pos="5496"/>
+          <w:tab w:val="left" w:pos="6412"/>
+          <w:tab w:val="left" w:pos="7328"/>
+          <w:tab w:val="left" w:pos="8244"/>
+          <w:tab w:val="left" w:pos="9160"/>
+          <w:tab w:val="left" w:pos="10076"/>
+          <w:tab w:val="left" w:pos="10992"/>
+          <w:tab w:val="left" w:pos="11908"/>
+          <w:tab w:val="left" w:pos="12824"/>
+          <w:tab w:val="left" w:pos="13740"/>
+          <w:tab w:val="left" w:pos="14656"/>
+        </w:tabs>
+        <w:spacing w:after="0" w:line="240" w:lineRule="auto"/>
+        <w:rPr>
+          <w:rFonts w:ascii="Courier New" w:eastAsia="Times New Roman" w:hAnsi="Courier New" w:cs="Courier New"/>
+          <w:sz w:val="20"/>
+          <w:szCs w:val="20"/>
+          <w:lang w:eastAsia="en-IN"/>
+        </w:rPr>
+      </w:pPr>
+      <w:proofErr w:type="gramStart"/>
+      <w:r>
+        <w:rPr>
+          <w:rFonts w:ascii="Courier New" w:eastAsia="Times New Roman" w:hAnsi="Courier New" w:cs="Courier New"/>
+          <w:sz w:val="20"/>
+          <w:szCs w:val="20"/>
+          <w:lang w:eastAsia="en-IN"/>
+        </w:rPr>
+        <w:t>margin</w:t>
+      </w:r>
+      <w:proofErr w:type="gramEnd"/>
+    </w:p>
+    <w:p>
+      <w:pPr>
+        <w:tabs>
+          <w:tab w:val="left" w:pos="916"/>
+          <w:tab w:val="left" w:pos="1832"/>
+          <w:tab w:val="left" w:pos="2748"/>
+          <w:tab w:val="left" w:pos="3664"/>
+          <w:tab w:val="left" w:pos="4580"/>
+          <w:tab w:val="left" w:pos="5496"/>
+          <w:tab w:val="left" w:pos="6412"/>
+          <w:tab w:val="left" w:pos="7328"/>
+          <w:tab w:val="left" w:pos="8244"/>
+          <w:tab w:val="left" w:pos="9160"/>
+          <w:tab w:val="left" w:pos="10076"/>
+          <w:tab w:val="left" w:pos="10992"/>
+          <w:tab w:val="left" w:pos="11908"/>
+          <w:tab w:val="left" w:pos="12824"/>
+          <w:tab w:val="left" w:pos="13740"/>
+          <w:tab w:val="left" w:pos="14656"/>
+        </w:tabs>
+        <w:spacing w:after="0" w:line="240" w:lineRule="auto"/>
+        <w:rPr>
+          <w:rFonts w:ascii="Courier New" w:eastAsia="Times New Roman" w:hAnsi="Courier New" w:cs="Courier New"/>
+          <w:sz w:val="20"/>
+          <w:szCs w:val="20"/>
+          <w:lang w:eastAsia="en-IN"/>
+        </w:rPr>
+      </w:pPr>
+    </w:p>
+    <w:p>
+      <w:pPr>
+        <w:tabs>
+          <w:tab w:val="left" w:pos="916"/>
+          <w:tab w:val="left" w:pos="1832"/>
+          <w:tab w:val="left" w:pos="2748"/>
+          <w:tab w:val="left" w:pos="3664"/>
+          <w:tab w:val="left" w:pos="4580"/>
+          <w:tab w:val="left" w:pos="5496"/>
+          <w:tab w:val="left" w:pos="6412"/>
+          <w:tab w:val="left" w:pos="7328"/>
+          <w:tab w:val="left" w:pos="8244"/>
+          <w:tab w:val="left" w:pos="9160"/>
+          <w:tab w:val="left" w:pos="10076"/>
+          <w:tab w:val="left" w:pos="10992"/>
+          <w:tab w:val="left" w:pos="11908"/>
+          <w:tab w:val="left" w:pos="12824"/>
+          <w:tab w:val="left" w:pos="13740"/>
+          <w:tab w:val="left" w:pos="14656"/>
+        </w:tabs>
+        <w:spacing w:after="0" w:line="240" w:lineRule="auto"/>
+        <w:rPr>
+          <w:rFonts w:ascii="Courier New" w:eastAsia="Times New Roman" w:hAnsi="Courier New" w:cs="Courier New"/>
+          <w:sz w:val="20"/>
+          <w:szCs w:val="20"/>
+          <w:lang w:eastAsia="en-IN"/>
+        </w:rPr>
+      </w:pPr>
+      <w:proofErr w:type="gramStart"/>
+      <w:r>
+        <w:rPr>
+          <w:rFonts w:ascii="Courier New" w:eastAsia="Times New Roman" w:hAnsi="Courier New" w:cs="Courier New"/>
+          <w:sz w:val="20"/>
+          <w:szCs w:val="20"/>
+          <w:lang w:eastAsia="en-IN"/>
+        </w:rPr>
+        <w:t>box-sizing</w:t>
+      </w:r>
+      <w:proofErr w:type="gramEnd"/>
+    </w:p>
+    <w:p>
+      <w:pPr>
+        <w:spacing w:before="100" w:beforeAutospacing="1" w:after="100" w:afterAutospacing="1" w:line="240" w:lineRule="auto"/>
+        <w:rPr>
+          <w:rFonts w:ascii="Times New Roman" w:eastAsia="Times New Roman" w:hAnsi="Times New Roman" w:cs="Times New Roman"/>
+          <w:sz w:val="24"/>
+          <w:szCs w:val="24"/>
+          <w:lang w:eastAsia="en-IN"/>
+        </w:rPr>
+      </w:pPr>
+      <w:proofErr w:type="gramStart"/>
+      <w:r>
+        <w:rPr>
+          <w:rFonts w:ascii="Times New Roman" w:eastAsia="Times New Roman" w:hAnsi="Times New Roman" w:cs="Times New Roman"/>
+          <w:sz w:val="24"/>
+          <w:szCs w:val="24"/>
+          <w:lang w:eastAsia="en-IN"/>
+        </w:rPr>
+        <w:t>are</w:t>
+      </w:r>
+      <w:proofErr w:type="gramEnd"/>
+      <w:r>
+        <w:rPr>
+          <w:rFonts w:ascii="Times New Roman" w:eastAsia="Times New Roman" w:hAnsi="Times New Roman" w:cs="Times New Roman"/>
+          <w:sz w:val="24"/>
+          <w:szCs w:val="24"/>
+          <w:lang w:eastAsia="en-IN"/>
+        </w:rPr>
+        <w:t xml:space="preserve"> repeated </w:t>
+      </w:r>
+      <w:r>
+        <w:rPr>
+          <w:rFonts w:ascii="Times New Roman" w:eastAsia="Times New Roman" w:hAnsi="Times New Roman" w:cs="Times New Roman"/>
+          <w:b/>
+          <w:bCs/>
+          <w:sz w:val="24"/>
+          <w:szCs w:val="24"/>
+          <w:lang w:eastAsia="en-IN"/>
+        </w:rPr>
+        <w:t>3 times</w:t>
+      </w:r>
+      <w:r>
+        <w:rPr>
+          <w:rFonts w:ascii="Times New Roman" w:eastAsia="Times New Roman" w:hAnsi="Times New Roman" w:cs="Times New Roman"/>
+          <w:sz w:val="24"/>
+          <w:szCs w:val="24"/>
+          <w:lang w:eastAsia="en-IN"/>
+        </w:rPr>
+        <w:t>.</w:t>
+      </w:r>
+    </w:p>
+    <w:p>
+      <w:pPr>
+        <w:spacing w:before="100" w:beforeAutospacing="1" w:after="100" w:afterAutospacing="1" w:line="240" w:lineRule="auto"/>
+        <w:rPr>
+          <w:rFonts w:ascii="Times New Roman" w:eastAsia="Times New Roman" w:hAnsi="Times New Roman" w:cs="Times New Roman"/>
+          <w:sz w:val="24"/>
+          <w:szCs w:val="24"/>
+          <w:lang w:eastAsia="en-IN"/>
+        </w:rPr>
+      </w:pPr>
+      <w:r>
+        <w:rPr>
+          <w:rFonts w:ascii="Times New Roman" w:eastAsia="Times New Roman" w:hAnsi="Times New Roman" w:cs="Times New Roman"/>
+          <w:sz w:val="24"/>
+          <w:szCs w:val="24"/>
+          <w:lang w:eastAsia="en-IN"/>
+        </w:rPr>
+        <w:t>That is bad coding.</w:t>
+      </w:r>
+    </w:p>
+    <w:p>
+      <w:pPr>
+        <w:spacing w:after="0" w:line="240" w:lineRule="auto"/>
+        <w:rPr>
+          <w:rFonts w:ascii="Times New Roman" w:eastAsia="Times New Roman" w:hAnsi="Times New Roman" w:cs="Times New Roman"/>
+          <w:sz w:val="24"/>
+          <w:szCs w:val="24"/>
+          <w:lang w:eastAsia="en-IN"/>
+        </w:rPr>
+      </w:pPr>
+      <w:r>
+        <w:rPr>
+          <w:rFonts w:ascii="Times New Roman" w:eastAsia="Times New Roman" w:hAnsi="Times New Roman" w:cs="Times New Roman"/>
+          <w:sz w:val="24"/>
+          <w:szCs w:val="24"/>
+          <w:lang w:eastAsia="en-IN"/>
+        </w:rPr>
+        <w:pict>
+          <v:rect id="_x0000_i1045" style="width:0;height:1.5pt" o:hralign="center" o:hrstd="t" o:hr="t" fillcolor="#a0a0a0" stroked="f"/>
+        </w:pict>
+      </w:r>
+    </w:p>
+    <w:p>
+      <w:pPr>
+        <w:spacing w:before="100" w:beforeAutospacing="1" w:after="100" w:afterAutospacing="1" w:line="240" w:lineRule="auto"/>
+        <w:outlineLvl w:val="0"/>
+        <w:rPr>
+          <w:rFonts w:ascii="Times New Roman" w:eastAsia="Times New Roman" w:hAnsi="Times New Roman" w:cs="Times New Roman"/>
+          <w:b/>
+          <w:bCs/>
+          <w:kern w:val="36"/>
+          <w:sz w:val="48"/>
+          <w:szCs w:val="48"/>
+          <w:lang w:eastAsia="en-IN"/>
+        </w:rPr>
+      </w:pPr>
+      <w:r>
+        <w:rPr>
+          <w:rFonts w:ascii="Times New Roman" w:eastAsia="Times New Roman" w:hAnsi="Times New Roman" w:cs="Times New Roman"/>
+          <w:b/>
+          <w:bCs/>
+          <w:kern w:val="36"/>
+          <w:sz w:val="48"/>
+          <w:szCs w:val="48"/>
+          <w:lang w:eastAsia="en-IN"/>
+        </w:rPr>
+        <w:t>Better way</w:t>
+      </w:r>
+    </w:p>
+    <w:p>
+      <w:pPr>
+        <w:spacing w:before="100" w:beforeAutospacing="1" w:after="100" w:afterAutospacing="1" w:line="240" w:lineRule="auto"/>
+        <w:rPr>
+          <w:rFonts w:ascii="Times New Roman" w:eastAsia="Times New Roman" w:hAnsi="Times New Roman" w:cs="Times New Roman"/>
+          <w:sz w:val="24"/>
+          <w:szCs w:val="24"/>
+          <w:lang w:eastAsia="en-IN"/>
+        </w:rPr>
+      </w:pPr>
+      <w:r>
+        <w:rPr>
+          <w:rFonts w:ascii="Times New Roman" w:eastAsia="Times New Roman" w:hAnsi="Times New Roman" w:cs="Times New Roman"/>
+          <w:sz w:val="24"/>
+          <w:szCs w:val="24"/>
+          <w:lang w:eastAsia="en-IN"/>
+        </w:rPr>
+        <w:t>Create one common class.</w:t>
+      </w:r>
+    </w:p>
+    <w:p>
+      <w:pPr>
+        <w:tabs>
+          <w:tab w:val="left" w:pos="916"/>
+          <w:tab w:val="left" w:pos="1832"/>
+          <w:tab w:val="left" w:pos="2748"/>
+          <w:tab w:val="left" w:pos="3664"/>
+          <w:tab w:val="left" w:pos="4580"/>
+          <w:tab w:val="left" w:pos="5496"/>
+          <w:tab w:val="left" w:pos="6412"/>
+          <w:tab w:val="left" w:pos="7328"/>
+          <w:tab w:val="left" w:pos="8244"/>
+          <w:tab w:val="left" w:pos="9160"/>
+          <w:tab w:val="left" w:pos="10076"/>
+          <w:tab w:val="left" w:pos="10992"/>
+          <w:tab w:val="left" w:pos="11908"/>
+          <w:tab w:val="left" w:pos="12824"/>
+          <w:tab w:val="left" w:pos="13740"/>
+          <w:tab w:val="left" w:pos="14656"/>
+        </w:tabs>
+        <w:spacing w:after="0" w:line="240" w:lineRule="auto"/>
+        <w:rPr>
+          <w:rFonts w:ascii="Courier New" w:eastAsia="Times New Roman" w:hAnsi="Courier New" w:cs="Courier New"/>
+          <w:sz w:val="20"/>
+          <w:szCs w:val="20"/>
+          <w:lang w:eastAsia="en-IN"/>
+        </w:rPr>
+      </w:pPr>
+      <w:r>
+        <w:rPr>
+          <w:rFonts w:ascii="Courier New" w:eastAsia="Times New Roman" w:hAnsi="Courier New" w:cs="Courier New"/>
+          <w:sz w:val="20"/>
+          <w:szCs w:val="20"/>
+          <w:lang w:eastAsia="en-IN"/>
+        </w:rPr>
+        <w:t>.</w:t>
+      </w:r>
+      <w:proofErr w:type="gramStart"/>
+      <w:r>
+        <w:rPr>
+          <w:rFonts w:ascii="Courier New" w:eastAsia="Times New Roman" w:hAnsi="Courier New" w:cs="Courier New"/>
+          <w:sz w:val="20"/>
+          <w:szCs w:val="20"/>
+          <w:lang w:eastAsia="en-IN"/>
+        </w:rPr>
+        <w:t>box{</w:t>
+      </w:r>
+      <w:proofErr w:type="gramEnd"/>
+    </w:p>
+    <w:p>
+      <w:pPr>
+        <w:tabs>
+          <w:tab w:val="left" w:pos="916"/>
+          <w:tab w:val="left" w:pos="1832"/>
+          <w:tab w:val="left" w:pos="2748"/>
+          <w:tab w:val="left" w:pos="3664"/>
+          <w:tab w:val="left" w:pos="4580"/>
+          <w:tab w:val="left" w:pos="5496"/>
+          <w:tab w:val="left" w:pos="6412"/>
+          <w:tab w:val="left" w:pos="7328"/>
+          <w:tab w:val="left" w:pos="8244"/>
+          <w:tab w:val="left" w:pos="9160"/>
+          <w:tab w:val="left" w:pos="10076"/>
+          <w:tab w:val="left" w:pos="10992"/>
+          <w:tab w:val="left" w:pos="11908"/>
+          <w:tab w:val="left" w:pos="12824"/>
+          <w:tab w:val="left" w:pos="13740"/>
+          <w:tab w:val="left" w:pos="14656"/>
+        </w:tabs>
+        <w:spacing w:after="0" w:line="240" w:lineRule="auto"/>
+        <w:rPr>
+          <w:rFonts w:ascii="Courier New" w:eastAsia="Times New Roman" w:hAnsi="Courier New" w:cs="Courier New"/>
+          <w:sz w:val="20"/>
+          <w:szCs w:val="20"/>
+          <w:lang w:eastAsia="en-IN"/>
+        </w:rPr>
+      </w:pPr>
+    </w:p>
+    <w:p>
+      <w:pPr>
+        <w:tabs>
+          <w:tab w:val="left" w:pos="916"/>
+          <w:tab w:val="left" w:pos="1832"/>
+          <w:tab w:val="left" w:pos="2748"/>
+          <w:tab w:val="left" w:pos="3664"/>
+          <w:tab w:val="left" w:pos="4580"/>
+          <w:tab w:val="left" w:pos="5496"/>
+          <w:tab w:val="left" w:pos="6412"/>
+          <w:tab w:val="left" w:pos="7328"/>
+          <w:tab w:val="left" w:pos="8244"/>
+          <w:tab w:val="left" w:pos="9160"/>
+          <w:tab w:val="left" w:pos="10076"/>
+          <w:tab w:val="left" w:pos="10992"/>
+          <w:tab w:val="left" w:pos="11908"/>
+          <w:tab w:val="left" w:pos="12824"/>
+          <w:tab w:val="left" w:pos="13740"/>
+          <w:tab w:val="left" w:pos="14656"/>
+        </w:tabs>
+        <w:spacing w:after="0" w:line="240" w:lineRule="auto"/>
+        <w:rPr>
+          <w:rFonts w:ascii="Courier New" w:eastAsia="Times New Roman" w:hAnsi="Courier New" w:cs="Courier New"/>
+          <w:sz w:val="20"/>
+          <w:szCs w:val="20"/>
+          <w:lang w:eastAsia="en-IN"/>
+        </w:rPr>
+      </w:pPr>
+      <w:proofErr w:type="gramStart"/>
+      <w:r>
+        <w:rPr>
+          <w:rFonts w:ascii="Courier New" w:eastAsia="Times New Roman" w:hAnsi="Courier New" w:cs="Courier New"/>
+          <w:sz w:val="20"/>
+          <w:szCs w:val="20"/>
+          <w:lang w:eastAsia="en-IN"/>
+        </w:rPr>
+        <w:t>width:</w:t>
+      </w:r>
+      <w:proofErr w:type="gramEnd"/>
+      <w:r>
+        <w:rPr>
+          <w:rFonts w:ascii="Courier New" w:eastAsia="Times New Roman" w:hAnsi="Courier New" w:cs="Courier New"/>
+          <w:sz w:val="20"/>
+          <w:szCs w:val="20"/>
+          <w:lang w:eastAsia="en-IN"/>
+        </w:rPr>
+        <w:t>50px;</w:t>
+      </w:r>
+    </w:p>
+    <w:p>
+      <w:pPr>
+        <w:tabs>
+          <w:tab w:val="left" w:pos="916"/>
+          <w:tab w:val="left" w:pos="1832"/>
+          <w:tab w:val="left" w:pos="2748"/>
+          <w:tab w:val="left" w:pos="3664"/>
+          <w:tab w:val="left" w:pos="4580"/>
+          <w:tab w:val="left" w:pos="5496"/>
+          <w:tab w:val="left" w:pos="6412"/>
+          <w:tab w:val="left" w:pos="7328"/>
+          <w:tab w:val="left" w:pos="8244"/>
+          <w:tab w:val="left" w:pos="9160"/>
+          <w:tab w:val="left" w:pos="10076"/>
+          <w:tab w:val="left" w:pos="10992"/>
+          <w:tab w:val="left" w:pos="11908"/>
+          <w:tab w:val="left" w:pos="12824"/>
+          <w:tab w:val="left" w:pos="13740"/>
+          <w:tab w:val="left" w:pos="14656"/>
+        </w:tabs>
+        <w:spacing w:after="0" w:line="240" w:lineRule="auto"/>
+        <w:rPr>
+          <w:rFonts w:ascii="Courier New" w:eastAsia="Times New Roman" w:hAnsi="Courier New" w:cs="Courier New"/>
+          <w:sz w:val="20"/>
+          <w:szCs w:val="20"/>
+          <w:lang w:eastAsia="en-IN"/>
+        </w:rPr>
+      </w:pPr>
+    </w:p>
+    <w:p>
+      <w:pPr>
+        <w:tabs>
+          <w:tab w:val="left" w:pos="916"/>
+          <w:tab w:val="left" w:pos="1832"/>
+          <w:tab w:val="left" w:pos="2748"/>
+          <w:tab w:val="left" w:pos="3664"/>
+          <w:tab w:val="left" w:pos="4580"/>
+          <w:tab w:val="left" w:pos="5496"/>
+          <w:tab w:val="left" w:pos="6412"/>
+          <w:tab w:val="left" w:pos="7328"/>
+          <w:tab w:val="left" w:pos="8244"/>
+          <w:tab w:val="left" w:pos="9160"/>
+          <w:tab w:val="left" w:pos="10076"/>
+          <w:tab w:val="left" w:pos="10992"/>
+          <w:tab w:val="left" w:pos="11908"/>
+          <w:tab w:val="left" w:pos="12824"/>
+          <w:tab w:val="left" w:pos="13740"/>
+          <w:tab w:val="left" w:pos="14656"/>
+        </w:tabs>
+        <w:spacing w:after="0" w:line="240" w:lineRule="auto"/>
+        <w:rPr>
+          <w:rFonts w:ascii="Courier New" w:eastAsia="Times New Roman" w:hAnsi="Courier New" w:cs="Courier New"/>
+          <w:sz w:val="20"/>
+          <w:szCs w:val="20"/>
+          <w:lang w:eastAsia="en-IN"/>
+        </w:rPr>
+      </w:pPr>
+      <w:proofErr w:type="gramStart"/>
+      <w:r>
+        <w:rPr>
+          <w:rFonts w:ascii="Courier New" w:eastAsia="Times New Roman" w:hAnsi="Courier New" w:cs="Courier New"/>
+          <w:sz w:val="20"/>
+          <w:szCs w:val="20"/>
+          <w:lang w:eastAsia="en-IN"/>
+        </w:rPr>
+        <w:t>padding:</w:t>
+      </w:r>
+      <w:proofErr w:type="gramEnd"/>
+      <w:r>
+        <w:rPr>
+          <w:rFonts w:ascii="Courier New" w:eastAsia="Times New Roman" w:hAnsi="Courier New" w:cs="Courier New"/>
+          <w:sz w:val="20"/>
+          <w:szCs w:val="20"/>
+          <w:lang w:eastAsia="en-IN"/>
+        </w:rPr>
+        <w:t>6px 7px;</w:t>
+      </w:r>
+    </w:p>
+    <w:p>
+      <w:pPr>
+        <w:tabs>
+          <w:tab w:val="left" w:pos="916"/>
+          <w:tab w:val="left" w:pos="1832"/>
+          <w:tab w:val="left" w:pos="2748"/>
+          <w:tab w:val="left" w:pos="3664"/>
+          <w:tab w:val="left" w:pos="4580"/>
+          <w:tab w:val="left" w:pos="5496"/>
+          <w:tab w:val="left" w:pos="6412"/>
+          <w:tab w:val="left" w:pos="7328"/>
+          <w:tab w:val="left" w:pos="8244"/>
+          <w:tab w:val="left" w:pos="9160"/>
+          <w:tab w:val="left" w:pos="10076"/>
+          <w:tab w:val="left" w:pos="10992"/>
+          <w:tab w:val="left" w:pos="11908"/>
+          <w:tab w:val="left" w:pos="12824"/>
+          <w:tab w:val="left" w:pos="13740"/>
+          <w:tab w:val="left" w:pos="14656"/>
+        </w:tabs>
+        <w:spacing w:after="0" w:line="240" w:lineRule="auto"/>
+        <w:rPr>
+          <w:rFonts w:ascii="Courier New" w:eastAsia="Times New Roman" w:hAnsi="Courier New" w:cs="Courier New"/>
+          <w:sz w:val="20"/>
+          <w:szCs w:val="20"/>
+          <w:lang w:eastAsia="en-IN"/>
+        </w:rPr>
+      </w:pPr>
+    </w:p>
+    <w:p>
+      <w:pPr>
+        <w:tabs>
+          <w:tab w:val="left" w:pos="916"/>
+          <w:tab w:val="left" w:pos="1832"/>
+          <w:tab w:val="left" w:pos="2748"/>
+          <w:tab w:val="left" w:pos="3664"/>
+          <w:tab w:val="left" w:pos="4580"/>
+          <w:tab w:val="left" w:pos="5496"/>
+          <w:tab w:val="left" w:pos="6412"/>
+          <w:tab w:val="left" w:pos="7328"/>
+          <w:tab w:val="left" w:pos="8244"/>
+          <w:tab w:val="left" w:pos="9160"/>
+          <w:tab w:val="left" w:pos="10076"/>
+          <w:tab w:val="left" w:pos="10992"/>
+          <w:tab w:val="left" w:pos="11908"/>
+          <w:tab w:val="left" w:pos="12824"/>
+          <w:tab w:val="left" w:pos="13740"/>
+          <w:tab w:val="left" w:pos="14656"/>
+        </w:tabs>
+        <w:spacing w:after="0" w:line="240" w:lineRule="auto"/>
+        <w:rPr>
+          <w:rFonts w:ascii="Courier New" w:eastAsia="Times New Roman" w:hAnsi="Courier New" w:cs="Courier New"/>
+          <w:sz w:val="20"/>
+          <w:szCs w:val="20"/>
+          <w:lang w:eastAsia="en-IN"/>
+        </w:rPr>
+      </w:pPr>
+      <w:proofErr w:type="gramStart"/>
+      <w:r>
+        <w:rPr>
+          <w:rFonts w:ascii="Courier New" w:eastAsia="Times New Roman" w:hAnsi="Courier New" w:cs="Courier New"/>
+          <w:sz w:val="20"/>
+          <w:szCs w:val="20"/>
+          <w:lang w:eastAsia="en-IN"/>
+        </w:rPr>
+        <w:t>margin:</w:t>
+      </w:r>
+      <w:proofErr w:type="gramEnd"/>
+      <w:r>
+        <w:rPr>
+          <w:rFonts w:ascii="Courier New" w:eastAsia="Times New Roman" w:hAnsi="Courier New" w:cs="Courier New"/>
+          <w:sz w:val="20"/>
+          <w:szCs w:val="20"/>
+          <w:lang w:eastAsia="en-IN"/>
+        </w:rPr>
+        <w:t>16px 15px 17px;</w:t>
+      </w:r>
+    </w:p>
+    <w:p>
+      <w:pPr>
+        <w:tabs>
+          <w:tab w:val="left" w:pos="916"/>
+          <w:tab w:val="left" w:pos="1832"/>
+          <w:tab w:val="left" w:pos="2748"/>
+          <w:tab w:val="left" w:pos="3664"/>
+          <w:tab w:val="left" w:pos="4580"/>
+          <w:tab w:val="left" w:pos="5496"/>
+          <w:tab w:val="left" w:pos="6412"/>
+          <w:tab w:val="left" w:pos="7328"/>
+          <w:tab w:val="left" w:pos="8244"/>
+          <w:tab w:val="left" w:pos="9160"/>
+          <w:tab w:val="left" w:pos="10076"/>
+          <w:tab w:val="left" w:pos="10992"/>
+          <w:tab w:val="left" w:pos="11908"/>
+          <w:tab w:val="left" w:pos="12824"/>
+          <w:tab w:val="left" w:pos="13740"/>
+          <w:tab w:val="left" w:pos="14656"/>
+        </w:tabs>
+        <w:spacing w:after="0" w:line="240" w:lineRule="auto"/>
+        <w:rPr>
+          <w:rFonts w:ascii="Courier New" w:eastAsia="Times New Roman" w:hAnsi="Courier New" w:cs="Courier New"/>
+          <w:sz w:val="20"/>
+          <w:szCs w:val="20"/>
+          <w:lang w:eastAsia="en-IN"/>
+        </w:rPr>
+      </w:pPr>
+    </w:p>
+    <w:p>
+      <w:pPr>
+        <w:tabs>
+          <w:tab w:val="left" w:pos="916"/>
+          <w:tab w:val="left" w:pos="1832"/>
+          <w:tab w:val="left" w:pos="2748"/>
+          <w:tab w:val="left" w:pos="3664"/>
+          <w:tab w:val="left" w:pos="4580"/>
+          <w:tab w:val="left" w:pos="5496"/>
+          <w:tab w:val="left" w:pos="6412"/>
+          <w:tab w:val="left" w:pos="7328"/>
+          <w:tab w:val="left" w:pos="8244"/>
+          <w:tab w:val="left" w:pos="9160"/>
+          <w:tab w:val="left" w:pos="10076"/>
+          <w:tab w:val="left" w:pos="10992"/>
+          <w:tab w:val="left" w:pos="11908"/>
+          <w:tab w:val="left" w:pos="12824"/>
+          <w:tab w:val="left" w:pos="13740"/>
+          <w:tab w:val="left" w:pos="14656"/>
+        </w:tabs>
+        <w:spacing w:after="0" w:line="240" w:lineRule="auto"/>
+        <w:rPr>
+          <w:rFonts w:ascii="Courier New" w:eastAsia="Times New Roman" w:hAnsi="Courier New" w:cs="Courier New"/>
+          <w:sz w:val="20"/>
+          <w:szCs w:val="20"/>
+          <w:lang w:eastAsia="en-IN"/>
+        </w:rPr>
+      </w:pPr>
+      <w:proofErr w:type="spellStart"/>
+      <w:proofErr w:type="gramStart"/>
+      <w:r>
+        <w:rPr>
+          <w:rFonts w:ascii="Courier New" w:eastAsia="Times New Roman" w:hAnsi="Courier New" w:cs="Courier New"/>
+          <w:sz w:val="20"/>
+          <w:szCs w:val="20"/>
+          <w:lang w:eastAsia="en-IN"/>
+        </w:rPr>
+        <w:t>box-sizing:</w:t>
+      </w:r>
+      <w:proofErr w:type="gramEnd"/>
+      <w:r>
+        <w:rPr>
+          <w:rFonts w:ascii="Courier New" w:eastAsia="Times New Roman" w:hAnsi="Courier New" w:cs="Courier New"/>
+          <w:sz w:val="20"/>
+          <w:szCs w:val="20"/>
+          <w:lang w:eastAsia="en-IN"/>
+        </w:rPr>
+        <w:t>content-box</w:t>
+      </w:r>
+      <w:proofErr w:type="spellEnd"/>
+      <w:r>
+        <w:rPr>
+          <w:rFonts w:ascii="Courier New" w:eastAsia="Times New Roman" w:hAnsi="Courier New" w:cs="Courier New"/>
+          <w:sz w:val="20"/>
+          <w:szCs w:val="20"/>
+          <w:lang w:eastAsia="en-IN"/>
+        </w:rPr>
+        <w:t>;</w:t>
+      </w:r>
+    </w:p>
+    <w:p>
+      <w:pPr>
+        <w:tabs>
+          <w:tab w:val="left" w:pos="916"/>
+          <w:tab w:val="left" w:pos="1832"/>
+          <w:tab w:val="left" w:pos="2748"/>
+          <w:tab w:val="left" w:pos="3664"/>
+          <w:tab w:val="left" w:pos="4580"/>
+          <w:tab w:val="left" w:pos="5496"/>
+          <w:tab w:val="left" w:pos="6412"/>
+          <w:tab w:val="left" w:pos="7328"/>
+          <w:tab w:val="left" w:pos="8244"/>
+          <w:tab w:val="left" w:pos="9160"/>
+          <w:tab w:val="left" w:pos="10076"/>
+          <w:tab w:val="left" w:pos="10992"/>
+          <w:tab w:val="left" w:pos="11908"/>
+          <w:tab w:val="left" w:pos="12824"/>
+          <w:tab w:val="left" w:pos="13740"/>
+          <w:tab w:val="left" w:pos="14656"/>
+        </w:tabs>
+        <w:spacing w:after="0" w:line="240" w:lineRule="auto"/>
+        <w:rPr>
+          <w:rFonts w:ascii="Courier New" w:eastAsia="Times New Roman" w:hAnsi="Courier New" w:cs="Courier New"/>
+          <w:sz w:val="20"/>
+          <w:szCs w:val="20"/>
+          <w:lang w:eastAsia="en-IN"/>
+        </w:rPr>
+      </w:pPr>
+    </w:p>
+    <w:p>
+      <w:pPr>
+        <w:tabs>
+          <w:tab w:val="left" w:pos="916"/>
+          <w:tab w:val="left" w:pos="1832"/>
+          <w:tab w:val="left" w:pos="2748"/>
+          <w:tab w:val="left" w:pos="3664"/>
+          <w:tab w:val="left" w:pos="4580"/>
+          <w:tab w:val="left" w:pos="5496"/>
+          <w:tab w:val="left" w:pos="6412"/>
+          <w:tab w:val="left" w:pos="7328"/>
+          <w:tab w:val="left" w:pos="8244"/>
+          <w:tab w:val="left" w:pos="9160"/>
+          <w:tab w:val="left" w:pos="10076"/>
+          <w:tab w:val="left" w:pos="10992"/>
+          <w:tab w:val="left" w:pos="11908"/>
+          <w:tab w:val="left" w:pos="12824"/>
+          <w:tab w:val="left" w:pos="13740"/>
+          <w:tab w:val="left" w:pos="14656"/>
+        </w:tabs>
+        <w:spacing w:after="0" w:line="240" w:lineRule="auto"/>
+        <w:rPr>
+          <w:rFonts w:ascii="Courier New" w:eastAsia="Times New Roman" w:hAnsi="Courier New" w:cs="Courier New"/>
+          <w:sz w:val="20"/>
+          <w:szCs w:val="20"/>
+          <w:lang w:eastAsia="en-IN"/>
+        </w:rPr>
+      </w:pPr>
+      <w:r>
+        <w:rPr>
+          <w:rFonts w:ascii="Courier New" w:eastAsia="Times New Roman" w:hAnsi="Courier New" w:cs="Courier New"/>
+          <w:sz w:val="20"/>
+          <w:szCs w:val="20"/>
+          <w:lang w:eastAsia="en-IN"/>
+        </w:rPr>
+        <w:t>}</w:t>
+      </w:r>
+    </w:p>
+    <w:p>
+      <w:pPr>
+        <w:spacing w:before="100" w:beforeAutospacing="1" w:after="100" w:afterAutospacing="1" w:line="240" w:lineRule="auto"/>
+        <w:rPr>
+          <w:rFonts w:ascii="Times New Roman" w:eastAsia="Times New Roman" w:hAnsi="Times New Roman" w:cs="Times New Roman"/>
+          <w:sz w:val="24"/>
+          <w:szCs w:val="24"/>
+          <w:lang w:eastAsia="en-IN"/>
+        </w:rPr>
+      </w:pPr>
+      <w:r>
+        <w:rPr>
+          <w:rFonts w:ascii="Times New Roman" w:eastAsia="Times New Roman" w:hAnsi="Times New Roman" w:cs="Times New Roman"/>
+          <w:sz w:val="24"/>
+          <w:szCs w:val="24"/>
+          <w:lang w:eastAsia="en-IN"/>
+        </w:rPr>
+        <w:lastRenderedPageBreak/>
+        <w:t>Now</w:t>
+      </w:r>
+    </w:p>
+    <w:p>
+      <w:pPr>
+        <w:spacing w:before="100" w:beforeAutospacing="1" w:after="100" w:afterAutospacing="1" w:line="240" w:lineRule="auto"/>
+        <w:rPr>
+          <w:rFonts w:ascii="Times New Roman" w:eastAsia="Times New Roman" w:hAnsi="Times New Roman" w:cs="Times New Roman"/>
+          <w:sz w:val="24"/>
+          <w:szCs w:val="24"/>
+          <w:lang w:eastAsia="en-IN"/>
+        </w:rPr>
+      </w:pPr>
+      <w:r>
+        <w:rPr>
+          <w:rFonts w:ascii="Times New Roman" w:eastAsia="Times New Roman" w:hAnsi="Times New Roman" w:cs="Times New Roman"/>
+          <w:sz w:val="24"/>
+          <w:szCs w:val="24"/>
+          <w:lang w:eastAsia="en-IN"/>
+        </w:rPr>
+        <w:t>Only write what changes.</w:t>
+      </w:r>
+    </w:p>
+    <w:p>
+      <w:pPr>
+        <w:tabs>
+          <w:tab w:val="left" w:pos="916"/>
+          <w:tab w:val="left" w:pos="1832"/>
+          <w:tab w:val="left" w:pos="2748"/>
+          <w:tab w:val="left" w:pos="3664"/>
+          <w:tab w:val="left" w:pos="4580"/>
+          <w:tab w:val="left" w:pos="5496"/>
+          <w:tab w:val="left" w:pos="6412"/>
+          <w:tab w:val="left" w:pos="7328"/>
+          <w:tab w:val="left" w:pos="8244"/>
+          <w:tab w:val="left" w:pos="9160"/>
+          <w:tab w:val="left" w:pos="10076"/>
+          <w:tab w:val="left" w:pos="10992"/>
+          <w:tab w:val="left" w:pos="11908"/>
+          <w:tab w:val="left" w:pos="12824"/>
+          <w:tab w:val="left" w:pos="13740"/>
+          <w:tab w:val="left" w:pos="14656"/>
+        </w:tabs>
+        <w:spacing w:after="0" w:line="240" w:lineRule="auto"/>
+        <w:rPr>
+          <w:rFonts w:ascii="Courier New" w:eastAsia="Times New Roman" w:hAnsi="Courier New" w:cs="Courier New"/>
+          <w:sz w:val="20"/>
+          <w:szCs w:val="20"/>
+          <w:lang w:eastAsia="en-IN"/>
+        </w:rPr>
+      </w:pPr>
+      <w:r>
+        <w:rPr>
+          <w:rFonts w:ascii="Courier New" w:eastAsia="Times New Roman" w:hAnsi="Courier New" w:cs="Courier New"/>
+          <w:sz w:val="20"/>
+          <w:szCs w:val="20"/>
+          <w:lang w:eastAsia="en-IN"/>
+        </w:rPr>
+        <w:t>.</w:t>
+      </w:r>
+      <w:proofErr w:type="gramStart"/>
+      <w:r>
+        <w:rPr>
+          <w:rFonts w:ascii="Courier New" w:eastAsia="Times New Roman" w:hAnsi="Courier New" w:cs="Courier New"/>
+          <w:sz w:val="20"/>
+          <w:szCs w:val="20"/>
+          <w:lang w:eastAsia="en-IN"/>
+        </w:rPr>
+        <w:t>box1{</w:t>
+      </w:r>
+      <w:proofErr w:type="gramEnd"/>
+    </w:p>
+    <w:p>
+      <w:pPr>
+        <w:tabs>
+          <w:tab w:val="left" w:pos="916"/>
+          <w:tab w:val="left" w:pos="1832"/>
+          <w:tab w:val="left" w:pos="2748"/>
+          <w:tab w:val="left" w:pos="3664"/>
+          <w:tab w:val="left" w:pos="4580"/>
+          <w:tab w:val="left" w:pos="5496"/>
+          <w:tab w:val="left" w:pos="6412"/>
+          <w:tab w:val="left" w:pos="7328"/>
+          <w:tab w:val="left" w:pos="8244"/>
+          <w:tab w:val="left" w:pos="9160"/>
+          <w:tab w:val="left" w:pos="10076"/>
+          <w:tab w:val="left" w:pos="10992"/>
+          <w:tab w:val="left" w:pos="11908"/>
+          <w:tab w:val="left" w:pos="12824"/>
+          <w:tab w:val="left" w:pos="13740"/>
+          <w:tab w:val="left" w:pos="14656"/>
+        </w:tabs>
+        <w:spacing w:after="0" w:line="240" w:lineRule="auto"/>
+        <w:rPr>
+          <w:rFonts w:ascii="Courier New" w:eastAsia="Times New Roman" w:hAnsi="Courier New" w:cs="Courier New"/>
+          <w:sz w:val="20"/>
+          <w:szCs w:val="20"/>
+          <w:lang w:eastAsia="en-IN"/>
+        </w:rPr>
+      </w:pPr>
+    </w:p>
+    <w:p>
+      <w:pPr>
+        <w:tabs>
+          <w:tab w:val="left" w:pos="916"/>
+          <w:tab w:val="left" w:pos="1832"/>
+          <w:tab w:val="left" w:pos="2748"/>
+          <w:tab w:val="left" w:pos="3664"/>
+          <w:tab w:val="left" w:pos="4580"/>
+          <w:tab w:val="left" w:pos="5496"/>
+          <w:tab w:val="left" w:pos="6412"/>
+          <w:tab w:val="left" w:pos="7328"/>
+          <w:tab w:val="left" w:pos="8244"/>
+          <w:tab w:val="left" w:pos="9160"/>
+          <w:tab w:val="left" w:pos="10076"/>
+          <w:tab w:val="left" w:pos="10992"/>
+          <w:tab w:val="left" w:pos="11908"/>
+          <w:tab w:val="left" w:pos="12824"/>
+          <w:tab w:val="left" w:pos="13740"/>
+          <w:tab w:val="left" w:pos="14656"/>
+        </w:tabs>
+        <w:spacing w:after="0" w:line="240" w:lineRule="auto"/>
+        <w:rPr>
+          <w:rFonts w:ascii="Courier New" w:eastAsia="Times New Roman" w:hAnsi="Courier New" w:cs="Courier New"/>
+          <w:sz w:val="20"/>
+          <w:szCs w:val="20"/>
+          <w:lang w:eastAsia="en-IN"/>
+        </w:rPr>
+      </w:pPr>
+      <w:proofErr w:type="gramStart"/>
+      <w:r>
+        <w:rPr>
+          <w:rFonts w:ascii="Courier New" w:eastAsia="Times New Roman" w:hAnsi="Courier New" w:cs="Courier New"/>
+          <w:sz w:val="20"/>
+          <w:szCs w:val="20"/>
+          <w:lang w:eastAsia="en-IN"/>
+        </w:rPr>
+        <w:t>border:</w:t>
+      </w:r>
+      <w:proofErr w:type="gramEnd"/>
+      <w:r>
+        <w:rPr>
+          <w:rFonts w:ascii="Courier New" w:eastAsia="Times New Roman" w:hAnsi="Courier New" w:cs="Courier New"/>
+          <w:sz w:val="20"/>
+          <w:szCs w:val="20"/>
+          <w:lang w:eastAsia="en-IN"/>
+        </w:rPr>
+        <w:t>5px solid red;</w:t>
+      </w:r>
+    </w:p>
+    <w:p>
+      <w:pPr>
+        <w:tabs>
+          <w:tab w:val="left" w:pos="916"/>
+          <w:tab w:val="left" w:pos="1832"/>
+          <w:tab w:val="left" w:pos="2748"/>
+          <w:tab w:val="left" w:pos="3664"/>
+          <w:tab w:val="left" w:pos="4580"/>
+          <w:tab w:val="left" w:pos="5496"/>
+          <w:tab w:val="left" w:pos="6412"/>
+          <w:tab w:val="left" w:pos="7328"/>
+          <w:tab w:val="left" w:pos="8244"/>
+          <w:tab w:val="left" w:pos="9160"/>
+          <w:tab w:val="left" w:pos="10076"/>
+          <w:tab w:val="left" w:pos="10992"/>
+          <w:tab w:val="left" w:pos="11908"/>
+          <w:tab w:val="left" w:pos="12824"/>
+          <w:tab w:val="left" w:pos="13740"/>
+          <w:tab w:val="left" w:pos="14656"/>
+        </w:tabs>
+        <w:spacing w:after="0" w:line="240" w:lineRule="auto"/>
+        <w:rPr>
+          <w:rFonts w:ascii="Courier New" w:eastAsia="Times New Roman" w:hAnsi="Courier New" w:cs="Courier New"/>
+          <w:sz w:val="20"/>
+          <w:szCs w:val="20"/>
+          <w:lang w:eastAsia="en-IN"/>
+        </w:rPr>
+      </w:pPr>
+    </w:p>
+    <w:p>
+      <w:pPr>
+        <w:tabs>
+          <w:tab w:val="left" w:pos="916"/>
+          <w:tab w:val="left" w:pos="1832"/>
+          <w:tab w:val="left" w:pos="2748"/>
+          <w:tab w:val="left" w:pos="3664"/>
+          <w:tab w:val="left" w:pos="4580"/>
+          <w:tab w:val="left" w:pos="5496"/>
+          <w:tab w:val="left" w:pos="6412"/>
+          <w:tab w:val="left" w:pos="7328"/>
+          <w:tab w:val="left" w:pos="8244"/>
+          <w:tab w:val="left" w:pos="9160"/>
+          <w:tab w:val="left" w:pos="10076"/>
+          <w:tab w:val="left" w:pos="10992"/>
+          <w:tab w:val="left" w:pos="11908"/>
+          <w:tab w:val="left" w:pos="12824"/>
+          <w:tab w:val="left" w:pos="13740"/>
+          <w:tab w:val="left" w:pos="14656"/>
+        </w:tabs>
+        <w:spacing w:after="0" w:line="240" w:lineRule="auto"/>
+        <w:rPr>
+          <w:rFonts w:ascii="Courier New" w:eastAsia="Times New Roman" w:hAnsi="Courier New" w:cs="Courier New"/>
+          <w:sz w:val="20"/>
+          <w:szCs w:val="20"/>
+          <w:lang w:eastAsia="en-IN"/>
+        </w:rPr>
+      </w:pPr>
+      <w:r>
+        <w:rPr>
+          <w:rFonts w:ascii="Courier New" w:eastAsia="Times New Roman" w:hAnsi="Courier New" w:cs="Courier New"/>
+          <w:sz w:val="20"/>
+          <w:szCs w:val="20"/>
+          <w:lang w:eastAsia="en-IN"/>
+        </w:rPr>
+        <w:t>}</w:t>
+      </w:r>
+    </w:p>
+    <w:p>
+      <w:pPr>
+        <w:tabs>
+          <w:tab w:val="left" w:pos="916"/>
+          <w:tab w:val="left" w:pos="1832"/>
+          <w:tab w:val="left" w:pos="2748"/>
+          <w:tab w:val="left" w:pos="3664"/>
+          <w:tab w:val="left" w:pos="4580"/>
+          <w:tab w:val="left" w:pos="5496"/>
+          <w:tab w:val="left" w:pos="6412"/>
+          <w:tab w:val="left" w:pos="7328"/>
+          <w:tab w:val="left" w:pos="8244"/>
+          <w:tab w:val="left" w:pos="9160"/>
+          <w:tab w:val="left" w:pos="10076"/>
+          <w:tab w:val="left" w:pos="10992"/>
+          <w:tab w:val="left" w:pos="11908"/>
+          <w:tab w:val="left" w:pos="12824"/>
+          <w:tab w:val="left" w:pos="13740"/>
+          <w:tab w:val="left" w:pos="14656"/>
+        </w:tabs>
+        <w:spacing w:after="0" w:line="240" w:lineRule="auto"/>
+        <w:rPr>
+          <w:rFonts w:ascii="Courier New" w:eastAsia="Times New Roman" w:hAnsi="Courier New" w:cs="Courier New"/>
+          <w:sz w:val="20"/>
+          <w:szCs w:val="20"/>
+          <w:lang w:eastAsia="en-IN"/>
+        </w:rPr>
+      </w:pPr>
+    </w:p>
+    <w:p>
+      <w:pPr>
+        <w:tabs>
+          <w:tab w:val="left" w:pos="916"/>
+          <w:tab w:val="left" w:pos="1832"/>
+          <w:tab w:val="left" w:pos="2748"/>
+          <w:tab w:val="left" w:pos="3664"/>
+          <w:tab w:val="left" w:pos="4580"/>
+          <w:tab w:val="left" w:pos="5496"/>
+          <w:tab w:val="left" w:pos="6412"/>
+          <w:tab w:val="left" w:pos="7328"/>
+          <w:tab w:val="left" w:pos="8244"/>
+          <w:tab w:val="left" w:pos="9160"/>
+          <w:tab w:val="left" w:pos="10076"/>
+          <w:tab w:val="left" w:pos="10992"/>
+          <w:tab w:val="left" w:pos="11908"/>
+          <w:tab w:val="left" w:pos="12824"/>
+          <w:tab w:val="left" w:pos="13740"/>
+          <w:tab w:val="left" w:pos="14656"/>
+        </w:tabs>
+        <w:spacing w:after="0" w:line="240" w:lineRule="auto"/>
+        <w:rPr>
+          <w:rFonts w:ascii="Courier New" w:eastAsia="Times New Roman" w:hAnsi="Courier New" w:cs="Courier New"/>
+          <w:sz w:val="20"/>
+          <w:szCs w:val="20"/>
+          <w:lang w:eastAsia="en-IN"/>
+        </w:rPr>
+      </w:pPr>
+      <w:r>
+        <w:rPr>
+          <w:rFonts w:ascii="Courier New" w:eastAsia="Times New Roman" w:hAnsi="Courier New" w:cs="Courier New"/>
+          <w:sz w:val="20"/>
+          <w:szCs w:val="20"/>
+          <w:lang w:eastAsia="en-IN"/>
+        </w:rPr>
+        <w:t>.</w:t>
+      </w:r>
+      <w:proofErr w:type="gramStart"/>
+      <w:r>
+        <w:rPr>
+          <w:rFonts w:ascii="Courier New" w:eastAsia="Times New Roman" w:hAnsi="Courier New" w:cs="Courier New"/>
+          <w:sz w:val="20"/>
+          <w:szCs w:val="20"/>
+          <w:lang w:eastAsia="en-IN"/>
+        </w:rPr>
+        <w:t>box2{</w:t>
+      </w:r>
+      <w:proofErr w:type="gramEnd"/>
+    </w:p>
+    <w:p>
+      <w:pPr>
+        <w:tabs>
+          <w:tab w:val="left" w:pos="916"/>
+          <w:tab w:val="left" w:pos="1832"/>
+          <w:tab w:val="left" w:pos="2748"/>
+          <w:tab w:val="left" w:pos="3664"/>
+          <w:tab w:val="left" w:pos="4580"/>
+          <w:tab w:val="left" w:pos="5496"/>
+          <w:tab w:val="left" w:pos="6412"/>
+          <w:tab w:val="left" w:pos="7328"/>
+          <w:tab w:val="left" w:pos="8244"/>
+          <w:tab w:val="left" w:pos="9160"/>
+          <w:tab w:val="left" w:pos="10076"/>
+          <w:tab w:val="left" w:pos="10992"/>
+          <w:tab w:val="left" w:pos="11908"/>
+          <w:tab w:val="left" w:pos="12824"/>
+          <w:tab w:val="left" w:pos="13740"/>
+          <w:tab w:val="left" w:pos="14656"/>
+        </w:tabs>
+        <w:spacing w:after="0" w:line="240" w:lineRule="auto"/>
+        <w:rPr>
+          <w:rFonts w:ascii="Courier New" w:eastAsia="Times New Roman" w:hAnsi="Courier New" w:cs="Courier New"/>
+          <w:sz w:val="20"/>
+          <w:szCs w:val="20"/>
+          <w:lang w:eastAsia="en-IN"/>
+        </w:rPr>
+      </w:pPr>
+    </w:p>
+    <w:p>
+      <w:pPr>
+        <w:tabs>
+          <w:tab w:val="left" w:pos="916"/>
+          <w:tab w:val="left" w:pos="1832"/>
+          <w:tab w:val="left" w:pos="2748"/>
+          <w:tab w:val="left" w:pos="3664"/>
+          <w:tab w:val="left" w:pos="4580"/>
+          <w:tab w:val="left" w:pos="5496"/>
+          <w:tab w:val="left" w:pos="6412"/>
+          <w:tab w:val="left" w:pos="7328"/>
+          <w:tab w:val="left" w:pos="8244"/>
+          <w:tab w:val="left" w:pos="9160"/>
+          <w:tab w:val="left" w:pos="10076"/>
+          <w:tab w:val="left" w:pos="10992"/>
+          <w:tab w:val="left" w:pos="11908"/>
+          <w:tab w:val="left" w:pos="12824"/>
+          <w:tab w:val="left" w:pos="13740"/>
+          <w:tab w:val="left" w:pos="14656"/>
+        </w:tabs>
+        <w:spacing w:after="0" w:line="240" w:lineRule="auto"/>
+        <w:rPr>
+          <w:rFonts w:ascii="Courier New" w:eastAsia="Times New Roman" w:hAnsi="Courier New" w:cs="Courier New"/>
+          <w:sz w:val="20"/>
+          <w:szCs w:val="20"/>
+          <w:lang w:eastAsia="en-IN"/>
+        </w:rPr>
+      </w:pPr>
+      <w:proofErr w:type="gramStart"/>
+      <w:r>
+        <w:rPr>
+          <w:rFonts w:ascii="Courier New" w:eastAsia="Times New Roman" w:hAnsi="Courier New" w:cs="Courier New"/>
+          <w:sz w:val="20"/>
+          <w:szCs w:val="20"/>
+          <w:lang w:eastAsia="en-IN"/>
+        </w:rPr>
+        <w:t>border:</w:t>
+      </w:r>
+      <w:proofErr w:type="gramEnd"/>
+      <w:r>
+        <w:rPr>
+          <w:rFonts w:ascii="Courier New" w:eastAsia="Times New Roman" w:hAnsi="Courier New" w:cs="Courier New"/>
+          <w:sz w:val="20"/>
+          <w:szCs w:val="20"/>
+          <w:lang w:eastAsia="en-IN"/>
+        </w:rPr>
+        <w:t>5px solid green;</w:t>
+      </w:r>
+    </w:p>
+    <w:p>
+      <w:pPr>
+        <w:tabs>
+          <w:tab w:val="left" w:pos="916"/>
+          <w:tab w:val="left" w:pos="1832"/>
+          <w:tab w:val="left" w:pos="2748"/>
+          <w:tab w:val="left" w:pos="3664"/>
+          <w:tab w:val="left" w:pos="4580"/>
+          <w:tab w:val="left" w:pos="5496"/>
+          <w:tab w:val="left" w:pos="6412"/>
+          <w:tab w:val="left" w:pos="7328"/>
+          <w:tab w:val="left" w:pos="8244"/>
+          <w:tab w:val="left" w:pos="9160"/>
+          <w:tab w:val="left" w:pos="10076"/>
+          <w:tab w:val="left" w:pos="10992"/>
+          <w:tab w:val="left" w:pos="11908"/>
+          <w:tab w:val="left" w:pos="12824"/>
+          <w:tab w:val="left" w:pos="13740"/>
+          <w:tab w:val="left" w:pos="14656"/>
+        </w:tabs>
+        <w:spacing w:after="0" w:line="240" w:lineRule="auto"/>
+        <w:rPr>
+          <w:rFonts w:ascii="Courier New" w:eastAsia="Times New Roman" w:hAnsi="Courier New" w:cs="Courier New"/>
+          <w:sz w:val="20"/>
+          <w:szCs w:val="20"/>
+          <w:lang w:eastAsia="en-IN"/>
+        </w:rPr>
+      </w:pPr>
+    </w:p>
+    <w:p>
+      <w:pPr>
+        <w:tabs>
+          <w:tab w:val="left" w:pos="916"/>
+          <w:tab w:val="left" w:pos="1832"/>
+          <w:tab w:val="left" w:pos="2748"/>
+          <w:tab w:val="left" w:pos="3664"/>
+          <w:tab w:val="left" w:pos="4580"/>
+          <w:tab w:val="left" w:pos="5496"/>
+          <w:tab w:val="left" w:pos="6412"/>
+          <w:tab w:val="left" w:pos="7328"/>
+          <w:tab w:val="left" w:pos="8244"/>
+          <w:tab w:val="left" w:pos="9160"/>
+          <w:tab w:val="left" w:pos="10076"/>
+          <w:tab w:val="left" w:pos="10992"/>
+          <w:tab w:val="left" w:pos="11908"/>
+          <w:tab w:val="left" w:pos="12824"/>
+          <w:tab w:val="left" w:pos="13740"/>
+          <w:tab w:val="left" w:pos="14656"/>
+        </w:tabs>
+        <w:spacing w:after="0" w:line="240" w:lineRule="auto"/>
+        <w:rPr>
+          <w:rFonts w:ascii="Courier New" w:eastAsia="Times New Roman" w:hAnsi="Courier New" w:cs="Courier New"/>
+          <w:sz w:val="20"/>
+          <w:szCs w:val="20"/>
+          <w:lang w:eastAsia="en-IN"/>
+        </w:rPr>
+      </w:pPr>
+      <w:r>
+        <w:rPr>
+          <w:rFonts w:ascii="Courier New" w:eastAsia="Times New Roman" w:hAnsi="Courier New" w:cs="Courier New"/>
+          <w:sz w:val="20"/>
+          <w:szCs w:val="20"/>
+          <w:lang w:eastAsia="en-IN"/>
+        </w:rPr>
+        <w:t>}</w:t>
+      </w:r>
+    </w:p>
+    <w:p>
+      <w:pPr>
+        <w:tabs>
+          <w:tab w:val="left" w:pos="916"/>
+          <w:tab w:val="left" w:pos="1832"/>
+          <w:tab w:val="left" w:pos="2748"/>
+          <w:tab w:val="left" w:pos="3664"/>
+          <w:tab w:val="left" w:pos="4580"/>
+          <w:tab w:val="left" w:pos="5496"/>
+          <w:tab w:val="left" w:pos="6412"/>
+          <w:tab w:val="left" w:pos="7328"/>
+          <w:tab w:val="left" w:pos="8244"/>
+          <w:tab w:val="left" w:pos="9160"/>
+          <w:tab w:val="left" w:pos="10076"/>
+          <w:tab w:val="left" w:pos="10992"/>
+          <w:tab w:val="left" w:pos="11908"/>
+          <w:tab w:val="left" w:pos="12824"/>
+          <w:tab w:val="left" w:pos="13740"/>
+          <w:tab w:val="left" w:pos="14656"/>
+        </w:tabs>
+        <w:spacing w:after="0" w:line="240" w:lineRule="auto"/>
+        <w:rPr>
+          <w:rFonts w:ascii="Courier New" w:eastAsia="Times New Roman" w:hAnsi="Courier New" w:cs="Courier New"/>
+          <w:sz w:val="20"/>
+          <w:szCs w:val="20"/>
+          <w:lang w:eastAsia="en-IN"/>
+        </w:rPr>
+      </w:pPr>
+    </w:p>
+    <w:p>
+      <w:pPr>
+        <w:tabs>
+          <w:tab w:val="left" w:pos="916"/>
+          <w:tab w:val="left" w:pos="1832"/>
+          <w:tab w:val="left" w:pos="2748"/>
+          <w:tab w:val="left" w:pos="3664"/>
+          <w:tab w:val="left" w:pos="4580"/>
+          <w:tab w:val="left" w:pos="5496"/>
+          <w:tab w:val="left" w:pos="6412"/>
+          <w:tab w:val="left" w:pos="7328"/>
+          <w:tab w:val="left" w:pos="8244"/>
+          <w:tab w:val="left" w:pos="9160"/>
+          <w:tab w:val="left" w:pos="10076"/>
+          <w:tab w:val="left" w:pos="10992"/>
+          <w:tab w:val="left" w:pos="11908"/>
+          <w:tab w:val="left" w:pos="12824"/>
+          <w:tab w:val="left" w:pos="13740"/>
+          <w:tab w:val="left" w:pos="14656"/>
+        </w:tabs>
+        <w:spacing w:after="0" w:line="240" w:lineRule="auto"/>
+        <w:rPr>
+          <w:rFonts w:ascii="Courier New" w:eastAsia="Times New Roman" w:hAnsi="Courier New" w:cs="Courier New"/>
+          <w:sz w:val="20"/>
+          <w:szCs w:val="20"/>
+          <w:lang w:eastAsia="en-IN"/>
+        </w:rPr>
+      </w:pPr>
+      <w:r>
+        <w:rPr>
+          <w:rFonts w:ascii="Courier New" w:eastAsia="Times New Roman" w:hAnsi="Courier New" w:cs="Courier New"/>
+          <w:sz w:val="20"/>
+          <w:szCs w:val="20"/>
+          <w:lang w:eastAsia="en-IN"/>
+        </w:rPr>
+        <w:t>.</w:t>
+      </w:r>
+      <w:proofErr w:type="gramStart"/>
+      <w:r>
+        <w:rPr>
+          <w:rFonts w:ascii="Courier New" w:eastAsia="Times New Roman" w:hAnsi="Courier New" w:cs="Courier New"/>
+          <w:sz w:val="20"/>
+          <w:szCs w:val="20"/>
+          <w:lang w:eastAsia="en-IN"/>
+        </w:rPr>
+        <w:t>box3{</w:t>
+      </w:r>
+      <w:proofErr w:type="gramEnd"/>
+    </w:p>
+    <w:p>
+      <w:pPr>
+        <w:tabs>
+          <w:tab w:val="left" w:pos="916"/>
+          <w:tab w:val="left" w:pos="1832"/>
+          <w:tab w:val="left" w:pos="2748"/>
+          <w:tab w:val="left" w:pos="3664"/>
+          <w:tab w:val="left" w:pos="4580"/>
+          <w:tab w:val="left" w:pos="5496"/>
+          <w:tab w:val="left" w:pos="6412"/>
+          <w:tab w:val="left" w:pos="7328"/>
+          <w:tab w:val="left" w:pos="8244"/>
+          <w:tab w:val="left" w:pos="9160"/>
+          <w:tab w:val="left" w:pos="10076"/>
+          <w:tab w:val="left" w:pos="10992"/>
+          <w:tab w:val="left" w:pos="11908"/>
+          <w:tab w:val="left" w:pos="12824"/>
+          <w:tab w:val="left" w:pos="13740"/>
+          <w:tab w:val="left" w:pos="14656"/>
+        </w:tabs>
+        <w:spacing w:after="0" w:line="240" w:lineRule="auto"/>
+        <w:rPr>
+          <w:rFonts w:ascii="Courier New" w:eastAsia="Times New Roman" w:hAnsi="Courier New" w:cs="Courier New"/>
+          <w:sz w:val="20"/>
+          <w:szCs w:val="20"/>
+          <w:lang w:eastAsia="en-IN"/>
+        </w:rPr>
+      </w:pPr>
+    </w:p>
+    <w:p>
+      <w:pPr>
+        <w:tabs>
+          <w:tab w:val="left" w:pos="916"/>
+          <w:tab w:val="left" w:pos="1832"/>
+          <w:tab w:val="left" w:pos="2748"/>
+          <w:tab w:val="left" w:pos="3664"/>
+          <w:tab w:val="left" w:pos="4580"/>
+          <w:tab w:val="left" w:pos="5496"/>
+          <w:tab w:val="left" w:pos="6412"/>
+          <w:tab w:val="left" w:pos="7328"/>
+          <w:tab w:val="left" w:pos="8244"/>
+          <w:tab w:val="left" w:pos="9160"/>
+          <w:tab w:val="left" w:pos="10076"/>
+          <w:tab w:val="left" w:pos="10992"/>
+          <w:tab w:val="left" w:pos="11908"/>
+          <w:tab w:val="left" w:pos="12824"/>
+          <w:tab w:val="left" w:pos="13740"/>
+          <w:tab w:val="left" w:pos="14656"/>
+        </w:tabs>
+        <w:spacing w:after="0" w:line="240" w:lineRule="auto"/>
+        <w:rPr>
+          <w:rFonts w:ascii="Courier New" w:eastAsia="Times New Roman" w:hAnsi="Courier New" w:cs="Courier New"/>
+          <w:sz w:val="20"/>
+          <w:szCs w:val="20"/>
+          <w:lang w:eastAsia="en-IN"/>
+        </w:rPr>
+      </w:pPr>
+      <w:proofErr w:type="gramStart"/>
+      <w:r>
+        <w:rPr>
+          <w:rFonts w:ascii="Courier New" w:eastAsia="Times New Roman" w:hAnsi="Courier New" w:cs="Courier New"/>
+          <w:sz w:val="20"/>
+          <w:szCs w:val="20"/>
+          <w:lang w:eastAsia="en-IN"/>
+        </w:rPr>
+        <w:t>border:</w:t>
+      </w:r>
+      <w:proofErr w:type="gramEnd"/>
+      <w:r>
+        <w:rPr>
+          <w:rFonts w:ascii="Courier New" w:eastAsia="Times New Roman" w:hAnsi="Courier New" w:cs="Courier New"/>
+          <w:sz w:val="20"/>
+          <w:szCs w:val="20"/>
+          <w:lang w:eastAsia="en-IN"/>
+        </w:rPr>
+        <w:t>5px solid blue;</w:t>
+      </w:r>
+    </w:p>
+    <w:p>
+      <w:pPr>
+        <w:tabs>
+          <w:tab w:val="left" w:pos="916"/>
+          <w:tab w:val="left" w:pos="1832"/>
+          <w:tab w:val="left" w:pos="2748"/>
+          <w:tab w:val="left" w:pos="3664"/>
+          <w:tab w:val="left" w:pos="4580"/>
+          <w:tab w:val="left" w:pos="5496"/>
+          <w:tab w:val="left" w:pos="6412"/>
+          <w:tab w:val="left" w:pos="7328"/>
+          <w:tab w:val="left" w:pos="8244"/>
+          <w:tab w:val="left" w:pos="9160"/>
+          <w:tab w:val="left" w:pos="10076"/>
+          <w:tab w:val="left" w:pos="10992"/>
+          <w:tab w:val="left" w:pos="11908"/>
+          <w:tab w:val="left" w:pos="12824"/>
+          <w:tab w:val="left" w:pos="13740"/>
+          <w:tab w:val="left" w:pos="14656"/>
+        </w:tabs>
+        <w:spacing w:after="0" w:line="240" w:lineRule="auto"/>
+        <w:rPr>
+          <w:rFonts w:ascii="Courier New" w:eastAsia="Times New Roman" w:hAnsi="Courier New" w:cs="Courier New"/>
+          <w:sz w:val="20"/>
+          <w:szCs w:val="20"/>
+          <w:lang w:eastAsia="en-IN"/>
+        </w:rPr>
+      </w:pPr>
+    </w:p>
+    <w:p>
+      <w:pPr>
+        <w:tabs>
+          <w:tab w:val="left" w:pos="916"/>
+          <w:tab w:val="left" w:pos="1832"/>
+          <w:tab w:val="left" w:pos="2748"/>
+          <w:tab w:val="left" w:pos="3664"/>
+          <w:tab w:val="left" w:pos="4580"/>
+          <w:tab w:val="left" w:pos="5496"/>
+          <w:tab w:val="left" w:pos="6412"/>
+          <w:tab w:val="left" w:pos="7328"/>
+          <w:tab w:val="left" w:pos="8244"/>
+          <w:tab w:val="left" w:pos="9160"/>
+          <w:tab w:val="left" w:pos="10076"/>
+          <w:tab w:val="left" w:pos="10992"/>
+          <w:tab w:val="left" w:pos="11908"/>
+          <w:tab w:val="left" w:pos="12824"/>
+          <w:tab w:val="left" w:pos="13740"/>
+          <w:tab w:val="left" w:pos="14656"/>
+        </w:tabs>
+        <w:spacing w:after="0" w:line="240" w:lineRule="auto"/>
+        <w:rPr>
+          <w:rFonts w:ascii="Courier New" w:eastAsia="Times New Roman" w:hAnsi="Courier New" w:cs="Courier New"/>
+          <w:sz w:val="20"/>
+          <w:szCs w:val="20"/>
+          <w:lang w:eastAsia="en-IN"/>
+        </w:rPr>
+      </w:pPr>
+      <w:r>
+        <w:rPr>
+          <w:rFonts w:ascii="Courier New" w:eastAsia="Times New Roman" w:hAnsi="Courier New" w:cs="Courier New"/>
+          <w:sz w:val="20"/>
+          <w:szCs w:val="20"/>
+          <w:lang w:eastAsia="en-IN"/>
+        </w:rPr>
+        <w:t>}</w:t>
+      </w:r>
+    </w:p>
+    <w:p>
+      <w:pPr>
+        <w:spacing w:after="0" w:line="240" w:lineRule="auto"/>
+        <w:rPr>
+          <w:rFonts w:ascii="Times New Roman" w:eastAsia="Times New Roman" w:hAnsi="Times New Roman" w:cs="Times New Roman"/>
+          <w:sz w:val="24"/>
+          <w:szCs w:val="24"/>
+          <w:lang w:eastAsia="en-IN"/>
+        </w:rPr>
+      </w:pPr>
+      <w:r>
+        <w:rPr>
+          <w:rFonts w:ascii="Times New Roman" w:eastAsia="Times New Roman" w:hAnsi="Times New Roman" w:cs="Times New Roman"/>
+          <w:sz w:val="24"/>
+          <w:szCs w:val="24"/>
+          <w:lang w:eastAsia="en-IN"/>
+        </w:rPr>
+        <w:pict>
+          <v:rect id="_x0000_i1046" style="width:0;height:1.5pt" o:hralign="center" o:hrstd="t" o:hr="t" fillcolor="#a0a0a0" stroked="f"/>
+        </w:pict>
+      </w:r>
+    </w:p>
+    <w:p>
+      <w:pPr>
+        <w:spacing w:before="100" w:beforeAutospacing="1" w:after="100" w:afterAutospacing="1" w:line="240" w:lineRule="auto"/>
+        <w:outlineLvl w:val="0"/>
+        <w:rPr>
+          <w:rFonts w:ascii="Times New Roman" w:eastAsia="Times New Roman" w:hAnsi="Times New Roman" w:cs="Times New Roman"/>
+          <w:b/>
+          <w:bCs/>
+          <w:kern w:val="36"/>
+          <w:sz w:val="48"/>
+          <w:szCs w:val="48"/>
+          <w:lang w:eastAsia="en-IN"/>
+        </w:rPr>
+      </w:pPr>
+      <w:r>
+        <w:rPr>
+          <w:rFonts w:ascii="Times New Roman" w:eastAsia="Times New Roman" w:hAnsi="Times New Roman" w:cs="Times New Roman"/>
+          <w:b/>
+          <w:bCs/>
+          <w:kern w:val="36"/>
+          <w:sz w:val="48"/>
+          <w:szCs w:val="48"/>
+          <w:lang w:eastAsia="en-IN"/>
+        </w:rPr>
+        <w:t>Then HTML becomes</w:t>
+      </w:r>
+    </w:p>
+    <w:p>
+      <w:pPr>
+        <w:tabs>
+          <w:tab w:val="left" w:pos="916"/>
+          <w:tab w:val="left" w:pos="1832"/>
+          <w:tab w:val="left" w:pos="2748"/>
+          <w:tab w:val="left" w:pos="3664"/>
+          <w:tab w:val="left" w:pos="4580"/>
+          <w:tab w:val="left" w:pos="5496"/>
+          <w:tab w:val="left" w:pos="6412"/>
+          <w:tab w:val="left" w:pos="7328"/>
+          <w:tab w:val="left" w:pos="8244"/>
+          <w:tab w:val="left" w:pos="9160"/>
+          <w:tab w:val="left" w:pos="10076"/>
+          <w:tab w:val="left" w:pos="10992"/>
+          <w:tab w:val="left" w:pos="11908"/>
+          <w:tab w:val="left" w:pos="12824"/>
+          <w:tab w:val="left" w:pos="13740"/>
+          <w:tab w:val="left" w:pos="14656"/>
+        </w:tabs>
+        <w:spacing w:after="0" w:line="240" w:lineRule="auto"/>
+        <w:rPr>
+          <w:rFonts w:ascii="Courier New" w:eastAsia="Times New Roman" w:hAnsi="Courier New" w:cs="Courier New"/>
+          <w:sz w:val="20"/>
+          <w:szCs w:val="20"/>
+          <w:lang w:eastAsia="en-IN"/>
+        </w:rPr>
+      </w:pPr>
+      <w:r>
+        <w:rPr>
+          <w:rFonts w:ascii="Courier New" w:eastAsia="Times New Roman" w:hAnsi="Courier New" w:cs="Courier New"/>
+          <w:sz w:val="20"/>
+          <w:szCs w:val="20"/>
+          <w:lang w:eastAsia="en-IN"/>
+        </w:rPr>
+        <w:t>&lt;div class="box box1"&gt;</w:t>
+      </w:r>
+    </w:p>
     <w:p/>
     <w:p/>
     <w:p>
       <w:r>
+        <w:t>Correct answer</w:t>
+      </w:r>
+    </w:p>
+    <w:p/>
+    <w:p>
+      <w:pPr>
+        <w:pStyle w:val="Heading1"/>
+      </w:pPr>
+      <w:r>
+        <w:t xml:space="preserve">Q6. Develop an HTML &amp; CSS program to create three boxes with different border </w:t>
+      </w:r>
+      <w:proofErr w:type="spellStart"/>
+      <w:r>
+        <w:t>colors</w:t>
+      </w:r>
+      <w:proofErr w:type="spellEnd"/>
+      <w:r>
+        <w:t>.</w:t>
+      </w:r>
+    </w:p>
+    <w:p>
+      <w:pPr>
+        <w:pStyle w:val="Heading3"/>
+      </w:pPr>
+      <w:r>
+        <w:t>HTML &amp; CSS Program</w:t>
+      </w:r>
+    </w:p>
+    <w:p>
+      <w:pPr>
+        <w:pStyle w:val="HTMLPreformatted"/>
+        <w:rPr>
+          <w:rStyle w:val="HTMLCode"/>
+        </w:rPr>
+      </w:pPr>
+      <w:proofErr w:type="gramStart"/>
+      <w:r>
+        <w:rPr>
+          <w:rStyle w:val="u"/>
+        </w:rPr>
+        <w:t>&lt;!DOCTYPE</w:t>
+      </w:r>
+      <w:proofErr w:type="gramEnd"/>
+      <w:r>
+        <w:rPr>
+          <w:rStyle w:val="u"/>
+        </w:rPr>
+        <w:t xml:space="preserve"> html&gt;</w:t>
+      </w:r>
+    </w:p>
+    <w:p>
+      <w:pPr>
+        <w:pStyle w:val="HTMLPreformatted"/>
+        <w:rPr>
+          <w:rStyle w:val="HTMLCode"/>
+        </w:rPr>
+      </w:pPr>
+      <w:r>
+        <w:rPr>
+          <w:rStyle w:val="13"/>
+        </w:rPr>
+        <w:t>&lt;</w:t>
+      </w:r>
+      <w:proofErr w:type="gramStart"/>
+      <w:r>
+        <w:rPr>
+          <w:rStyle w:val="13"/>
+        </w:rPr>
+        <w:t>html</w:t>
+      </w:r>
+      <w:proofErr w:type="gramEnd"/>
+      <w:r>
+        <w:rPr>
+          <w:rStyle w:val="13"/>
+        </w:rPr>
+        <w:t>&gt;</w:t>
+      </w:r>
+    </w:p>
+    <w:p>
+      <w:pPr>
+        <w:pStyle w:val="HTMLPreformatted"/>
+        <w:rPr>
+          <w:rStyle w:val="HTMLCode"/>
+        </w:rPr>
+      </w:pPr>
+      <w:r>
+        <w:rPr>
+          <w:rStyle w:val="13"/>
+        </w:rPr>
+        <w:t>&lt;</w:t>
+      </w:r>
+      <w:proofErr w:type="gramStart"/>
+      <w:r>
+        <w:rPr>
+          <w:rStyle w:val="13"/>
+        </w:rPr>
+        <w:t>head</w:t>
+      </w:r>
+      <w:proofErr w:type="gramEnd"/>
+      <w:r>
+        <w:rPr>
+          <w:rStyle w:val="13"/>
+        </w:rPr>
+        <w:t>&gt;</w:t>
+      </w:r>
+    </w:p>
+    <w:p>
+      <w:pPr>
+        <w:pStyle w:val="HTMLPreformatted"/>
+        <w:rPr>
+          <w:rStyle w:val="HTMLCode"/>
+        </w:rPr>
+      </w:pPr>
+      <w:r>
+        <w:rPr>
+          <w:rStyle w:val="13"/>
+        </w:rPr>
+        <w:t>&lt;</w:t>
+      </w:r>
+      <w:proofErr w:type="gramStart"/>
+      <w:r>
+        <w:rPr>
+          <w:rStyle w:val="13"/>
+        </w:rPr>
+        <w:t>style</w:t>
+      </w:r>
+      <w:proofErr w:type="gramEnd"/>
+      <w:r>
+        <w:rPr>
+          <w:rStyle w:val="13"/>
+        </w:rPr>
+        <w:t>&gt;</w:t>
+      </w:r>
+    </w:p>
+    <w:p>
+      <w:pPr>
+        <w:pStyle w:val="HTMLPreformatted"/>
+        <w:rPr>
+          <w:rStyle w:val="HTMLCode"/>
+        </w:rPr>
+      </w:pPr>
+    </w:p>
+    <w:p>
+      <w:pPr>
+        <w:pStyle w:val="HTMLPreformatted"/>
+        <w:rPr>
+          <w:rStyle w:val="HTMLCode"/>
+        </w:rPr>
+      </w:pPr>
+      <w:r>
+        <w:rPr>
+          <w:rStyle w:val="HTMLCode"/>
+        </w:rPr>
+        <w:t>.</w:t>
+      </w:r>
+      <w:proofErr w:type="gramStart"/>
+      <w:r>
+        <w:rPr>
+          <w:rStyle w:val="10"/>
+        </w:rPr>
+        <w:t>box</w:t>
+      </w:r>
+      <w:r>
+        <w:rPr>
+          <w:rStyle w:val="HTMLCode"/>
+        </w:rPr>
+        <w:t>{</w:t>
+      </w:r>
+      <w:proofErr w:type="gramEnd"/>
+    </w:p>
+    <w:p>
+      <w:pPr>
+        <w:pStyle w:val="HTMLPreformatted"/>
+        <w:rPr>
+          <w:rStyle w:val="HTMLCode"/>
+        </w:rPr>
+      </w:pPr>
+      <w:r>
+        <w:rPr>
+          <w:rStyle w:val="HTMLCode"/>
+        </w:rPr>
+        <w:t xml:space="preserve">    </w:t>
+      </w:r>
+      <w:proofErr w:type="gramStart"/>
+      <w:r>
+        <w:rPr>
+          <w:rStyle w:val="HTMLCode"/>
+        </w:rPr>
+        <w:t>width:</w:t>
+      </w:r>
+      <w:proofErr w:type="gramEnd"/>
+      <w:r>
+        <w:rPr>
+          <w:rStyle w:val="y"/>
+        </w:rPr>
+        <w:t>50</w:t>
+      </w:r>
+      <w:r>
+        <w:rPr>
+          <w:rStyle w:val="v"/>
+        </w:rPr>
+        <w:t>px</w:t>
+      </w:r>
+      <w:r>
+        <w:rPr>
+          <w:rStyle w:val="HTMLCode"/>
+        </w:rPr>
+        <w:t>;</w:t>
+      </w:r>
+    </w:p>
+    <w:p>
+      <w:pPr>
+        <w:pStyle w:val="HTMLPreformatted"/>
+        <w:rPr>
+          <w:rStyle w:val="HTMLCode"/>
+        </w:rPr>
+      </w:pPr>
+      <w:r>
+        <w:rPr>
+          <w:rStyle w:val="HTMLCode"/>
+        </w:rPr>
+        <w:t xml:space="preserve">    </w:t>
+      </w:r>
+      <w:proofErr w:type="spellStart"/>
+      <w:proofErr w:type="gramStart"/>
+      <w:r>
+        <w:rPr>
+          <w:rStyle w:val="HTMLCode"/>
+        </w:rPr>
+        <w:t>box-sizing:</w:t>
+      </w:r>
+      <w:proofErr w:type="gramEnd"/>
+      <w:r>
+        <w:rPr>
+          <w:rStyle w:val="y"/>
+        </w:rPr>
+        <w:t>content-box</w:t>
+      </w:r>
+      <w:proofErr w:type="spellEnd"/>
+      <w:r>
+        <w:rPr>
+          <w:rStyle w:val="HTMLCode"/>
+        </w:rPr>
+        <w:t>;</w:t>
+      </w:r>
+    </w:p>
+    <w:p>
+      <w:pPr>
+        <w:pStyle w:val="HTMLPreformatted"/>
+        <w:rPr>
+          <w:rStyle w:val="HTMLCode"/>
+        </w:rPr>
+      </w:pPr>
+      <w:r>
+        <w:rPr>
+          <w:rStyle w:val="HTMLCode"/>
+        </w:rPr>
+        <w:t xml:space="preserve">    </w:t>
+      </w:r>
+      <w:proofErr w:type="gramStart"/>
+      <w:r>
+        <w:rPr>
+          <w:rStyle w:val="HTMLCode"/>
+        </w:rPr>
+        <w:t>padding:</w:t>
+      </w:r>
+      <w:proofErr w:type="gramEnd"/>
+      <w:r>
+        <w:rPr>
+          <w:rStyle w:val="y"/>
+        </w:rPr>
+        <w:t>6</w:t>
+      </w:r>
+      <w:r>
+        <w:rPr>
+          <w:rStyle w:val="v"/>
+        </w:rPr>
+        <w:t>px</w:t>
+      </w:r>
+      <w:r>
+        <w:rPr>
+          <w:rStyle w:val="HTMLCode"/>
+        </w:rPr>
+        <w:t xml:space="preserve"> </w:t>
+      </w:r>
+      <w:r>
+        <w:rPr>
+          <w:rStyle w:val="y"/>
+        </w:rPr>
+        <w:t>7</w:t>
+      </w:r>
+      <w:r>
+        <w:rPr>
+          <w:rStyle w:val="v"/>
+        </w:rPr>
+        <w:t>px</w:t>
+      </w:r>
+      <w:r>
+        <w:rPr>
+          <w:rStyle w:val="HTMLCode"/>
+        </w:rPr>
+        <w:t>;</w:t>
+      </w:r>
+    </w:p>
+    <w:p>
+      <w:pPr>
+        <w:pStyle w:val="HTMLPreformatted"/>
+        <w:rPr>
+          <w:rStyle w:val="HTMLCode"/>
+        </w:rPr>
+      </w:pPr>
+      <w:r>
+        <w:rPr>
+          <w:rStyle w:val="HTMLCode"/>
+        </w:rPr>
+        <w:t xml:space="preserve">    </w:t>
+      </w:r>
+      <w:proofErr w:type="gramStart"/>
+      <w:r>
+        <w:rPr>
+          <w:rStyle w:val="HTMLCode"/>
+        </w:rPr>
+        <w:t>margin:</w:t>
+      </w:r>
+      <w:proofErr w:type="gramEnd"/>
+      <w:r>
+        <w:rPr>
+          <w:rStyle w:val="y"/>
+        </w:rPr>
+        <w:t>16</w:t>
+      </w:r>
+      <w:r>
+        <w:rPr>
+          <w:rStyle w:val="v"/>
+        </w:rPr>
+        <w:t>px</w:t>
+      </w:r>
+      <w:r>
+        <w:rPr>
+          <w:rStyle w:val="HTMLCode"/>
+        </w:rPr>
+        <w:t xml:space="preserve"> </w:t>
+      </w:r>
+      <w:r>
+        <w:rPr>
+          <w:rStyle w:val="y"/>
+        </w:rPr>
+        <w:t>15</w:t>
+      </w:r>
+      <w:r>
+        <w:rPr>
+          <w:rStyle w:val="v"/>
+        </w:rPr>
+        <w:t>px</w:t>
+      </w:r>
+      <w:r>
+        <w:rPr>
+          <w:rStyle w:val="HTMLCode"/>
+        </w:rPr>
+        <w:t xml:space="preserve"> </w:t>
+      </w:r>
+      <w:r>
+        <w:rPr>
+          <w:rStyle w:val="y"/>
+        </w:rPr>
+        <w:t>17</w:t>
+      </w:r>
+      <w:r>
+        <w:rPr>
+          <w:rStyle w:val="v"/>
+        </w:rPr>
+        <w:t>px</w:t>
+      </w:r>
+      <w:r>
+        <w:rPr>
+          <w:rStyle w:val="HTMLCode"/>
+        </w:rPr>
+        <w:t>;</w:t>
+      </w:r>
+    </w:p>
+    <w:p>
+      <w:pPr>
+        <w:pStyle w:val="HTMLPreformatted"/>
+        <w:rPr>
+          <w:rStyle w:val="HTMLCode"/>
+        </w:rPr>
+      </w:pPr>
+      <w:r>
+        <w:rPr>
+          <w:rStyle w:val="HTMLCode"/>
+        </w:rPr>
+        <w:t>}</w:t>
+      </w:r>
+    </w:p>
+    <w:p>
+      <w:pPr>
+        <w:pStyle w:val="HTMLPreformatted"/>
+        <w:rPr>
+          <w:rStyle w:val="HTMLCode"/>
+        </w:rPr>
+      </w:pPr>
+    </w:p>
+    <w:p>
+      <w:pPr>
+        <w:pStyle w:val="HTMLPreformatted"/>
+        <w:rPr>
+          <w:rStyle w:val="HTMLCode"/>
+        </w:rPr>
+      </w:pPr>
+      <w:r>
+        <w:rPr>
+          <w:rStyle w:val="HTMLCode"/>
+        </w:rPr>
+        <w:t>.</w:t>
+      </w:r>
+      <w:proofErr w:type="gramStart"/>
+      <w:r>
+        <w:rPr>
+          <w:rStyle w:val="10"/>
+        </w:rPr>
+        <w:t>box1</w:t>
+      </w:r>
+      <w:r>
+        <w:rPr>
+          <w:rStyle w:val="HTMLCode"/>
+        </w:rPr>
+        <w:t>{</w:t>
+      </w:r>
+      <w:proofErr w:type="gramEnd"/>
+    </w:p>
+    <w:p>
+      <w:pPr>
+        <w:pStyle w:val="HTMLPreformatted"/>
+        <w:rPr>
+          <w:rStyle w:val="HTMLCode"/>
+        </w:rPr>
+      </w:pPr>
+      <w:r>
+        <w:rPr>
+          <w:rStyle w:val="HTMLCode"/>
+        </w:rPr>
+        <w:t xml:space="preserve">    </w:t>
+      </w:r>
+      <w:proofErr w:type="gramStart"/>
+      <w:r>
+        <w:rPr>
+          <w:rStyle w:val="HTMLCode"/>
+        </w:rPr>
+        <w:t>border:</w:t>
+      </w:r>
+      <w:proofErr w:type="gramEnd"/>
+      <w:r>
+        <w:rPr>
+          <w:rStyle w:val="y"/>
+        </w:rPr>
+        <w:t>5</w:t>
+      </w:r>
+      <w:r>
+        <w:rPr>
+          <w:rStyle w:val="v"/>
+        </w:rPr>
+        <w:t>px</w:t>
+      </w:r>
+      <w:r>
+        <w:rPr>
+          <w:rStyle w:val="HTMLCode"/>
+        </w:rPr>
+        <w:t xml:space="preserve"> </w:t>
+      </w:r>
+      <w:r>
+        <w:rPr>
+          <w:rStyle w:val="y"/>
+        </w:rPr>
+        <w:t>solid</w:t>
+      </w:r>
+      <w:r>
+        <w:rPr>
+          <w:rStyle w:val="HTMLCode"/>
+        </w:rPr>
+        <w:t xml:space="preserve"> </w:t>
+      </w:r>
+      <w:r>
+        <w:rPr>
+          <w:rStyle w:val="y"/>
+        </w:rPr>
+        <w:t>red</w:t>
+      </w:r>
+      <w:r>
+        <w:rPr>
+          <w:rStyle w:val="HTMLCode"/>
+        </w:rPr>
+        <w:t>;</w:t>
+      </w:r>
+    </w:p>
+    <w:p>
+      <w:pPr>
+        <w:pStyle w:val="HTMLPreformatted"/>
+        <w:rPr>
+          <w:rStyle w:val="HTMLCode"/>
+        </w:rPr>
+      </w:pPr>
+      <w:r>
+        <w:rPr>
+          <w:rStyle w:val="HTMLCode"/>
+        </w:rPr>
+        <w:lastRenderedPageBreak/>
+        <w:t>}</w:t>
+      </w:r>
+    </w:p>
+    <w:p>
+      <w:pPr>
+        <w:pStyle w:val="HTMLPreformatted"/>
+        <w:rPr>
+          <w:rStyle w:val="HTMLCode"/>
+        </w:rPr>
+      </w:pPr>
+    </w:p>
+    <w:p>
+      <w:pPr>
+        <w:pStyle w:val="HTMLPreformatted"/>
+        <w:rPr>
+          <w:rStyle w:val="HTMLCode"/>
+        </w:rPr>
+      </w:pPr>
+      <w:r>
+        <w:rPr>
+          <w:rStyle w:val="HTMLCode"/>
+        </w:rPr>
+        <w:t>.</w:t>
+      </w:r>
+      <w:proofErr w:type="gramStart"/>
+      <w:r>
+        <w:rPr>
+          <w:rStyle w:val="10"/>
+        </w:rPr>
+        <w:t>box2</w:t>
+      </w:r>
+      <w:r>
+        <w:rPr>
+          <w:rStyle w:val="HTMLCode"/>
+        </w:rPr>
+        <w:t>{</w:t>
+      </w:r>
+      <w:proofErr w:type="gramEnd"/>
+    </w:p>
+    <w:p>
+      <w:pPr>
+        <w:pStyle w:val="HTMLPreformatted"/>
+        <w:rPr>
+          <w:rStyle w:val="HTMLCode"/>
+        </w:rPr>
+      </w:pPr>
+      <w:r>
+        <w:rPr>
+          <w:rStyle w:val="HTMLCode"/>
+        </w:rPr>
+        <w:t xml:space="preserve">    </w:t>
+      </w:r>
+      <w:proofErr w:type="gramStart"/>
+      <w:r>
+        <w:rPr>
+          <w:rStyle w:val="HTMLCode"/>
+        </w:rPr>
+        <w:t>border:</w:t>
+      </w:r>
+      <w:proofErr w:type="gramEnd"/>
+      <w:r>
+        <w:rPr>
+          <w:rStyle w:val="y"/>
+        </w:rPr>
+        <w:t>5</w:t>
+      </w:r>
+      <w:r>
+        <w:rPr>
+          <w:rStyle w:val="v"/>
+        </w:rPr>
+        <w:t>px</w:t>
+      </w:r>
+      <w:r>
+        <w:rPr>
+          <w:rStyle w:val="HTMLCode"/>
+        </w:rPr>
+        <w:t xml:space="preserve"> </w:t>
+      </w:r>
+      <w:r>
+        <w:rPr>
+          <w:rStyle w:val="y"/>
+        </w:rPr>
+        <w:t>solid</w:t>
+      </w:r>
+      <w:r>
+        <w:rPr>
+          <w:rStyle w:val="HTMLCode"/>
+        </w:rPr>
+        <w:t xml:space="preserve"> </w:t>
+      </w:r>
+      <w:r>
+        <w:rPr>
+          <w:rStyle w:val="y"/>
+        </w:rPr>
+        <w:t>green</w:t>
+      </w:r>
+      <w:r>
+        <w:rPr>
+          <w:rStyle w:val="HTMLCode"/>
+        </w:rPr>
+        <w:t>;</w:t>
+      </w:r>
+    </w:p>
+    <w:p>
+      <w:pPr>
+        <w:pStyle w:val="HTMLPreformatted"/>
+        <w:rPr>
+          <w:rStyle w:val="HTMLCode"/>
+        </w:rPr>
+      </w:pPr>
+      <w:r>
+        <w:rPr>
+          <w:rStyle w:val="HTMLCode"/>
+        </w:rPr>
+        <w:t>}</w:t>
+      </w:r>
+    </w:p>
+    <w:p>
+      <w:pPr>
+        <w:pStyle w:val="HTMLPreformatted"/>
+        <w:rPr>
+          <w:rStyle w:val="HTMLCode"/>
+        </w:rPr>
+      </w:pPr>
+    </w:p>
+    <w:p>
+      <w:pPr>
+        <w:pStyle w:val="HTMLPreformatted"/>
+        <w:rPr>
+          <w:rStyle w:val="HTMLCode"/>
+        </w:rPr>
+      </w:pPr>
+      <w:r>
+        <w:rPr>
+          <w:rStyle w:val="HTMLCode"/>
+        </w:rPr>
+        <w:t>.</w:t>
+      </w:r>
+      <w:proofErr w:type="gramStart"/>
+      <w:r>
+        <w:rPr>
+          <w:rStyle w:val="10"/>
+        </w:rPr>
+        <w:t>box3</w:t>
+      </w:r>
+      <w:r>
+        <w:rPr>
+          <w:rStyle w:val="HTMLCode"/>
+        </w:rPr>
+        <w:t>{</w:t>
+      </w:r>
+      <w:proofErr w:type="gramEnd"/>
+    </w:p>
+    <w:p>
+      <w:pPr>
+        <w:pStyle w:val="HTMLPreformatted"/>
+        <w:rPr>
+          <w:rStyle w:val="HTMLCode"/>
+        </w:rPr>
+      </w:pPr>
+      <w:r>
+        <w:rPr>
+          <w:rStyle w:val="HTMLCode"/>
+        </w:rPr>
+        <w:t xml:space="preserve">    </w:t>
+      </w:r>
+      <w:proofErr w:type="gramStart"/>
+      <w:r>
+        <w:rPr>
+          <w:rStyle w:val="HTMLCode"/>
+        </w:rPr>
+        <w:t>border:</w:t>
+      </w:r>
+      <w:proofErr w:type="gramEnd"/>
+      <w:r>
+        <w:rPr>
+          <w:rStyle w:val="y"/>
+        </w:rPr>
+        <w:t>5</w:t>
+      </w:r>
+      <w:r>
+        <w:rPr>
+          <w:rStyle w:val="v"/>
+        </w:rPr>
+        <w:t>px</w:t>
+      </w:r>
+      <w:r>
+        <w:rPr>
+          <w:rStyle w:val="HTMLCode"/>
+        </w:rPr>
+        <w:t xml:space="preserve"> </w:t>
+      </w:r>
+      <w:r>
+        <w:rPr>
+          <w:rStyle w:val="y"/>
+        </w:rPr>
+        <w:t>solid</w:t>
+      </w:r>
+      <w:r>
+        <w:rPr>
+          <w:rStyle w:val="HTMLCode"/>
+        </w:rPr>
+        <w:t xml:space="preserve"> </w:t>
+      </w:r>
+      <w:r>
+        <w:rPr>
+          <w:rStyle w:val="y"/>
+        </w:rPr>
+        <w:t>blue</w:t>
+      </w:r>
+      <w:r>
+        <w:rPr>
+          <w:rStyle w:val="HTMLCode"/>
+        </w:rPr>
+        <w:t>;</w:t>
+      </w:r>
+    </w:p>
+    <w:p>
+      <w:pPr>
+        <w:pStyle w:val="HTMLPreformatted"/>
+        <w:rPr>
+          <w:rStyle w:val="HTMLCode"/>
+        </w:rPr>
+      </w:pPr>
+      <w:r>
+        <w:rPr>
+          <w:rStyle w:val="HTMLCode"/>
+        </w:rPr>
+        <w:t>}</w:t>
+      </w:r>
+    </w:p>
+    <w:p>
+      <w:pPr>
+        <w:pStyle w:val="HTMLPreformatted"/>
+        <w:rPr>
+          <w:rStyle w:val="HTMLCode"/>
+        </w:rPr>
+      </w:pPr>
+    </w:p>
+    <w:p>
+      <w:pPr>
+        <w:pStyle w:val="HTMLPreformatted"/>
+        <w:rPr>
+          <w:rStyle w:val="HTMLCode"/>
+        </w:rPr>
+      </w:pPr>
+      <w:r>
+        <w:rPr>
+          <w:rStyle w:val="13"/>
+        </w:rPr>
+        <w:t>&lt;/style&gt;</w:t>
+      </w:r>
+    </w:p>
+    <w:p>
+      <w:pPr>
+        <w:pStyle w:val="HTMLPreformatted"/>
+        <w:rPr>
+          <w:rStyle w:val="HTMLCode"/>
+        </w:rPr>
+      </w:pPr>
+      <w:r>
+        <w:rPr>
+          <w:rStyle w:val="13"/>
+        </w:rPr>
+        <w:t>&lt;/head&gt;</w:t>
+      </w:r>
+    </w:p>
+    <w:p>
+      <w:pPr>
+        <w:pStyle w:val="HTMLPreformatted"/>
+        <w:rPr>
+          <w:rStyle w:val="HTMLCode"/>
+        </w:rPr>
+      </w:pPr>
+    </w:p>
+    <w:p>
+      <w:pPr>
+        <w:pStyle w:val="HTMLPreformatted"/>
+        <w:rPr>
+          <w:rStyle w:val="HTMLCode"/>
+        </w:rPr>
+      </w:pPr>
+      <w:r>
+        <w:rPr>
+          <w:rStyle w:val="13"/>
+        </w:rPr>
+        <w:t>&lt;</w:t>
+      </w:r>
+      <w:proofErr w:type="gramStart"/>
+      <w:r>
+        <w:rPr>
+          <w:rStyle w:val="13"/>
+        </w:rPr>
+        <w:t>body</w:t>
+      </w:r>
+      <w:proofErr w:type="gramEnd"/>
+      <w:r>
+        <w:rPr>
+          <w:rStyle w:val="13"/>
+        </w:rPr>
+        <w:t>&gt;</w:t>
+      </w:r>
+    </w:p>
+    <w:p>
+      <w:pPr>
+        <w:pStyle w:val="HTMLPreformatted"/>
+        <w:rPr>
+          <w:rStyle w:val="HTMLCode"/>
+        </w:rPr>
+      </w:pPr>
+    </w:p>
+    <w:p>
+      <w:pPr>
+        <w:pStyle w:val="HTMLPreformatted"/>
+        <w:rPr>
+          <w:rStyle w:val="HTMLCode"/>
+        </w:rPr>
+      </w:pPr>
+      <w:r>
+        <w:rPr>
+          <w:rStyle w:val="13"/>
+        </w:rPr>
+        <w:t>&lt;div</w:t>
+      </w:r>
+      <w:r>
+        <w:rPr>
+          <w:rStyle w:val="HTMLCode"/>
+        </w:rPr>
+        <w:t xml:space="preserve"> </w:t>
+      </w:r>
+      <w:r>
+        <w:rPr>
+          <w:rStyle w:val="12"/>
+        </w:rPr>
+        <w:t>class</w:t>
+      </w:r>
+      <w:r>
+        <w:rPr>
+          <w:rStyle w:val="v"/>
+        </w:rPr>
+        <w:t>=</w:t>
+      </w:r>
+      <w:r>
+        <w:rPr>
+          <w:rStyle w:val="z"/>
+        </w:rPr>
+        <w:t>"box box1"</w:t>
+      </w:r>
+      <w:r>
+        <w:rPr>
+          <w:rStyle w:val="13"/>
+        </w:rPr>
+        <w:t>&gt;</w:t>
+      </w:r>
+      <w:r>
+        <w:rPr>
+          <w:rStyle w:val="HTMLCode"/>
+        </w:rPr>
+        <w:t>Box 1</w:t>
+      </w:r>
+      <w:r>
+        <w:rPr>
+          <w:rStyle w:val="13"/>
+        </w:rPr>
+        <w:t>&lt;/div&gt;</w:t>
+      </w:r>
+    </w:p>
+    <w:p>
+      <w:pPr>
+        <w:pStyle w:val="HTMLPreformatted"/>
+        <w:rPr>
+          <w:rStyle w:val="HTMLCode"/>
+        </w:rPr>
+      </w:pPr>
+    </w:p>
+    <w:p>
+      <w:pPr>
+        <w:pStyle w:val="HTMLPreformatted"/>
+        <w:rPr>
+          <w:rStyle w:val="HTMLCode"/>
+        </w:rPr>
+      </w:pPr>
+      <w:r>
+        <w:rPr>
+          <w:rStyle w:val="13"/>
+        </w:rPr>
+        <w:t>&lt;div</w:t>
+      </w:r>
+      <w:r>
+        <w:rPr>
+          <w:rStyle w:val="HTMLCode"/>
+        </w:rPr>
+        <w:t xml:space="preserve"> </w:t>
+      </w:r>
+      <w:r>
+        <w:rPr>
+          <w:rStyle w:val="12"/>
+        </w:rPr>
+        <w:t>class</w:t>
+      </w:r>
+      <w:r>
+        <w:rPr>
+          <w:rStyle w:val="v"/>
+        </w:rPr>
+        <w:t>=</w:t>
+      </w:r>
+      <w:r>
+        <w:rPr>
+          <w:rStyle w:val="z"/>
+        </w:rPr>
+        <w:t>"box box2"</w:t>
+      </w:r>
+      <w:r>
+        <w:rPr>
+          <w:rStyle w:val="13"/>
+        </w:rPr>
+        <w:t>&gt;</w:t>
+      </w:r>
+      <w:r>
+        <w:rPr>
+          <w:rStyle w:val="HTMLCode"/>
+        </w:rPr>
+        <w:t>Box 2</w:t>
+      </w:r>
+      <w:r>
+        <w:rPr>
+          <w:rStyle w:val="13"/>
+        </w:rPr>
+        <w:t>&lt;/div&gt;</w:t>
+      </w:r>
+    </w:p>
+    <w:p>
+      <w:pPr>
+        <w:pStyle w:val="HTMLPreformatted"/>
+        <w:rPr>
+          <w:rStyle w:val="HTMLCode"/>
+        </w:rPr>
+      </w:pPr>
+    </w:p>
+    <w:p>
+      <w:pPr>
+        <w:pStyle w:val="HTMLPreformatted"/>
+        <w:rPr>
+          <w:rStyle w:val="HTMLCode"/>
+        </w:rPr>
+      </w:pPr>
+      <w:r>
+        <w:rPr>
+          <w:rStyle w:val="13"/>
+        </w:rPr>
+        <w:t>&lt;div</w:t>
+      </w:r>
+      <w:r>
+        <w:rPr>
+          <w:rStyle w:val="HTMLCode"/>
+        </w:rPr>
+        <w:t xml:space="preserve"> </w:t>
+      </w:r>
+      <w:r>
+        <w:rPr>
+          <w:rStyle w:val="12"/>
+        </w:rPr>
+        <w:t>class</w:t>
+      </w:r>
+      <w:r>
+        <w:rPr>
+          <w:rStyle w:val="v"/>
+        </w:rPr>
+        <w:t>=</w:t>
+      </w:r>
+      <w:r>
+        <w:rPr>
+          <w:rStyle w:val="z"/>
+        </w:rPr>
+        <w:t>"box box3"</w:t>
+      </w:r>
+      <w:r>
+        <w:rPr>
+          <w:rStyle w:val="13"/>
+        </w:rPr>
+        <w:t>&gt;</w:t>
+      </w:r>
+      <w:r>
+        <w:rPr>
+          <w:rStyle w:val="HTMLCode"/>
+        </w:rPr>
+        <w:t>Box 3</w:t>
+      </w:r>
+      <w:r>
+        <w:rPr>
+          <w:rStyle w:val="13"/>
+        </w:rPr>
+        <w:t>&lt;/div&gt;</w:t>
+      </w:r>
+    </w:p>
+    <w:p>
+      <w:pPr>
+        <w:pStyle w:val="HTMLPreformatted"/>
+        <w:rPr>
+          <w:rStyle w:val="HTMLCode"/>
+        </w:rPr>
+      </w:pPr>
+    </w:p>
+    <w:p>
+      <w:pPr>
+        <w:pStyle w:val="HTMLPreformatted"/>
+        <w:rPr>
+          <w:rStyle w:val="HTMLCode"/>
+        </w:rPr>
+      </w:pPr>
+      <w:r>
+        <w:rPr>
+          <w:rStyle w:val="13"/>
+        </w:rPr>
+        <w:t>&lt;/body&gt;</w:t>
+      </w:r>
+    </w:p>
+    <w:p>
+      <w:pPr>
+        <w:pStyle w:val="HTMLPreformatted"/>
+      </w:pPr>
+      <w:r>
+        <w:rPr>
+          <w:rStyle w:val="13"/>
+        </w:rPr>
+        <w:t>&lt;/html&gt;</w:t>
+      </w:r>
+    </w:p>
+    <w:p>
+      <w:r>
+        <w:pict>
+          <v:rect id="_x0000_i1047" style="width:0;height:1.5pt" o:hralign="center" o:hrstd="t" o:hr="t" fillcolor="#a0a0a0" stroked="f"/>
+        </w:pict>
+      </w:r>
+    </w:p>
+    <w:p>
+      <w:pPr>
+        <w:pStyle w:val="Heading3"/>
+      </w:pPr>
+      <w:r>
+        <w:t>Output</w:t>
+      </w:r>
+    </w:p>
+    <w:p>
+      <w:pPr>
+        <w:pStyle w:val="HTMLPreformatted"/>
+        <w:rPr>
+          <w:rStyle w:val="HTMLCode"/>
+        </w:rPr>
+      </w:pPr>
+      <w:r>
+        <w:rPr>
+          <w:rStyle w:val="HTMLCode"/>
+        </w:rPr>
+        <w:t>+-------------+</w:t>
+      </w:r>
+    </w:p>
+    <w:p>
+      <w:pPr>
+        <w:pStyle w:val="HTMLPreformatted"/>
+        <w:rPr>
+          <w:rStyle w:val="HTMLCode"/>
+        </w:rPr>
+      </w:pPr>
+      <w:r>
+        <w:rPr>
+          <w:rStyle w:val="HTMLCode"/>
+        </w:rPr>
+        <w:t>|   Box 1     |</w:t>
+      </w:r>
+    </w:p>
+    <w:p>
+      <w:pPr>
+        <w:pStyle w:val="HTMLPreformatted"/>
+        <w:rPr>
+          <w:rStyle w:val="HTMLCode"/>
+        </w:rPr>
+      </w:pPr>
+      <w:r>
+        <w:rPr>
+          <w:rStyle w:val="HTMLCode"/>
+        </w:rPr>
+        <w:t>+-------------+   (Red Border)</w:t>
+      </w:r>
+    </w:p>
+    <w:p>
+      <w:pPr>
+        <w:pStyle w:val="HTMLPreformatted"/>
+        <w:rPr>
+          <w:rStyle w:val="HTMLCode"/>
+        </w:rPr>
+      </w:pPr>
+    </w:p>
+    <w:p>
+      <w:pPr>
+        <w:pStyle w:val="HTMLPreformatted"/>
+        <w:rPr>
+          <w:rStyle w:val="HTMLCode"/>
+        </w:rPr>
+      </w:pPr>
+      <w:r>
+        <w:rPr>
+          <w:rStyle w:val="HTMLCode"/>
+        </w:rPr>
+        <w:t>+-------------+</w:t>
+      </w:r>
+    </w:p>
+    <w:p>
+      <w:pPr>
+        <w:pStyle w:val="HTMLPreformatted"/>
+        <w:rPr>
+          <w:rStyle w:val="HTMLCode"/>
+        </w:rPr>
+      </w:pPr>
+      <w:r>
+        <w:rPr>
+          <w:rStyle w:val="HTMLCode"/>
+        </w:rPr>
+        <w:t>|   Box 2     |</w:t>
+      </w:r>
+    </w:p>
+    <w:p>
+      <w:pPr>
+        <w:pStyle w:val="HTMLPreformatted"/>
+        <w:rPr>
+          <w:rStyle w:val="HTMLCode"/>
+        </w:rPr>
+      </w:pPr>
+      <w:r>
+        <w:rPr>
+          <w:rStyle w:val="HTMLCode"/>
+        </w:rPr>
+        <w:t>+-------------+   (Green Border)</w:t>
+      </w:r>
+    </w:p>
+    <w:p>
+      <w:pPr>
+        <w:pStyle w:val="HTMLPreformatted"/>
+        <w:rPr>
+          <w:rStyle w:val="HTMLCode"/>
+        </w:rPr>
+      </w:pPr>
+    </w:p>
+    <w:p>
+      <w:pPr>
+        <w:pStyle w:val="HTMLPreformatted"/>
+        <w:rPr>
+          <w:rStyle w:val="HTMLCode"/>
+        </w:rPr>
+      </w:pPr>
+      <w:r>
+        <w:rPr>
+          <w:rStyle w:val="HTMLCode"/>
+        </w:rPr>
+        <w:t>+-------------+</w:t>
+      </w:r>
+    </w:p>
+    <w:p>
+      <w:pPr>
+        <w:pStyle w:val="HTMLPreformatted"/>
+        <w:rPr>
+          <w:rStyle w:val="HTMLCode"/>
+        </w:rPr>
+      </w:pPr>
+      <w:r>
+        <w:rPr>
+          <w:rStyle w:val="HTMLCode"/>
+        </w:rPr>
+        <w:t>|   Box 3     |</w:t>
+      </w:r>
+    </w:p>
+    <w:p>
+      <w:pPr>
+        <w:pStyle w:val="HTMLPreformatted"/>
+      </w:pPr>
+      <w:r>
+        <w:rPr>
+          <w:rStyle w:val="HTMLCode"/>
+        </w:rPr>
+        <w:t>+-------------+   (Blue Border)</w:t>
+      </w:r>
+    </w:p>
+    <w:p/>
+    <w:p>
+      <w:pPr>
+        <w:pBdr>
+          <w:bottom w:val="single" w:sz="6" w:space="1" w:color="auto"/>
+        </w:pBdr>
+      </w:pPr>
+    </w:p>
+    <w:p/>
+    <w:p>
+      <w:r>
+        <w:rPr>
+          <w:noProof/>
+          <w:lang w:eastAsia="en-IN"/>
+        </w:rPr>
         <w:drawing>
           <wp:inline distT="0" distB="0" distL="0" distR="0" wp14:anchorId="723150C5" wp14:editId="4DBD18E4">
             <wp:extent cx="5731510" cy="1023620"/>
@@ -17926,9 +22179,19 @@
       </w:r>
     </w:p>
     <w:p/>
+    <w:p>
+      <w:bookmarkStart w:id="0" w:name="_GoBack"/>
+      <w:bookmarkEnd w:id="0"/>
+    </w:p>
     <w:p/>
-    <w:p>
-      <w:r>
+    <w:p/>
+    <w:p/>
+    <w:p>
+      <w:r>
+        <w:rPr>
+          <w:noProof/>
+          <w:lang w:eastAsia="en-IN"/>
+        </w:rPr>
         <w:lastRenderedPageBreak/>
         <w:drawing>
           <wp:inline distT="0" distB="0" distL="0" distR="0" wp14:anchorId="42EE4425" wp14:editId="56ECB5F3">
@@ -17967,10 +22230,7 @@
         </w:drawing>
       </w:r>
     </w:p>
-    <w:p>
-      <w:bookmarkStart w:id="0" w:name="_GoBack"/>
-      <w:bookmarkEnd w:id="0"/>
-    </w:p>
+    <w:p/>
     <w:sectPr>
       <w:pgSz w:w="11906" w:h="16838"/>
       <w:pgMar w:top="1440" w:right="1440" w:bottom="1440" w:left="1440" w:header="708" w:footer="708" w:gutter="0"/>
@@ -18246,9 +22506,9 @@
     </w:lvl>
   </w:abstractNum>
   <w:abstractNum w:abstractNumId="2">
-    <w:nsid w:val="0F7D5981"/>
+    <w:nsid w:val="0A55215B"/>
     <w:multiLevelType w:val="multilevel"/>
-    <w:tmpl w:val="FF949AA2"/>
+    <w:tmpl w:val="95F8F850"/>
     <w:lvl w:ilvl="0">
       <w:start w:val="1"/>
       <w:numFmt w:val="bullet"/>
@@ -18395,9 +22655,9 @@
     </w:lvl>
   </w:abstractNum>
   <w:abstractNum w:abstractNumId="3">
-    <w:nsid w:val="185236AD"/>
+    <w:nsid w:val="0F7D5981"/>
     <w:multiLevelType w:val="multilevel"/>
-    <w:tmpl w:val="77CE9432"/>
+    <w:tmpl w:val="FF949AA2"/>
     <w:lvl w:ilvl="0">
       <w:start w:val="1"/>
       <w:numFmt w:val="bullet"/>
@@ -18544,9 +22804,9 @@
     </w:lvl>
   </w:abstractNum>
   <w:abstractNum w:abstractNumId="4">
-    <w:nsid w:val="28BE445E"/>
+    <w:nsid w:val="185236AD"/>
     <w:multiLevelType w:val="multilevel"/>
-    <w:tmpl w:val="037CF07C"/>
+    <w:tmpl w:val="77CE9432"/>
     <w:lvl w:ilvl="0">
       <w:start w:val="1"/>
       <w:numFmt w:val="bullet"/>
@@ -18693,9 +22953,9 @@
     </w:lvl>
   </w:abstractNum>
   <w:abstractNum w:abstractNumId="5">
-    <w:nsid w:val="28F02B0D"/>
+    <w:nsid w:val="28BE445E"/>
     <w:multiLevelType w:val="multilevel"/>
-    <w:tmpl w:val="8C88D5DA"/>
+    <w:tmpl w:val="037CF07C"/>
     <w:lvl w:ilvl="0">
       <w:start w:val="1"/>
       <w:numFmt w:val="bullet"/>
@@ -18842,9 +23102,9 @@
     </w:lvl>
   </w:abstractNum>
   <w:abstractNum w:abstractNumId="6">
-    <w:nsid w:val="2EC85FD8"/>
+    <w:nsid w:val="28F02B0D"/>
     <w:multiLevelType w:val="multilevel"/>
-    <w:tmpl w:val="7E366C10"/>
+    <w:tmpl w:val="8C88D5DA"/>
     <w:lvl w:ilvl="0">
       <w:start w:val="1"/>
       <w:numFmt w:val="bullet"/>
@@ -18991,9 +23251,9 @@
     </w:lvl>
   </w:abstractNum>
   <w:abstractNum w:abstractNumId="7">
-    <w:nsid w:val="2EFB1E6B"/>
+    <w:nsid w:val="2EC85FD8"/>
     <w:multiLevelType w:val="multilevel"/>
-    <w:tmpl w:val="3F6A2A0E"/>
+    <w:tmpl w:val="7E366C10"/>
     <w:lvl w:ilvl="0">
       <w:start w:val="1"/>
       <w:numFmt w:val="bullet"/>
@@ -19140,9 +23400,9 @@
     </w:lvl>
   </w:abstractNum>
   <w:abstractNum w:abstractNumId="8">
-    <w:nsid w:val="39B347C2"/>
+    <w:nsid w:val="2EFB1E6B"/>
     <w:multiLevelType w:val="multilevel"/>
-    <w:tmpl w:val="5D0E453E"/>
+    <w:tmpl w:val="3F6A2A0E"/>
     <w:lvl w:ilvl="0">
       <w:start w:val="1"/>
       <w:numFmt w:val="bullet"/>
@@ -19289,9 +23549,9 @@
     </w:lvl>
   </w:abstractNum>
   <w:abstractNum w:abstractNumId="9">
-    <w:nsid w:val="509E7A46"/>
+    <w:nsid w:val="39B347C2"/>
     <w:multiLevelType w:val="multilevel"/>
-    <w:tmpl w:val="5CD486CC"/>
+    <w:tmpl w:val="5D0E453E"/>
     <w:lvl w:ilvl="0">
       <w:start w:val="1"/>
       <w:numFmt w:val="bullet"/>
@@ -19438,9 +23698,9 @@
     </w:lvl>
   </w:abstractNum>
   <w:abstractNum w:abstractNumId="10">
-    <w:nsid w:val="53C73977"/>
+    <w:nsid w:val="509E7A46"/>
     <w:multiLevelType w:val="multilevel"/>
-    <w:tmpl w:val="9822DB8C"/>
+    <w:tmpl w:val="5CD486CC"/>
     <w:lvl w:ilvl="0">
       <w:start w:val="1"/>
       <w:numFmt w:val="bullet"/>
@@ -19587,9 +23847,9 @@
     </w:lvl>
   </w:abstractNum>
   <w:abstractNum w:abstractNumId="11">
-    <w:nsid w:val="66593128"/>
+    <w:nsid w:val="53C73977"/>
     <w:multiLevelType w:val="multilevel"/>
-    <w:tmpl w:val="F5321B4C"/>
+    <w:tmpl w:val="9822DB8C"/>
     <w:lvl w:ilvl="0">
       <w:start w:val="1"/>
       <w:numFmt w:val="bullet"/>
@@ -19736,9 +23996,9 @@
     </w:lvl>
   </w:abstractNum>
   <w:abstractNum w:abstractNumId="12">
-    <w:nsid w:val="6CBA7C6E"/>
+    <w:nsid w:val="66593128"/>
     <w:multiLevelType w:val="multilevel"/>
-    <w:tmpl w:val="93EA0C00"/>
+    <w:tmpl w:val="F5321B4C"/>
     <w:lvl w:ilvl="0">
       <w:start w:val="1"/>
       <w:numFmt w:val="bullet"/>
@@ -19885,6 +24145,155 @@
     </w:lvl>
   </w:abstractNum>
   <w:abstractNum w:abstractNumId="13">
+    <w:nsid w:val="6CBA7C6E"/>
+    <w:multiLevelType w:val="multilevel"/>
+    <w:tmpl w:val="93EA0C00"/>
+    <w:lvl w:ilvl="0">
+      <w:start w:val="1"/>
+      <w:numFmt w:val="bullet"/>
+      <w:lvlText w:val=""/>
+      <w:lvlJc w:val="left"/>
+      <w:pPr>
+        <w:tabs>
+          <w:tab w:val="num" w:pos="720"/>
+        </w:tabs>
+        <w:ind w:left="720" w:hanging="360"/>
+      </w:pPr>
+      <w:rPr>
+        <w:rFonts w:ascii="Symbol" w:hAnsi="Symbol" w:hint="default"/>
+        <w:sz w:val="20"/>
+      </w:rPr>
+    </w:lvl>
+    <w:lvl w:ilvl="1" w:tentative="1">
+      <w:start w:val="1"/>
+      <w:numFmt w:val="bullet"/>
+      <w:lvlText w:val="o"/>
+      <w:lvlJc w:val="left"/>
+      <w:pPr>
+        <w:tabs>
+          <w:tab w:val="num" w:pos="1440"/>
+        </w:tabs>
+        <w:ind w:left="1440" w:hanging="360"/>
+      </w:pPr>
+      <w:rPr>
+        <w:rFonts w:ascii="Courier New" w:hAnsi="Courier New" w:hint="default"/>
+        <w:sz w:val="20"/>
+      </w:rPr>
+    </w:lvl>
+    <w:lvl w:ilvl="2" w:tentative="1">
+      <w:start w:val="1"/>
+      <w:numFmt w:val="bullet"/>
+      <w:lvlText w:val=""/>
+      <w:lvlJc w:val="left"/>
+      <w:pPr>
+        <w:tabs>
+          <w:tab w:val="num" w:pos="2160"/>
+        </w:tabs>
+        <w:ind w:left="2160" w:hanging="360"/>
+      </w:pPr>
+      <w:rPr>
+        <w:rFonts w:ascii="Wingdings" w:hAnsi="Wingdings" w:hint="default"/>
+        <w:sz w:val="20"/>
+      </w:rPr>
+    </w:lvl>
+    <w:lvl w:ilvl="3" w:tentative="1">
+      <w:start w:val="1"/>
+      <w:numFmt w:val="bullet"/>
+      <w:lvlText w:val=""/>
+      <w:lvlJc w:val="left"/>
+      <w:pPr>
+        <w:tabs>
+          <w:tab w:val="num" w:pos="2880"/>
+        </w:tabs>
+        <w:ind w:left="2880" w:hanging="360"/>
+      </w:pPr>
+      <w:rPr>
+        <w:rFonts w:ascii="Wingdings" w:hAnsi="Wingdings" w:hint="default"/>
+        <w:sz w:val="20"/>
+      </w:rPr>
+    </w:lvl>
+    <w:lvl w:ilvl="4" w:tentative="1">
+      <w:start w:val="1"/>
+      <w:numFmt w:val="bullet"/>
+      <w:lvlText w:val=""/>
+      <w:lvlJc w:val="left"/>
+      <w:pPr>
+        <w:tabs>
+          <w:tab w:val="num" w:pos="3600"/>
+        </w:tabs>
+        <w:ind w:left="3600" w:hanging="360"/>
+      </w:pPr>
+      <w:rPr>
+        <w:rFonts w:ascii="Wingdings" w:hAnsi="Wingdings" w:hint="default"/>
+        <w:sz w:val="20"/>
+      </w:rPr>
+    </w:lvl>
+    <w:lvl w:ilvl="5" w:tentative="1">
+      <w:start w:val="1"/>
+      <w:numFmt w:val="bullet"/>
+      <w:lvlText w:val=""/>
+      <w:lvlJc w:val="left"/>
+      <w:pPr>
+        <w:tabs>
+          <w:tab w:val="num" w:pos="4320"/>
+        </w:tabs>
+        <w:ind w:left="4320" w:hanging="360"/>
+      </w:pPr>
+      <w:rPr>
+        <w:rFonts w:ascii="Wingdings" w:hAnsi="Wingdings" w:hint="default"/>
+        <w:sz w:val="20"/>
+      </w:rPr>
+    </w:lvl>
+    <w:lvl w:ilvl="6" w:tentative="1">
+      <w:start w:val="1"/>
+      <w:numFmt w:val="bullet"/>
+      <w:lvlText w:val=""/>
+      <w:lvlJc w:val="left"/>
+      <w:pPr>
+        <w:tabs>
+          <w:tab w:val="num" w:pos="5040"/>
+        </w:tabs>
+        <w:ind w:left="5040" w:hanging="360"/>
+      </w:pPr>
+      <w:rPr>
+        <w:rFonts w:ascii="Wingdings" w:hAnsi="Wingdings" w:hint="default"/>
+        <w:sz w:val="20"/>
+      </w:rPr>
+    </w:lvl>
+    <w:lvl w:ilvl="7" w:tentative="1">
+      <w:start w:val="1"/>
+      <w:numFmt w:val="bullet"/>
+      <w:lvlText w:val=""/>
+      <w:lvlJc w:val="left"/>
+      <w:pPr>
+        <w:tabs>
+          <w:tab w:val="num" w:pos="5760"/>
+        </w:tabs>
+        <w:ind w:left="5760" w:hanging="360"/>
+      </w:pPr>
+      <w:rPr>
+        <w:rFonts w:ascii="Wingdings" w:hAnsi="Wingdings" w:hint="default"/>
+        <w:sz w:val="20"/>
+      </w:rPr>
+    </w:lvl>
+    <w:lvl w:ilvl="8" w:tentative="1">
+      <w:start w:val="1"/>
+      <w:numFmt w:val="bullet"/>
+      <w:lvlText w:val=""/>
+      <w:lvlJc w:val="left"/>
+      <w:pPr>
+        <w:tabs>
+          <w:tab w:val="num" w:pos="6480"/>
+        </w:tabs>
+        <w:ind w:left="6480" w:hanging="360"/>
+      </w:pPr>
+      <w:rPr>
+        <w:rFonts w:ascii="Wingdings" w:hAnsi="Wingdings" w:hint="default"/>
+        <w:sz w:val="20"/>
+      </w:rPr>
+    </w:lvl>
+  </w:abstractNum>
+  <w:abstractNum w:abstractNumId="14">
     <w:nsid w:val="73F84899"/>
     <w:multiLevelType w:val="multilevel"/>
     <w:tmpl w:val="BE1CC636"/>
@@ -19998,46 +24407,49 @@
     </w:lvl>
   </w:abstractNum>
   <w:num w:numId="1">
-    <w:abstractNumId w:val="9"/>
+    <w:abstractNumId w:val="10"/>
   </w:num>
   <w:num w:numId="2">
     <w:abstractNumId w:val="0"/>
   </w:num>
   <w:num w:numId="3">
-    <w:abstractNumId w:val="4"/>
+    <w:abstractNumId w:val="5"/>
   </w:num>
   <w:num w:numId="4">
-    <w:abstractNumId w:val="8"/>
+    <w:abstractNumId w:val="9"/>
   </w:num>
   <w:num w:numId="5">
-    <w:abstractNumId w:val="6"/>
+    <w:abstractNumId w:val="7"/>
   </w:num>
   <w:num w:numId="6">
-    <w:abstractNumId w:val="13"/>
+    <w:abstractNumId w:val="14"/>
   </w:num>
   <w:num w:numId="7">
-    <w:abstractNumId w:val="11"/>
+    <w:abstractNumId w:val="12"/>
   </w:num>
   <w:num w:numId="8">
-    <w:abstractNumId w:val="2"/>
+    <w:abstractNumId w:val="3"/>
   </w:num>
   <w:num w:numId="9">
-    <w:abstractNumId w:val="3"/>
+    <w:abstractNumId w:val="4"/>
   </w:num>
   <w:num w:numId="10">
     <w:abstractNumId w:val="1"/>
   </w:num>
   <w:num w:numId="11">
-    <w:abstractNumId w:val="7"/>
+    <w:abstractNumId w:val="8"/>
   </w:num>
   <w:num w:numId="12">
-    <w:abstractNumId w:val="12"/>
+    <w:abstractNumId w:val="13"/>
   </w:num>
   <w:num w:numId="13">
-    <w:abstractNumId w:val="10"/>
+    <w:abstractNumId w:val="11"/>
   </w:num>
   <w:num w:numId="14">
-    <w:abstractNumId w:val="5"/>
+    <w:abstractNumId w:val="6"/>
+  </w:num>
+  <w:num w:numId="15">
+    <w:abstractNumId w:val="2"/>
   </w:num>
 </w:numbering>
 </file>

</xml_diff>